<commit_message>
Updated Client Tag Functions
</commit_message>
<xml_diff>
--- a/Keep_Docs/Run_Server.docx
+++ b/Keep_Docs/Run_Server.docx
@@ -74,23 +74,7 @@
           <w:rFonts w:ascii="source serif 4" w:eastAsia="source serif 4" w:hAnsi="source serif 4" w:cs="source serif 4"/>
           <w:color w:val="000000"/>
         </w:rPr>
-        <w:t xml:space="preserve">For Windows PowerShell, this is a simple setup flow using Django, PostgreSQL driver, and </w:t>
-      </w:r>
-      <w:proofErr w:type="spellStart"/>
-      <w:r>
-        <w:rPr>
-          <w:rFonts w:ascii="source serif 4" w:eastAsia="source serif 4" w:hAnsi="source serif 4" w:cs="source serif 4"/>
-          <w:color w:val="000000"/>
-        </w:rPr>
-        <w:t>dotenv</w:t>
-      </w:r>
-      <w:proofErr w:type="spellEnd"/>
-      <w:r>
-        <w:rPr>
-          <w:rFonts w:ascii="source serif 4" w:eastAsia="source serif 4" w:hAnsi="source serif 4" w:cs="source serif 4"/>
-          <w:color w:val="000000"/>
-        </w:rPr>
-        <w:t xml:space="preserve"> support. Django’s admin site already gives you the kind of administration screen shown in your second image, and you can extend it with custom model admin classes.</w:t>
+        <w:t>For Windows PowerShell, this is a simple setup flow using Django, PostgreSQL driver, and dotenv support. Django’s admin site already gives you the kind of administration screen shown in your second image, and you can extend it with custom model admin classes.</w:t>
       </w:r>
       <w:bookmarkStart w:id="1" w:name="fnref2_5"/>
       <w:bookmarkEnd w:id="1"/>
@@ -126,178 +110,107 @@
           <w:sz w:val="18"/>
         </w:rPr>
       </w:pPr>
-      <w:proofErr w:type="spellStart"/>
-      <w:r>
-        <w:rPr>
-          <w:rStyle w:val="VerbatimChar"/>
-          <w:rFonts w:ascii="menlo" w:eastAsia="menlo" w:hAnsi="menlo" w:cs="menlo"/>
-          <w:color w:val="000000"/>
-          <w:sz w:val="18"/>
-        </w:rPr>
-        <w:t>mkdir</w:t>
-      </w:r>
-      <w:proofErr w:type="spellEnd"/>
-      <w:r>
-        <w:rPr>
-          <w:rStyle w:val="VerbatimChar"/>
-          <w:rFonts w:ascii="menlo" w:eastAsia="menlo" w:hAnsi="menlo" w:cs="menlo"/>
-          <w:color w:val="000000"/>
-          <w:sz w:val="18"/>
+      <w:r>
+        <w:rPr>
+          <w:rStyle w:val="VerbatimChar"/>
+          <w:rFonts w:ascii="menlo" w:eastAsia="menlo" w:hAnsi="menlo" w:cs="menlo"/>
+          <w:color w:val="000000"/>
+          <w:sz w:val="18"/>
+        </w:rPr>
+        <w:t>mkdir myportal</w:t>
+      </w:r>
+      <w:r>
+        <w:rPr>
+          <w:rStyle w:val="VerbatimChar"/>
+          <w:rFonts w:ascii="menlo" w:eastAsia="menlo" w:hAnsi="menlo" w:cs="menlo"/>
+          <w:color w:val="000000"/>
+          <w:sz w:val="18"/>
+        </w:rPr>
+        <w:br/>
+      </w:r>
+      <w:r>
+        <w:rPr>
+          <w:rStyle w:val="VerbatimChar"/>
+          <w:rFonts w:ascii="menlo" w:eastAsia="menlo" w:hAnsi="menlo" w:cs="menlo"/>
+          <w:color w:val="000000"/>
+          <w:sz w:val="18"/>
+        </w:rPr>
+        <w:br/>
+      </w:r>
+      <w:r>
+        <w:rPr>
+          <w:rStyle w:val="VerbatimChar"/>
+          <w:rFonts w:ascii="menlo" w:eastAsia="menlo" w:hAnsi="menlo" w:cs="menlo"/>
+          <w:color w:val="000000"/>
+          <w:sz w:val="18"/>
+        </w:rPr>
+        <w:t>cd myportal</w:t>
+      </w:r>
+      <w:r>
+        <w:rPr>
+          <w:rStyle w:val="VerbatimChar"/>
+          <w:rFonts w:ascii="menlo" w:eastAsia="menlo" w:hAnsi="menlo" w:cs="menlo"/>
+          <w:color w:val="000000"/>
+          <w:sz w:val="18"/>
+        </w:rPr>
+        <w:br/>
+        <w:t>python -m venv .venv</w:t>
+      </w:r>
+      <w:r>
+        <w:rPr>
+          <w:rStyle w:val="VerbatimChar"/>
+          <w:rFonts w:ascii="menlo" w:eastAsia="menlo" w:hAnsi="menlo" w:cs="menlo"/>
+          <w:color w:val="000000"/>
+          <w:sz w:val="18"/>
+        </w:rPr>
+        <w:br/>
+        <w:t>.venv\Scripts\activate</w:t>
+      </w:r>
+      <w:r>
+        <w:rPr>
+          <w:rStyle w:val="VerbatimChar"/>
+          <w:rFonts w:ascii="menlo" w:eastAsia="menlo" w:hAnsi="menlo" w:cs="menlo"/>
+          <w:color w:val="000000"/>
+          <w:sz w:val="18"/>
+        </w:rPr>
+        <w:br/>
+      </w:r>
+      <w:r>
+        <w:rPr>
+          <w:rStyle w:val="VerbatimChar"/>
+          <w:rFonts w:ascii="menlo" w:eastAsia="menlo" w:hAnsi="menlo" w:cs="menlo"/>
+          <w:color w:val="000000"/>
+          <w:sz w:val="18"/>
+        </w:rPr>
+        <w:br/>
+        <w:t xml:space="preserve">pip install django </w:t>
+      </w:r>
+      <w:r>
+        <w:rPr>
+          <w:rFonts w:ascii="menlo" w:eastAsia="menlo" w:hAnsi="menlo" w:cs="menlo"/>
+          <w:color w:val="000000"/>
+          <w:sz w:val="18"/>
+        </w:rPr>
+        <w:t>psycopg2-binary</w:t>
+      </w:r>
+      <w:r>
+        <w:rPr>
+          <w:rFonts w:ascii="menlo" w:eastAsiaTheme="minorEastAsia" w:hAnsi="menlo" w:cs="menlo" w:hint="eastAsia"/>
+          <w:color w:val="000000"/>
+          <w:sz w:val="18"/>
+          <w:lang w:eastAsia="zh-TW"/>
         </w:rPr>
         <w:t xml:space="preserve"> </w:t>
       </w:r>
-      <w:proofErr w:type="spellStart"/>
-      <w:r>
-        <w:rPr>
-          <w:rStyle w:val="VerbatimChar"/>
-          <w:rFonts w:ascii="menlo" w:eastAsia="menlo" w:hAnsi="menlo" w:cs="menlo"/>
-          <w:color w:val="000000"/>
-          <w:sz w:val="18"/>
-        </w:rPr>
-        <w:t>myportal</w:t>
-      </w:r>
-      <w:proofErr w:type="spellEnd"/>
-      <w:r>
-        <w:rPr>
-          <w:rStyle w:val="VerbatimChar"/>
-          <w:rFonts w:ascii="menlo" w:eastAsia="menlo" w:hAnsi="menlo" w:cs="menlo"/>
-          <w:color w:val="000000"/>
-          <w:sz w:val="18"/>
-        </w:rPr>
-        <w:br/>
-      </w:r>
-      <w:r>
-        <w:rPr>
-          <w:rStyle w:val="VerbatimChar"/>
-          <w:rFonts w:ascii="menlo" w:eastAsia="menlo" w:hAnsi="menlo" w:cs="menlo"/>
-          <w:color w:val="000000"/>
-          <w:sz w:val="18"/>
-        </w:rPr>
-        <w:br/>
-      </w:r>
-      <w:r>
-        <w:rPr>
-          <w:rStyle w:val="VerbatimChar"/>
-          <w:rFonts w:ascii="menlo" w:eastAsia="menlo" w:hAnsi="menlo" w:cs="menlo"/>
-          <w:color w:val="000000"/>
-          <w:sz w:val="18"/>
-        </w:rPr>
-        <w:t xml:space="preserve">cd </w:t>
-      </w:r>
-      <w:proofErr w:type="spellStart"/>
-      <w:r>
-        <w:rPr>
-          <w:rStyle w:val="VerbatimChar"/>
-          <w:rFonts w:ascii="menlo" w:eastAsia="menlo" w:hAnsi="menlo" w:cs="menlo"/>
-          <w:color w:val="000000"/>
-          <w:sz w:val="18"/>
-        </w:rPr>
-        <w:t>myportal</w:t>
-      </w:r>
-      <w:proofErr w:type="spellEnd"/>
-      <w:r>
-        <w:rPr>
-          <w:rStyle w:val="VerbatimChar"/>
-          <w:rFonts w:ascii="menlo" w:eastAsia="menlo" w:hAnsi="menlo" w:cs="menlo"/>
-          <w:color w:val="000000"/>
-          <w:sz w:val="18"/>
-        </w:rPr>
-        <w:br/>
-        <w:t xml:space="preserve">python -m </w:t>
-      </w:r>
-      <w:proofErr w:type="spellStart"/>
-      <w:proofErr w:type="gramStart"/>
-      <w:r>
-        <w:rPr>
-          <w:rStyle w:val="VerbatimChar"/>
-          <w:rFonts w:ascii="menlo" w:eastAsia="menlo" w:hAnsi="menlo" w:cs="menlo"/>
-          <w:color w:val="000000"/>
-          <w:sz w:val="18"/>
-        </w:rPr>
-        <w:t>venv</w:t>
-      </w:r>
-      <w:proofErr w:type="spellEnd"/>
-      <w:r>
-        <w:rPr>
-          <w:rStyle w:val="VerbatimChar"/>
-          <w:rFonts w:ascii="menlo" w:eastAsia="menlo" w:hAnsi="menlo" w:cs="menlo"/>
-          <w:color w:val="000000"/>
-          <w:sz w:val="18"/>
-        </w:rPr>
-        <w:t xml:space="preserve"> .</w:t>
-      </w:r>
-      <w:proofErr w:type="spellStart"/>
-      <w:r>
-        <w:rPr>
-          <w:rStyle w:val="VerbatimChar"/>
-          <w:rFonts w:ascii="menlo" w:eastAsia="menlo" w:hAnsi="menlo" w:cs="menlo"/>
-          <w:color w:val="000000"/>
-          <w:sz w:val="18"/>
-        </w:rPr>
-        <w:t>venv</w:t>
-      </w:r>
-      <w:proofErr w:type="spellEnd"/>
-      <w:proofErr w:type="gramEnd"/>
-      <w:r>
-        <w:rPr>
-          <w:rStyle w:val="VerbatimChar"/>
-          <w:rFonts w:ascii="menlo" w:eastAsia="menlo" w:hAnsi="menlo" w:cs="menlo"/>
-          <w:color w:val="000000"/>
-          <w:sz w:val="18"/>
-        </w:rPr>
-        <w:br/>
-        <w:t>.</w:t>
-      </w:r>
-      <w:proofErr w:type="spellStart"/>
-      <w:r>
-        <w:rPr>
-          <w:rStyle w:val="VerbatimChar"/>
-          <w:rFonts w:ascii="menlo" w:eastAsia="menlo" w:hAnsi="menlo" w:cs="menlo"/>
-          <w:color w:val="000000"/>
-          <w:sz w:val="18"/>
-        </w:rPr>
-        <w:t>venv</w:t>
-      </w:r>
-      <w:proofErr w:type="spellEnd"/>
-      <w:r>
-        <w:rPr>
-          <w:rStyle w:val="VerbatimChar"/>
-          <w:rFonts w:ascii="menlo" w:eastAsia="menlo" w:hAnsi="menlo" w:cs="menlo"/>
-          <w:color w:val="000000"/>
-          <w:sz w:val="18"/>
-        </w:rPr>
-        <w:t>\Scripts\activate</w:t>
-      </w:r>
-      <w:r>
-        <w:rPr>
-          <w:rStyle w:val="VerbatimChar"/>
-          <w:rFonts w:ascii="menlo" w:eastAsia="menlo" w:hAnsi="menlo" w:cs="menlo"/>
-          <w:color w:val="000000"/>
-          <w:sz w:val="18"/>
-        </w:rPr>
-        <w:br/>
-      </w:r>
-      <w:r>
-        <w:rPr>
-          <w:rStyle w:val="VerbatimChar"/>
-          <w:rFonts w:ascii="menlo" w:eastAsia="menlo" w:hAnsi="menlo" w:cs="menlo"/>
-          <w:color w:val="000000"/>
-          <w:sz w:val="18"/>
-        </w:rPr>
-        <w:br/>
-        <w:t xml:space="preserve">pip install </w:t>
-      </w:r>
-      <w:proofErr w:type="spellStart"/>
-      <w:r>
-        <w:rPr>
-          <w:rStyle w:val="VerbatimChar"/>
-          <w:rFonts w:ascii="menlo" w:eastAsia="menlo" w:hAnsi="menlo" w:cs="menlo"/>
-          <w:color w:val="000000"/>
-          <w:sz w:val="18"/>
-        </w:rPr>
-        <w:t>django</w:t>
-      </w:r>
-      <w:proofErr w:type="spellEnd"/>
+      <w:r>
+        <w:rPr>
+          <w:rStyle w:val="VerbatimChar"/>
+          <w:rFonts w:ascii="menlo" w:eastAsia="menlo" w:hAnsi="menlo" w:cs="menlo"/>
+          <w:color w:val="000000"/>
+          <w:sz w:val="18"/>
+        </w:rPr>
+        <w:t>python-dotenv</w:t>
+      </w:r>
       <w:r>
         <w:rPr>
           <w:rStyle w:val="VerbatimChar"/>
@@ -309,49 +222,13 @@
       </w:r>
       <w:r>
         <w:rPr>
-          <w:rFonts w:ascii="menlo" w:eastAsia="menlo" w:hAnsi="menlo" w:cs="menlo"/>
-          <w:color w:val="000000"/>
-          <w:sz w:val="18"/>
-        </w:rPr>
-        <w:t>psycopg2-binary</w:t>
-      </w:r>
-      <w:r>
-        <w:rPr>
+          <w:rStyle w:val="VerbatimChar"/>
           <w:rFonts w:ascii="menlo" w:eastAsiaTheme="minorEastAsia" w:hAnsi="menlo" w:cs="menlo" w:hint="eastAsia"/>
           <w:color w:val="000000"/>
           <w:sz w:val="18"/>
           <w:lang w:eastAsia="zh-TW"/>
         </w:rPr>
-        <w:t xml:space="preserve"> </w:t>
-      </w:r>
-      <w:r>
-        <w:rPr>
-          <w:rStyle w:val="VerbatimChar"/>
-          <w:rFonts w:ascii="menlo" w:eastAsia="menlo" w:hAnsi="menlo" w:cs="menlo"/>
-          <w:color w:val="000000"/>
-          <w:sz w:val="18"/>
-        </w:rPr>
-        <w:t>python-</w:t>
-      </w:r>
-      <w:proofErr w:type="spellStart"/>
-      <w:r>
-        <w:rPr>
-          <w:rStyle w:val="VerbatimChar"/>
-          <w:rFonts w:ascii="menlo" w:eastAsia="menlo" w:hAnsi="menlo" w:cs="menlo"/>
-          <w:color w:val="000000"/>
-          <w:sz w:val="18"/>
-        </w:rPr>
-        <w:t>dotenv</w:t>
-      </w:r>
-      <w:proofErr w:type="spellEnd"/>
-      <w:r>
-        <w:rPr>
-          <w:rStyle w:val="VerbatimChar"/>
-          <w:rFonts w:ascii="menlo" w:eastAsia="menlo" w:hAnsi="menlo" w:cs="menlo"/>
-          <w:color w:val="000000"/>
-          <w:sz w:val="18"/>
-        </w:rPr>
-        <w:t xml:space="preserve"> </w:t>
+        <w:t>Pillow</w:t>
       </w:r>
       <w:r>
         <w:rPr>
@@ -361,7 +238,7 @@
           <w:sz w:val="18"/>
           <w:lang w:eastAsia="zh-TW"/>
         </w:rPr>
-        <w:t>Pillow</w:t>
+        <w:t xml:space="preserve"> requests</w:t>
       </w:r>
       <w:r>
         <w:rPr>
@@ -390,117 +267,27 @@
           <w:sz w:val="18"/>
         </w:rPr>
         <w:br/>
-      </w:r>
-      <w:proofErr w:type="spellStart"/>
-      <w:r>
-        <w:rPr>
-          <w:rStyle w:val="VerbatimChar"/>
-          <w:rFonts w:ascii="menlo" w:eastAsia="menlo" w:hAnsi="menlo" w:cs="menlo"/>
-          <w:color w:val="000000"/>
-          <w:sz w:val="18"/>
-        </w:rPr>
-        <w:t>django</w:t>
-      </w:r>
-      <w:proofErr w:type="spellEnd"/>
-      <w:r>
-        <w:rPr>
-          <w:rStyle w:val="VerbatimChar"/>
-          <w:rFonts w:ascii="menlo" w:eastAsia="menlo" w:hAnsi="menlo" w:cs="menlo"/>
-          <w:color w:val="000000"/>
-          <w:sz w:val="18"/>
-        </w:rPr>
-        <w:t xml:space="preserve">-admin </w:t>
-      </w:r>
-      <w:proofErr w:type="spellStart"/>
-      <w:r>
-        <w:rPr>
-          <w:rStyle w:val="VerbatimChar"/>
-          <w:rFonts w:ascii="menlo" w:eastAsia="menlo" w:hAnsi="menlo" w:cs="menlo"/>
-          <w:color w:val="000000"/>
-          <w:sz w:val="18"/>
-        </w:rPr>
-        <w:t>startproject</w:t>
-      </w:r>
-      <w:proofErr w:type="spellEnd"/>
-      <w:r>
-        <w:rPr>
-          <w:rStyle w:val="VerbatimChar"/>
-          <w:rFonts w:ascii="menlo" w:eastAsia="menlo" w:hAnsi="menlo" w:cs="menlo"/>
-          <w:color w:val="000000"/>
-          <w:sz w:val="18"/>
-        </w:rPr>
-        <w:t xml:space="preserve"> </w:t>
-      </w:r>
-      <w:proofErr w:type="gramStart"/>
-      <w:r>
-        <w:rPr>
-          <w:rStyle w:val="VerbatimChar"/>
-          <w:rFonts w:ascii="menlo" w:eastAsia="menlo" w:hAnsi="menlo" w:cs="menlo"/>
-          <w:color w:val="000000"/>
-          <w:sz w:val="18"/>
-        </w:rPr>
-        <w:t>config .</w:t>
-      </w:r>
-      <w:proofErr w:type="gramEnd"/>
-      <w:r>
-        <w:rPr>
-          <w:rStyle w:val="VerbatimChar"/>
-          <w:rFonts w:ascii="menlo" w:eastAsia="menlo" w:hAnsi="menlo" w:cs="menlo"/>
-          <w:color w:val="000000"/>
-          <w:sz w:val="18"/>
-        </w:rPr>
-        <w:br/>
-        <w:t xml:space="preserve">python manage.py </w:t>
-      </w:r>
-      <w:proofErr w:type="spellStart"/>
-      <w:r>
-        <w:rPr>
-          <w:rStyle w:val="VerbatimChar"/>
-          <w:rFonts w:ascii="menlo" w:eastAsia="menlo" w:hAnsi="menlo" w:cs="menlo"/>
-          <w:color w:val="000000"/>
-          <w:sz w:val="18"/>
-        </w:rPr>
-        <w:t>startapp</w:t>
-      </w:r>
-      <w:proofErr w:type="spellEnd"/>
-      <w:r>
-        <w:rPr>
-          <w:rStyle w:val="VerbatimChar"/>
-          <w:rFonts w:ascii="menlo" w:eastAsia="menlo" w:hAnsi="menlo" w:cs="menlo"/>
-          <w:color w:val="000000"/>
-          <w:sz w:val="18"/>
-        </w:rPr>
-        <w:t xml:space="preserve"> accounts</w:t>
-      </w:r>
-      <w:r>
-        <w:rPr>
-          <w:rStyle w:val="VerbatimChar"/>
-          <w:rFonts w:ascii="menlo" w:eastAsia="menlo" w:hAnsi="menlo" w:cs="menlo"/>
-          <w:color w:val="000000"/>
-          <w:sz w:val="18"/>
-        </w:rPr>
-        <w:br/>
-        <w:t xml:space="preserve">python manage.py </w:t>
-      </w:r>
-      <w:proofErr w:type="spellStart"/>
-      <w:r>
-        <w:rPr>
-          <w:rStyle w:val="VerbatimChar"/>
-          <w:rFonts w:ascii="menlo" w:eastAsia="menlo" w:hAnsi="menlo" w:cs="menlo"/>
-          <w:color w:val="000000"/>
-          <w:sz w:val="18"/>
-        </w:rPr>
-        <w:t>startapp</w:t>
-      </w:r>
-      <w:proofErr w:type="spellEnd"/>
-      <w:r>
-        <w:rPr>
-          <w:rStyle w:val="VerbatimChar"/>
-          <w:rFonts w:ascii="menlo" w:eastAsia="menlo" w:hAnsi="menlo" w:cs="menlo"/>
-          <w:color w:val="000000"/>
-          <w:sz w:val="18"/>
-        </w:rPr>
-        <w:t xml:space="preserve"> core</w:t>
+        <w:t>django-admin startproject config .</w:t>
+      </w:r>
+      <w:r>
+        <w:rPr>
+          <w:rStyle w:val="VerbatimChar"/>
+          <w:rFonts w:ascii="menlo" w:eastAsia="menlo" w:hAnsi="menlo" w:cs="menlo"/>
+          <w:color w:val="000000"/>
+          <w:sz w:val="18"/>
+        </w:rPr>
+        <w:br/>
+        <w:t>python manage.py startapp accounts</w:t>
+      </w:r>
+      <w:r>
+        <w:rPr>
+          <w:rStyle w:val="VerbatimChar"/>
+          <w:rFonts w:ascii="menlo" w:eastAsia="menlo" w:hAnsi="menlo" w:cs="menlo"/>
+          <w:color w:val="000000"/>
+          <w:sz w:val="18"/>
+        </w:rPr>
+        <w:br/>
+        <w:t>python manage.py startapp core</w:t>
       </w:r>
       <w:r>
         <w:rPr>
@@ -518,229 +305,129 @@
         </w:rPr>
         <w:br/>
       </w:r>
-      <w:proofErr w:type="spellStart"/>
-      <w:r>
-        <w:rPr>
-          <w:rStyle w:val="VerbatimChar"/>
-          <w:rFonts w:ascii="menlo" w:eastAsia="menlo" w:hAnsi="menlo" w:cs="menlo"/>
-          <w:color w:val="000000"/>
-          <w:sz w:val="18"/>
-        </w:rPr>
-        <w:t>mkdir</w:t>
-      </w:r>
-      <w:proofErr w:type="spellEnd"/>
-      <w:r>
-        <w:rPr>
-          <w:rStyle w:val="VerbatimChar"/>
-          <w:rFonts w:ascii="menlo" w:eastAsia="menlo" w:hAnsi="menlo" w:cs="menlo"/>
-          <w:color w:val="000000"/>
-          <w:sz w:val="18"/>
-        </w:rPr>
-        <w:t xml:space="preserve"> templates</w:t>
-      </w:r>
-      <w:r>
-        <w:rPr>
-          <w:rStyle w:val="VerbatimChar"/>
-          <w:rFonts w:ascii="menlo" w:eastAsiaTheme="minorEastAsia" w:hAnsi="menlo" w:cs="menlo"/>
-          <w:color w:val="000000"/>
-          <w:sz w:val="18"/>
-          <w:lang w:eastAsia="zh-TW"/>
-        </w:rPr>
-        <w:br/>
-      </w:r>
-      <w:proofErr w:type="spellStart"/>
-      <w:r>
-        <w:rPr>
-          <w:rStyle w:val="VerbatimChar"/>
-          <w:rFonts w:ascii="menlo" w:eastAsia="menlo" w:hAnsi="menlo" w:cs="menlo"/>
-          <w:color w:val="000000"/>
-          <w:sz w:val="18"/>
-        </w:rPr>
-        <w:t>mkdir</w:t>
-      </w:r>
-      <w:proofErr w:type="spellEnd"/>
-      <w:r>
-        <w:rPr>
-          <w:rStyle w:val="VerbatimChar"/>
-          <w:rFonts w:ascii="menlo" w:eastAsia="menlo" w:hAnsi="menlo" w:cs="menlo"/>
-          <w:color w:val="000000"/>
-          <w:sz w:val="18"/>
-        </w:rPr>
-        <w:t xml:space="preserve"> templates\accounts</w:t>
-      </w:r>
-      <w:r>
-        <w:rPr>
-          <w:rStyle w:val="VerbatimChar"/>
-          <w:rFonts w:ascii="menlo" w:eastAsiaTheme="minorEastAsia" w:hAnsi="menlo" w:cs="menlo"/>
-          <w:color w:val="000000"/>
-          <w:sz w:val="18"/>
-          <w:lang w:eastAsia="zh-TW"/>
-        </w:rPr>
-        <w:br/>
-      </w:r>
-      <w:proofErr w:type="spellStart"/>
-      <w:r>
-        <w:rPr>
-          <w:rStyle w:val="VerbatimChar"/>
-          <w:rFonts w:ascii="menlo" w:eastAsia="menlo" w:hAnsi="menlo" w:cs="menlo"/>
-          <w:color w:val="000000"/>
-          <w:sz w:val="18"/>
-        </w:rPr>
-        <w:t>mkdir</w:t>
-      </w:r>
-      <w:proofErr w:type="spellEnd"/>
-      <w:r>
-        <w:rPr>
-          <w:rStyle w:val="VerbatimChar"/>
-          <w:rFonts w:ascii="menlo" w:eastAsia="menlo" w:hAnsi="menlo" w:cs="menlo"/>
-          <w:color w:val="000000"/>
-          <w:sz w:val="18"/>
-        </w:rPr>
-        <w:t xml:space="preserve"> templates\core</w:t>
-      </w:r>
-      <w:r>
-        <w:rPr>
-          <w:rStyle w:val="VerbatimChar"/>
-          <w:rFonts w:ascii="menlo" w:eastAsiaTheme="minorEastAsia" w:hAnsi="menlo" w:cs="menlo"/>
-          <w:color w:val="000000"/>
-          <w:sz w:val="18"/>
-          <w:lang w:eastAsia="zh-TW"/>
-        </w:rPr>
-        <w:br/>
-      </w:r>
-      <w:proofErr w:type="spellStart"/>
-      <w:r>
-        <w:rPr>
-          <w:rStyle w:val="VerbatimChar"/>
-          <w:rFonts w:ascii="menlo" w:eastAsia="menlo" w:hAnsi="menlo" w:cs="menlo"/>
-          <w:color w:val="000000"/>
-          <w:sz w:val="18"/>
-        </w:rPr>
-        <w:t>mkdir</w:t>
-      </w:r>
-      <w:proofErr w:type="spellEnd"/>
-      <w:r>
-        <w:rPr>
-          <w:rStyle w:val="VerbatimChar"/>
-          <w:rFonts w:ascii="menlo" w:eastAsia="menlo" w:hAnsi="menlo" w:cs="menlo"/>
-          <w:color w:val="000000"/>
-          <w:sz w:val="18"/>
-        </w:rPr>
-        <w:t xml:space="preserve"> static</w:t>
-      </w:r>
-      <w:r>
-        <w:rPr>
-          <w:rStyle w:val="VerbatimChar"/>
-          <w:rFonts w:ascii="menlo" w:eastAsiaTheme="minorEastAsia" w:hAnsi="menlo" w:cs="menlo"/>
-          <w:color w:val="000000"/>
-          <w:sz w:val="18"/>
-          <w:lang w:eastAsia="zh-TW"/>
-        </w:rPr>
-        <w:br/>
-      </w:r>
-      <w:proofErr w:type="spellStart"/>
-      <w:r>
-        <w:rPr>
-          <w:rStyle w:val="VerbatimChar"/>
-          <w:rFonts w:ascii="menlo" w:eastAsia="menlo" w:hAnsi="menlo" w:cs="menlo"/>
-          <w:color w:val="000000"/>
-          <w:sz w:val="18"/>
-        </w:rPr>
-        <w:t>mkdir</w:t>
-      </w:r>
-      <w:proofErr w:type="spellEnd"/>
-      <w:r>
-        <w:rPr>
-          <w:rStyle w:val="VerbatimChar"/>
-          <w:rFonts w:ascii="menlo" w:eastAsia="menlo" w:hAnsi="menlo" w:cs="menlo"/>
-          <w:color w:val="000000"/>
-          <w:sz w:val="18"/>
-        </w:rPr>
-        <w:t xml:space="preserve"> static\</w:t>
-      </w:r>
-      <w:proofErr w:type="spellStart"/>
-      <w:r>
-        <w:rPr>
-          <w:rStyle w:val="VerbatimChar"/>
-          <w:rFonts w:ascii="menlo" w:eastAsia="menlo" w:hAnsi="menlo" w:cs="menlo"/>
-          <w:color w:val="000000"/>
-          <w:sz w:val="18"/>
-        </w:rPr>
-        <w:t>css</w:t>
-      </w:r>
-      <w:proofErr w:type="spellEnd"/>
-      <w:r>
-        <w:rPr>
-          <w:rStyle w:val="VerbatimChar"/>
-          <w:rFonts w:ascii="menlo" w:eastAsiaTheme="minorEastAsia" w:hAnsi="menlo" w:cs="menlo"/>
-          <w:color w:val="000000"/>
-          <w:sz w:val="18"/>
-          <w:lang w:eastAsia="zh-TW"/>
-        </w:rPr>
-        <w:br/>
-      </w:r>
-      <w:proofErr w:type="spellStart"/>
-      <w:r>
-        <w:rPr>
-          <w:rStyle w:val="VerbatimChar"/>
-          <w:rFonts w:ascii="menlo" w:eastAsia="menlo" w:hAnsi="menlo" w:cs="menlo"/>
-          <w:color w:val="000000"/>
-          <w:sz w:val="18"/>
-        </w:rPr>
-        <w:t>mkdir</w:t>
-      </w:r>
-      <w:proofErr w:type="spellEnd"/>
-      <w:r>
-        <w:rPr>
-          <w:rStyle w:val="VerbatimChar"/>
-          <w:rFonts w:ascii="menlo" w:eastAsia="menlo" w:hAnsi="menlo" w:cs="menlo"/>
-          <w:color w:val="000000"/>
-          <w:sz w:val="18"/>
-        </w:rPr>
-        <w:t xml:space="preserve"> static\</w:t>
-      </w:r>
-      <w:proofErr w:type="spellStart"/>
-      <w:r>
-        <w:rPr>
-          <w:rStyle w:val="VerbatimChar"/>
-          <w:rFonts w:ascii="menlo" w:eastAsia="menlo" w:hAnsi="menlo" w:cs="menlo"/>
-          <w:color w:val="000000"/>
-          <w:sz w:val="18"/>
-        </w:rPr>
-        <w:t>js</w:t>
-      </w:r>
-      <w:proofErr w:type="spellEnd"/>
-      <w:r>
-        <w:rPr>
-          <w:rStyle w:val="VerbatimChar"/>
-          <w:rFonts w:ascii="menlo" w:eastAsiaTheme="minorEastAsia" w:hAnsi="menlo" w:cs="menlo"/>
-          <w:color w:val="000000"/>
-          <w:sz w:val="18"/>
-          <w:lang w:eastAsia="zh-TW"/>
-        </w:rPr>
-        <w:br/>
-      </w:r>
-      <w:proofErr w:type="spellStart"/>
-      <w:r>
-        <w:rPr>
-          <w:rStyle w:val="VerbatimChar"/>
-          <w:rFonts w:ascii="menlo" w:eastAsia="menlo" w:hAnsi="menlo" w:cs="menlo"/>
-          <w:color w:val="000000"/>
-          <w:sz w:val="18"/>
-        </w:rPr>
-        <w:t>mkdir</w:t>
-      </w:r>
-      <w:proofErr w:type="spellEnd"/>
-      <w:r>
-        <w:rPr>
-          <w:rStyle w:val="VerbatimChar"/>
-          <w:rFonts w:ascii="menlo" w:eastAsia="menlo" w:hAnsi="menlo" w:cs="menlo"/>
-          <w:color w:val="000000"/>
-          <w:sz w:val="18"/>
-        </w:rPr>
-        <w:t xml:space="preserve"> static\</w:t>
-      </w:r>
-      <w:proofErr w:type="spellStart"/>
+      <w:r>
+        <w:rPr>
+          <w:rStyle w:val="VerbatimChar"/>
+          <w:rFonts w:ascii="menlo" w:eastAsia="menlo" w:hAnsi="menlo" w:cs="menlo"/>
+          <w:color w:val="000000"/>
+          <w:sz w:val="18"/>
+        </w:rPr>
+        <w:t>mkdir templates</w:t>
+      </w:r>
+      <w:r>
+        <w:rPr>
+          <w:rStyle w:val="VerbatimChar"/>
+          <w:rFonts w:ascii="menlo" w:eastAsiaTheme="minorEastAsia" w:hAnsi="menlo" w:cs="menlo"/>
+          <w:color w:val="000000"/>
+          <w:sz w:val="18"/>
+          <w:lang w:eastAsia="zh-TW"/>
+        </w:rPr>
+        <w:br/>
+      </w:r>
+      <w:r>
+        <w:rPr>
+          <w:rStyle w:val="VerbatimChar"/>
+          <w:rFonts w:ascii="menlo" w:eastAsia="menlo" w:hAnsi="menlo" w:cs="menlo"/>
+          <w:color w:val="000000"/>
+          <w:sz w:val="18"/>
+        </w:rPr>
+        <w:t>mkdir templates\accounts</w:t>
+      </w:r>
+      <w:r>
+        <w:rPr>
+          <w:rStyle w:val="VerbatimChar"/>
+          <w:rFonts w:ascii="menlo" w:eastAsiaTheme="minorEastAsia" w:hAnsi="menlo" w:cs="menlo"/>
+          <w:color w:val="000000"/>
+          <w:sz w:val="18"/>
+          <w:lang w:eastAsia="zh-TW"/>
+        </w:rPr>
+        <w:br/>
+      </w:r>
+      <w:r>
+        <w:rPr>
+          <w:rStyle w:val="VerbatimChar"/>
+          <w:rFonts w:ascii="menlo" w:eastAsia="menlo" w:hAnsi="menlo" w:cs="menlo"/>
+          <w:color w:val="000000"/>
+          <w:sz w:val="18"/>
+        </w:rPr>
+        <w:t>mkdir templates\core</w:t>
+      </w:r>
+      <w:r>
+        <w:rPr>
+          <w:rStyle w:val="VerbatimChar"/>
+          <w:rFonts w:ascii="menlo" w:eastAsiaTheme="minorEastAsia" w:hAnsi="menlo" w:cs="menlo"/>
+          <w:color w:val="000000"/>
+          <w:sz w:val="18"/>
+          <w:lang w:eastAsia="zh-TW"/>
+        </w:rPr>
+        <w:br/>
+      </w:r>
+      <w:r>
+        <w:rPr>
+          <w:rStyle w:val="VerbatimChar"/>
+          <w:rFonts w:ascii="menlo" w:eastAsia="menlo" w:hAnsi="menlo" w:cs="menlo"/>
+          <w:color w:val="000000"/>
+          <w:sz w:val="18"/>
+        </w:rPr>
+        <w:t>mkdir static</w:t>
+      </w:r>
+      <w:r>
+        <w:rPr>
+          <w:rStyle w:val="VerbatimChar"/>
+          <w:rFonts w:ascii="menlo" w:eastAsiaTheme="minorEastAsia" w:hAnsi="menlo" w:cs="menlo"/>
+          <w:color w:val="000000"/>
+          <w:sz w:val="18"/>
+          <w:lang w:eastAsia="zh-TW"/>
+        </w:rPr>
+        <w:br/>
+      </w:r>
+      <w:r>
+        <w:rPr>
+          <w:rStyle w:val="VerbatimChar"/>
+          <w:rFonts w:ascii="menlo" w:eastAsia="menlo" w:hAnsi="menlo" w:cs="menlo"/>
+          <w:color w:val="000000"/>
+          <w:sz w:val="18"/>
+        </w:rPr>
+        <w:t>mkdir static\css</w:t>
+      </w:r>
+      <w:r>
+        <w:rPr>
+          <w:rStyle w:val="VerbatimChar"/>
+          <w:rFonts w:ascii="menlo" w:eastAsiaTheme="minorEastAsia" w:hAnsi="menlo" w:cs="menlo"/>
+          <w:color w:val="000000"/>
+          <w:sz w:val="18"/>
+          <w:lang w:eastAsia="zh-TW"/>
+        </w:rPr>
+        <w:br/>
+      </w:r>
+      <w:r>
+        <w:rPr>
+          <w:rStyle w:val="VerbatimChar"/>
+          <w:rFonts w:ascii="menlo" w:eastAsia="menlo" w:hAnsi="menlo" w:cs="menlo"/>
+          <w:color w:val="000000"/>
+          <w:sz w:val="18"/>
+        </w:rPr>
+        <w:t>mkdir static\js</w:t>
+      </w:r>
+      <w:r>
+        <w:rPr>
+          <w:rStyle w:val="VerbatimChar"/>
+          <w:rFonts w:ascii="menlo" w:eastAsiaTheme="minorEastAsia" w:hAnsi="menlo" w:cs="menlo"/>
+          <w:color w:val="000000"/>
+          <w:sz w:val="18"/>
+          <w:lang w:eastAsia="zh-TW"/>
+        </w:rPr>
+        <w:br/>
+      </w:r>
+      <w:r>
+        <w:rPr>
+          <w:rStyle w:val="VerbatimChar"/>
+          <w:rFonts w:ascii="menlo" w:eastAsia="menlo" w:hAnsi="menlo" w:cs="menlo"/>
+          <w:color w:val="000000"/>
+          <w:sz w:val="18"/>
+        </w:rPr>
+        <w:t>mkdir static\</w:t>
+      </w:r>
       <w:r>
         <w:rPr>
           <w:rStyle w:val="VerbatimChar"/>
@@ -751,76 +438,43 @@
         </w:rPr>
         <w:t>img</w:t>
       </w:r>
-      <w:proofErr w:type="spellEnd"/>
-      <w:r>
-        <w:rPr>
-          <w:rStyle w:val="VerbatimChar"/>
-          <w:rFonts w:ascii="menlo" w:eastAsia="menlo" w:hAnsi="menlo" w:cs="menlo"/>
-          <w:color w:val="000000"/>
-          <w:sz w:val="18"/>
-        </w:rPr>
-        <w:br/>
-      </w:r>
-      <w:r>
-        <w:rPr>
-          <w:rStyle w:val="VerbatimChar"/>
-          <w:rFonts w:ascii="menlo" w:eastAsia="menlo" w:hAnsi="menlo" w:cs="menlo"/>
-          <w:color w:val="000000"/>
-          <w:sz w:val="18"/>
-        </w:rPr>
-        <w:br/>
-      </w:r>
-      <w:proofErr w:type="spellStart"/>
-      <w:proofErr w:type="gramStart"/>
-      <w:r>
-        <w:rPr>
-          <w:rStyle w:val="VerbatimChar"/>
-          <w:rFonts w:ascii="menlo" w:eastAsia="menlo" w:hAnsi="menlo" w:cs="menlo"/>
-          <w:color w:val="000000"/>
-          <w:sz w:val="18"/>
-        </w:rPr>
-        <w:t>ni</w:t>
-      </w:r>
-      <w:proofErr w:type="spellEnd"/>
-      <w:r>
-        <w:rPr>
-          <w:rStyle w:val="VerbatimChar"/>
-          <w:rFonts w:ascii="menlo" w:eastAsia="menlo" w:hAnsi="menlo" w:cs="menlo"/>
-          <w:color w:val="000000"/>
-          <w:sz w:val="18"/>
-        </w:rPr>
-        <w:t xml:space="preserve"> .env</w:t>
-      </w:r>
-      <w:proofErr w:type="gramEnd"/>
-      <w:r>
-        <w:rPr>
-          <w:rStyle w:val="VerbatimChar"/>
-          <w:rFonts w:ascii="menlo" w:eastAsiaTheme="minorEastAsia" w:hAnsi="menlo" w:cs="menlo"/>
-          <w:color w:val="000000"/>
-          <w:sz w:val="18"/>
-          <w:lang w:eastAsia="zh-TW"/>
-        </w:rPr>
-        <w:br/>
-      </w:r>
-      <w:proofErr w:type="spellStart"/>
-      <w:r>
-        <w:rPr>
-          <w:rStyle w:val="VerbatimChar"/>
-          <w:rFonts w:ascii="menlo" w:eastAsia="menlo" w:hAnsi="menlo" w:cs="menlo"/>
-          <w:color w:val="000000"/>
-          <w:sz w:val="18"/>
-        </w:rPr>
-        <w:t>ni</w:t>
-      </w:r>
-      <w:proofErr w:type="spellEnd"/>
-      <w:r>
-        <w:rPr>
-          <w:rStyle w:val="VerbatimChar"/>
-          <w:rFonts w:ascii="menlo" w:eastAsia="menlo" w:hAnsi="menlo" w:cs="menlo"/>
-          <w:color w:val="000000"/>
-          <w:sz w:val="18"/>
-        </w:rPr>
-        <w:t xml:space="preserve"> README.md</w:t>
+      <w:r>
+        <w:rPr>
+          <w:rStyle w:val="VerbatimChar"/>
+          <w:rFonts w:ascii="menlo" w:eastAsia="menlo" w:hAnsi="menlo" w:cs="menlo"/>
+          <w:color w:val="000000"/>
+          <w:sz w:val="18"/>
+        </w:rPr>
+        <w:br/>
+      </w:r>
+      <w:r>
+        <w:rPr>
+          <w:rStyle w:val="VerbatimChar"/>
+          <w:rFonts w:ascii="menlo" w:eastAsia="menlo" w:hAnsi="menlo" w:cs="menlo"/>
+          <w:color w:val="000000"/>
+          <w:sz w:val="18"/>
+        </w:rPr>
+        <w:br/>
+        <w:t>ni .env</w:t>
+      </w:r>
+      <w:r>
+        <w:rPr>
+          <w:rStyle w:val="VerbatimChar"/>
+          <w:rFonts w:ascii="menlo" w:eastAsiaTheme="minorEastAsia" w:hAnsi="menlo" w:cs="menlo"/>
+          <w:color w:val="000000"/>
+          <w:sz w:val="18"/>
+          <w:lang w:eastAsia="zh-TW"/>
+        </w:rPr>
+        <w:br/>
+      </w:r>
+      <w:r>
+        <w:rPr>
+          <w:rStyle w:val="VerbatimChar"/>
+          <w:rFonts w:ascii="menlo" w:eastAsia="menlo" w:hAnsi="menlo" w:cs="menlo"/>
+          <w:color w:val="000000"/>
+          <w:sz w:val="18"/>
+        </w:rPr>
+        <w:t>ni README.md</w:t>
       </w:r>
     </w:p>
     <w:p>
@@ -844,55 +498,33 @@
         </w:rPr>
         <w:br/>
       </w:r>
-      <w:proofErr w:type="spellStart"/>
-      <w:r>
-        <w:rPr>
-          <w:rStyle w:val="VerbatimChar"/>
-          <w:rFonts w:ascii="menlo" w:eastAsia="menlo" w:hAnsi="menlo" w:cs="menlo"/>
-          <w:color w:val="000000"/>
-          <w:sz w:val="18"/>
-        </w:rPr>
-        <w:t>ni</w:t>
-      </w:r>
-      <w:proofErr w:type="spellEnd"/>
-      <w:r>
-        <w:rPr>
-          <w:rStyle w:val="VerbatimChar"/>
-          <w:rFonts w:ascii="menlo" w:eastAsia="menlo" w:hAnsi="menlo" w:cs="menlo"/>
-          <w:color w:val="000000"/>
-          <w:sz w:val="18"/>
-        </w:rPr>
-        <w:t xml:space="preserve"> accounts\forms.py</w:t>
-      </w:r>
-      <w:r>
-        <w:rPr>
-          <w:rStyle w:val="VerbatimChar"/>
-          <w:rFonts w:ascii="menlo" w:eastAsiaTheme="minorEastAsia" w:hAnsi="menlo" w:cs="menlo"/>
-          <w:color w:val="000000"/>
-          <w:sz w:val="18"/>
-          <w:lang w:eastAsia="zh-TW"/>
-        </w:rPr>
-        <w:br/>
-      </w:r>
-      <w:proofErr w:type="spellStart"/>
-      <w:r>
-        <w:rPr>
-          <w:rStyle w:val="VerbatimChar"/>
-          <w:rFonts w:ascii="menlo" w:eastAsia="menlo" w:hAnsi="menlo" w:cs="menlo"/>
-          <w:color w:val="000000"/>
-          <w:sz w:val="18"/>
-        </w:rPr>
-        <w:t>ni</w:t>
-      </w:r>
-      <w:proofErr w:type="spellEnd"/>
-      <w:r>
-        <w:rPr>
-          <w:rStyle w:val="VerbatimChar"/>
-          <w:rFonts w:ascii="menlo" w:eastAsia="menlo" w:hAnsi="menlo" w:cs="menlo"/>
-          <w:color w:val="000000"/>
-          <w:sz w:val="18"/>
-        </w:rPr>
-        <w:t xml:space="preserve"> accounts\urls.py</w:t>
+      <w:r>
+        <w:rPr>
+          <w:rStyle w:val="VerbatimChar"/>
+          <w:rFonts w:ascii="menlo" w:eastAsia="menlo" w:hAnsi="menlo" w:cs="menlo"/>
+          <w:color w:val="000000"/>
+          <w:sz w:val="18"/>
+        </w:rPr>
+        <w:t>ni accounts\forms.py</w:t>
+      </w:r>
+      <w:r>
+        <w:rPr>
+          <w:rStyle w:val="VerbatimChar"/>
+          <w:rFonts w:ascii="menlo" w:eastAsiaTheme="minorEastAsia" w:hAnsi="menlo" w:cs="menlo"/>
+          <w:color w:val="000000"/>
+          <w:sz w:val="18"/>
+          <w:lang w:eastAsia="zh-TW"/>
+        </w:rPr>
+        <w:br/>
+      </w:r>
+      <w:r>
+        <w:rPr>
+          <w:rStyle w:val="VerbatimChar"/>
+          <w:rFonts w:ascii="menlo" w:eastAsia="menlo" w:hAnsi="menlo" w:cs="menlo"/>
+          <w:color w:val="000000"/>
+          <w:sz w:val="18"/>
+        </w:rPr>
+        <w:t>ni accounts\urls.py</w:t>
       </w:r>
     </w:p>
     <w:p>
@@ -916,55 +548,33 @@
         </w:rPr>
         <w:br/>
       </w:r>
-      <w:proofErr w:type="spellStart"/>
-      <w:r>
-        <w:rPr>
-          <w:rStyle w:val="VerbatimChar"/>
-          <w:rFonts w:ascii="menlo" w:eastAsia="menlo" w:hAnsi="menlo" w:cs="menlo"/>
-          <w:color w:val="000000"/>
-          <w:sz w:val="18"/>
-        </w:rPr>
-        <w:t>ni</w:t>
-      </w:r>
-      <w:proofErr w:type="spellEnd"/>
-      <w:r>
-        <w:rPr>
-          <w:rStyle w:val="VerbatimChar"/>
-          <w:rFonts w:ascii="menlo" w:eastAsia="menlo" w:hAnsi="menlo" w:cs="menlo"/>
-          <w:color w:val="000000"/>
-          <w:sz w:val="18"/>
-        </w:rPr>
-        <w:t xml:space="preserve"> core\forms.py</w:t>
-      </w:r>
-      <w:r>
-        <w:rPr>
-          <w:rStyle w:val="VerbatimChar"/>
-          <w:rFonts w:ascii="menlo" w:eastAsiaTheme="minorEastAsia" w:hAnsi="menlo" w:cs="menlo"/>
-          <w:color w:val="000000"/>
-          <w:sz w:val="18"/>
-          <w:lang w:eastAsia="zh-TW"/>
-        </w:rPr>
-        <w:br/>
-      </w:r>
-      <w:proofErr w:type="spellStart"/>
-      <w:r>
-        <w:rPr>
-          <w:rStyle w:val="VerbatimChar"/>
-          <w:rFonts w:ascii="menlo" w:eastAsia="menlo" w:hAnsi="menlo" w:cs="menlo"/>
-          <w:color w:val="000000"/>
-          <w:sz w:val="18"/>
-        </w:rPr>
-        <w:t>ni</w:t>
-      </w:r>
-      <w:proofErr w:type="spellEnd"/>
-      <w:r>
-        <w:rPr>
-          <w:rStyle w:val="VerbatimChar"/>
-          <w:rFonts w:ascii="menlo" w:eastAsia="menlo" w:hAnsi="menlo" w:cs="menlo"/>
-          <w:color w:val="000000"/>
-          <w:sz w:val="18"/>
-        </w:rPr>
-        <w:t xml:space="preserve"> core\</w:t>
+      <w:r>
+        <w:rPr>
+          <w:rStyle w:val="VerbatimChar"/>
+          <w:rFonts w:ascii="menlo" w:eastAsia="menlo" w:hAnsi="menlo" w:cs="menlo"/>
+          <w:color w:val="000000"/>
+          <w:sz w:val="18"/>
+        </w:rPr>
+        <w:t>ni core\forms.py</w:t>
+      </w:r>
+      <w:r>
+        <w:rPr>
+          <w:rStyle w:val="VerbatimChar"/>
+          <w:rFonts w:ascii="menlo" w:eastAsiaTheme="minorEastAsia" w:hAnsi="menlo" w:cs="menlo"/>
+          <w:color w:val="000000"/>
+          <w:sz w:val="18"/>
+          <w:lang w:eastAsia="zh-TW"/>
+        </w:rPr>
+        <w:br/>
+      </w:r>
+      <w:r>
+        <w:rPr>
+          <w:rStyle w:val="VerbatimChar"/>
+          <w:rFonts w:ascii="menlo" w:eastAsia="menlo" w:hAnsi="menlo" w:cs="menlo"/>
+          <w:color w:val="000000"/>
+          <w:sz w:val="18"/>
+        </w:rPr>
+        <w:t>ni core\</w:t>
       </w:r>
       <w:r>
         <w:rPr>
@@ -1008,67 +618,44 @@
         </w:rPr>
         <w:br/>
       </w:r>
-      <w:proofErr w:type="spellStart"/>
-      <w:r>
-        <w:rPr>
-          <w:rStyle w:val="VerbatimChar"/>
-          <w:rFonts w:ascii="menlo" w:eastAsia="menlo" w:hAnsi="menlo" w:cs="menlo"/>
-          <w:color w:val="000000"/>
-          <w:sz w:val="18"/>
-        </w:rPr>
-        <w:t>ni</w:t>
-      </w:r>
-      <w:proofErr w:type="spellEnd"/>
-      <w:r>
-        <w:rPr>
-          <w:rStyle w:val="VerbatimChar"/>
-          <w:rFonts w:ascii="menlo" w:eastAsia="menlo" w:hAnsi="menlo" w:cs="menlo"/>
-          <w:color w:val="000000"/>
-          <w:sz w:val="18"/>
-        </w:rPr>
-        <w:t xml:space="preserve"> templates\base.html</w:t>
-      </w:r>
-      <w:r>
-        <w:rPr>
-          <w:rStyle w:val="VerbatimChar"/>
-          <w:rFonts w:ascii="menlo" w:eastAsiaTheme="minorEastAsia" w:hAnsi="menlo" w:cs="menlo"/>
-          <w:color w:val="000000"/>
-          <w:sz w:val="18"/>
-          <w:lang w:eastAsia="zh-TW"/>
-        </w:rPr>
-        <w:br/>
-      </w:r>
-      <w:proofErr w:type="spellStart"/>
-      <w:r>
-        <w:rPr>
-          <w:rStyle w:val="VerbatimChar"/>
-          <w:rFonts w:ascii="menlo" w:eastAsia="menlo" w:hAnsi="menlo" w:cs="menlo"/>
-          <w:color w:val="000000"/>
-          <w:sz w:val="18"/>
-        </w:rPr>
-        <w:t>ni</w:t>
-      </w:r>
-      <w:proofErr w:type="spellEnd"/>
-      <w:r>
-        <w:rPr>
-          <w:rStyle w:val="VerbatimChar"/>
-          <w:rFonts w:ascii="menlo" w:eastAsia="menlo" w:hAnsi="menlo" w:cs="menlo"/>
-          <w:color w:val="000000"/>
-          <w:sz w:val="18"/>
-        </w:rPr>
-        <w:t xml:space="preserve"> templates\dashboard.html</w:t>
-      </w:r>
-      <w:r>
-        <w:rPr>
-          <w:rStyle w:val="VerbatimChar"/>
-          <w:rFonts w:ascii="menlo" w:eastAsiaTheme="minorEastAsia" w:hAnsi="menlo" w:cs="menlo"/>
-          <w:color w:val="000000"/>
-          <w:sz w:val="18"/>
-          <w:lang w:eastAsia="zh-TW"/>
-        </w:rPr>
-        <w:br/>
-      </w:r>
-      <w:proofErr w:type="spellStart"/>
+      <w:r>
+        <w:rPr>
+          <w:rStyle w:val="VerbatimChar"/>
+          <w:rFonts w:ascii="menlo" w:eastAsia="menlo" w:hAnsi="menlo" w:cs="menlo"/>
+          <w:color w:val="000000"/>
+          <w:sz w:val="18"/>
+        </w:rPr>
+        <w:t>ni templates\base.html</w:t>
+      </w:r>
+      <w:r>
+        <w:rPr>
+          <w:rStyle w:val="VerbatimChar"/>
+          <w:rFonts w:ascii="menlo" w:eastAsiaTheme="minorEastAsia" w:hAnsi="menlo" w:cs="menlo"/>
+          <w:color w:val="000000"/>
+          <w:sz w:val="18"/>
+          <w:lang w:eastAsia="zh-TW"/>
+        </w:rPr>
+        <w:br/>
+      </w:r>
+      <w:r>
+        <w:rPr>
+          <w:rStyle w:val="VerbatimChar"/>
+          <w:rFonts w:ascii="menlo" w:eastAsia="menlo" w:hAnsi="menlo" w:cs="menlo"/>
+          <w:color w:val="000000"/>
+          <w:sz w:val="18"/>
+        </w:rPr>
+        <w:t>ni templates\dashboard.html</w:t>
+      </w:r>
+      <w:r>
+        <w:rPr>
+          <w:rStyle w:val="VerbatimChar"/>
+          <w:rFonts w:ascii="menlo" w:eastAsiaTheme="minorEastAsia" w:hAnsi="menlo" w:cs="menlo"/>
+          <w:color w:val="000000"/>
+          <w:sz w:val="18"/>
+          <w:lang w:eastAsia="zh-TW"/>
+        </w:rPr>
+        <w:br/>
+      </w:r>
       <w:r>
         <w:rPr>
           <w:rStyle w:val="VerbatimChar"/>
@@ -1077,137 +664,83 @@
           <w:sz w:val="18"/>
         </w:rPr>
         <w:lastRenderedPageBreak/>
-        <w:t>ni</w:t>
-      </w:r>
-      <w:proofErr w:type="spellEnd"/>
-      <w:r>
-        <w:rPr>
-          <w:rStyle w:val="VerbatimChar"/>
-          <w:rFonts w:ascii="menlo" w:eastAsia="menlo" w:hAnsi="menlo" w:cs="menlo"/>
-          <w:color w:val="000000"/>
-          <w:sz w:val="18"/>
-        </w:rPr>
-        <w:t xml:space="preserve"> templates\accounts\login.html</w:t>
-      </w:r>
-      <w:r>
-        <w:rPr>
-          <w:rStyle w:val="VerbatimChar"/>
-          <w:rFonts w:ascii="menlo" w:eastAsiaTheme="minorEastAsia" w:hAnsi="menlo" w:cs="menlo"/>
-          <w:color w:val="000000"/>
-          <w:sz w:val="18"/>
-          <w:lang w:eastAsia="zh-TW"/>
-        </w:rPr>
-        <w:br/>
-      </w:r>
-      <w:proofErr w:type="spellStart"/>
-      <w:r>
-        <w:rPr>
-          <w:rStyle w:val="VerbatimChar"/>
-          <w:rFonts w:ascii="menlo" w:eastAsia="menlo" w:hAnsi="menlo" w:cs="menlo"/>
-          <w:color w:val="000000"/>
-          <w:sz w:val="18"/>
-        </w:rPr>
-        <w:t>ni</w:t>
-      </w:r>
-      <w:proofErr w:type="spellEnd"/>
-      <w:r>
-        <w:rPr>
-          <w:rStyle w:val="VerbatimChar"/>
-          <w:rFonts w:ascii="menlo" w:eastAsia="menlo" w:hAnsi="menlo" w:cs="menlo"/>
-          <w:color w:val="000000"/>
-          <w:sz w:val="18"/>
-        </w:rPr>
-        <w:t xml:space="preserve"> templates\accounts\profile.html</w:t>
-      </w:r>
-      <w:r>
-        <w:rPr>
-          <w:rStyle w:val="VerbatimChar"/>
-          <w:rFonts w:ascii="menlo" w:eastAsiaTheme="minorEastAsia" w:hAnsi="menlo" w:cs="menlo"/>
-          <w:color w:val="000000"/>
-          <w:sz w:val="18"/>
-          <w:lang w:eastAsia="zh-TW"/>
-        </w:rPr>
-        <w:br/>
-      </w:r>
-      <w:proofErr w:type="spellStart"/>
-      <w:r>
-        <w:rPr>
-          <w:rStyle w:val="VerbatimChar"/>
-          <w:rFonts w:ascii="menlo" w:eastAsia="menlo" w:hAnsi="menlo" w:cs="menlo"/>
-          <w:color w:val="000000"/>
-          <w:sz w:val="18"/>
-        </w:rPr>
-        <w:t>ni</w:t>
-      </w:r>
-      <w:proofErr w:type="spellEnd"/>
-      <w:r>
-        <w:rPr>
-          <w:rStyle w:val="VerbatimChar"/>
-          <w:rFonts w:ascii="menlo" w:eastAsia="menlo" w:hAnsi="menlo" w:cs="menlo"/>
-          <w:color w:val="000000"/>
-          <w:sz w:val="18"/>
-        </w:rPr>
-        <w:t xml:space="preserve"> templates\core\clients.html</w:t>
-      </w:r>
-      <w:r>
-        <w:rPr>
-          <w:rStyle w:val="VerbatimChar"/>
-          <w:rFonts w:ascii="menlo" w:eastAsiaTheme="minorEastAsia" w:hAnsi="menlo" w:cs="menlo"/>
-          <w:color w:val="000000"/>
-          <w:sz w:val="18"/>
-          <w:lang w:eastAsia="zh-TW"/>
-        </w:rPr>
-        <w:br/>
-      </w:r>
-      <w:proofErr w:type="spellStart"/>
-      <w:r>
-        <w:rPr>
-          <w:rStyle w:val="VerbatimChar"/>
-          <w:rFonts w:ascii="menlo" w:eastAsia="menlo" w:hAnsi="menlo" w:cs="menlo"/>
-          <w:color w:val="000000"/>
-          <w:sz w:val="18"/>
-        </w:rPr>
-        <w:t>ni</w:t>
-      </w:r>
-      <w:proofErr w:type="spellEnd"/>
-      <w:r>
-        <w:rPr>
-          <w:rStyle w:val="VerbatimChar"/>
-          <w:rFonts w:ascii="menlo" w:eastAsia="menlo" w:hAnsi="menlo" w:cs="menlo"/>
-          <w:color w:val="000000"/>
-          <w:sz w:val="18"/>
-        </w:rPr>
-        <w:t xml:space="preserve"> templates\core\client_detail.html</w:t>
-      </w:r>
-      <w:r>
-        <w:rPr>
-          <w:rStyle w:val="VerbatimChar"/>
-          <w:rFonts w:ascii="menlo" w:eastAsiaTheme="minorEastAsia" w:hAnsi="menlo" w:cs="menlo"/>
-          <w:color w:val="000000"/>
-          <w:sz w:val="18"/>
-          <w:lang w:eastAsia="zh-TW"/>
-        </w:rPr>
-        <w:br/>
-      </w:r>
-      <w:proofErr w:type="spellStart"/>
-      <w:r>
-        <w:rPr>
-          <w:rStyle w:val="VerbatimChar"/>
-          <w:rFonts w:ascii="menlo" w:eastAsia="menlo" w:hAnsi="menlo" w:cs="menlo"/>
-          <w:color w:val="000000"/>
-          <w:sz w:val="18"/>
-        </w:rPr>
-        <w:t>ni</w:t>
-      </w:r>
-      <w:proofErr w:type="spellEnd"/>
-      <w:r>
-        <w:rPr>
-          <w:rStyle w:val="VerbatimChar"/>
-          <w:rFonts w:ascii="menlo" w:eastAsia="menlo" w:hAnsi="menlo" w:cs="menlo"/>
-          <w:color w:val="000000"/>
-          <w:sz w:val="18"/>
-        </w:rPr>
-        <w:t xml:space="preserve"> templates\core\client_</w:t>
+        <w:t>ni templates\accounts\login.html</w:t>
+      </w:r>
+      <w:r>
+        <w:rPr>
+          <w:rStyle w:val="VerbatimChar"/>
+          <w:rFonts w:ascii="menlo" w:eastAsiaTheme="minorEastAsia" w:hAnsi="menlo" w:cs="menlo"/>
+          <w:color w:val="000000"/>
+          <w:sz w:val="18"/>
+          <w:lang w:eastAsia="zh-TW"/>
+        </w:rPr>
+        <w:br/>
+      </w:r>
+      <w:r>
+        <w:rPr>
+          <w:rStyle w:val="VerbatimChar"/>
+          <w:rFonts w:ascii="menlo" w:eastAsia="menlo" w:hAnsi="menlo" w:cs="menlo"/>
+          <w:color w:val="000000"/>
+          <w:sz w:val="18"/>
+        </w:rPr>
+        <w:t>ni templates\accounts\profile.html</w:t>
+      </w:r>
+      <w:r>
+        <w:rPr>
+          <w:rStyle w:val="VerbatimChar"/>
+          <w:rFonts w:ascii="menlo" w:eastAsiaTheme="minorEastAsia" w:hAnsi="menlo" w:cs="menlo"/>
+          <w:color w:val="000000"/>
+          <w:sz w:val="18"/>
+          <w:lang w:eastAsia="zh-TW"/>
+        </w:rPr>
+        <w:br/>
+      </w:r>
+      <w:r>
+        <w:rPr>
+          <w:rStyle w:val="VerbatimChar"/>
+          <w:rFonts w:ascii="menlo" w:eastAsia="menlo" w:hAnsi="menlo" w:cs="menlo"/>
+          <w:color w:val="000000"/>
+          <w:sz w:val="18"/>
+        </w:rPr>
+        <w:t>ni templates\core\clients.html</w:t>
+      </w:r>
+      <w:r>
+        <w:rPr>
+          <w:rStyle w:val="VerbatimChar"/>
+          <w:rFonts w:ascii="menlo" w:eastAsiaTheme="minorEastAsia" w:hAnsi="menlo" w:cs="menlo"/>
+          <w:color w:val="000000"/>
+          <w:sz w:val="18"/>
+          <w:lang w:eastAsia="zh-TW"/>
+        </w:rPr>
+        <w:br/>
+      </w:r>
+      <w:r>
+        <w:rPr>
+          <w:rStyle w:val="VerbatimChar"/>
+          <w:rFonts w:ascii="menlo" w:eastAsia="menlo" w:hAnsi="menlo" w:cs="menlo"/>
+          <w:color w:val="000000"/>
+          <w:sz w:val="18"/>
+        </w:rPr>
+        <w:t>ni templates\core\client_detail.html</w:t>
+      </w:r>
+      <w:r>
+        <w:rPr>
+          <w:rStyle w:val="VerbatimChar"/>
+          <w:rFonts w:ascii="menlo" w:eastAsiaTheme="minorEastAsia" w:hAnsi="menlo" w:cs="menlo"/>
+          <w:color w:val="000000"/>
+          <w:sz w:val="18"/>
+          <w:lang w:eastAsia="zh-TW"/>
+        </w:rPr>
+        <w:br/>
+      </w:r>
+      <w:r>
+        <w:rPr>
+          <w:rStyle w:val="VerbatimChar"/>
+          <w:rFonts w:ascii="menlo" w:eastAsia="menlo" w:hAnsi="menlo" w:cs="menlo"/>
+          <w:color w:val="000000"/>
+          <w:sz w:val="18"/>
+        </w:rPr>
+        <w:t>ni templates\core\client_</w:t>
       </w:r>
       <w:r>
         <w:rPr>
@@ -1238,55 +771,33 @@
         </w:rPr>
         <w:br/>
       </w:r>
-      <w:proofErr w:type="spellStart"/>
-      <w:r>
-        <w:rPr>
-          <w:rStyle w:val="VerbatimChar"/>
-          <w:rFonts w:ascii="menlo" w:eastAsia="menlo" w:hAnsi="menlo" w:cs="menlo"/>
-          <w:color w:val="000000"/>
-          <w:sz w:val="18"/>
-        </w:rPr>
-        <w:t>ni</w:t>
-      </w:r>
-      <w:proofErr w:type="spellEnd"/>
-      <w:r>
-        <w:rPr>
-          <w:rStyle w:val="VerbatimChar"/>
-          <w:rFonts w:ascii="menlo" w:eastAsia="menlo" w:hAnsi="menlo" w:cs="menlo"/>
-          <w:color w:val="000000"/>
-          <w:sz w:val="18"/>
-        </w:rPr>
-        <w:t xml:space="preserve"> templates\core\buildings.html</w:t>
-      </w:r>
-      <w:r>
-        <w:rPr>
-          <w:rStyle w:val="VerbatimChar"/>
-          <w:rFonts w:ascii="menlo" w:eastAsiaTheme="minorEastAsia" w:hAnsi="menlo" w:cs="menlo"/>
-          <w:color w:val="000000"/>
-          <w:sz w:val="18"/>
-          <w:lang w:eastAsia="zh-TW"/>
-        </w:rPr>
-        <w:br/>
-      </w:r>
-      <w:proofErr w:type="spellStart"/>
-      <w:r>
-        <w:rPr>
-          <w:rStyle w:val="VerbatimChar"/>
-          <w:rFonts w:ascii="menlo" w:eastAsia="menlo" w:hAnsi="menlo" w:cs="menlo"/>
-          <w:color w:val="000000"/>
-          <w:sz w:val="18"/>
-        </w:rPr>
-        <w:t>ni</w:t>
-      </w:r>
-      <w:proofErr w:type="spellEnd"/>
-      <w:r>
-        <w:rPr>
-          <w:rStyle w:val="VerbatimChar"/>
-          <w:rFonts w:ascii="menlo" w:eastAsia="menlo" w:hAnsi="menlo" w:cs="menlo"/>
-          <w:color w:val="000000"/>
-          <w:sz w:val="18"/>
-        </w:rPr>
-        <w:t xml:space="preserve"> templates\core\building</w:t>
+      <w:r>
+        <w:rPr>
+          <w:rStyle w:val="VerbatimChar"/>
+          <w:rFonts w:ascii="menlo" w:eastAsia="menlo" w:hAnsi="menlo" w:cs="menlo"/>
+          <w:color w:val="000000"/>
+          <w:sz w:val="18"/>
+        </w:rPr>
+        <w:t>ni templates\core\buildings.html</w:t>
+      </w:r>
+      <w:r>
+        <w:rPr>
+          <w:rStyle w:val="VerbatimChar"/>
+          <w:rFonts w:ascii="menlo" w:eastAsiaTheme="minorEastAsia" w:hAnsi="menlo" w:cs="menlo"/>
+          <w:color w:val="000000"/>
+          <w:sz w:val="18"/>
+          <w:lang w:eastAsia="zh-TW"/>
+        </w:rPr>
+        <w:br/>
+      </w:r>
+      <w:r>
+        <w:rPr>
+          <w:rStyle w:val="VerbatimChar"/>
+          <w:rFonts w:ascii="menlo" w:eastAsia="menlo" w:hAnsi="menlo" w:cs="menlo"/>
+          <w:color w:val="000000"/>
+          <w:sz w:val="18"/>
+        </w:rPr>
+        <w:t>ni templates\core\building</w:t>
       </w:r>
       <w:r>
         <w:rPr>
@@ -1317,26 +828,6 @@
         </w:rPr>
         <w:br/>
       </w:r>
-      <w:proofErr w:type="spellStart"/>
-      <w:r>
-        <w:rPr>
-          <w:rStyle w:val="VerbatimChar"/>
-          <w:rFonts w:ascii="menlo" w:eastAsia="menlo" w:hAnsi="menlo" w:cs="menlo"/>
-          <w:color w:val="000000"/>
-          <w:sz w:val="18"/>
-        </w:rPr>
-        <w:t>ni</w:t>
-      </w:r>
-      <w:proofErr w:type="spellEnd"/>
-      <w:r>
-        <w:rPr>
-          <w:rStyle w:val="VerbatimChar"/>
-          <w:rFonts w:ascii="menlo" w:eastAsia="menlo" w:hAnsi="menlo" w:cs="menlo"/>
-          <w:color w:val="000000"/>
-          <w:sz w:val="18"/>
-        </w:rPr>
-        <w:t xml:space="preserve"> templates\core\building</w:t>
-      </w:r>
       <w:r>
         <w:rPr>
           <w:rStyle w:val="VerbatimChar"/>
@@ -1345,6 +836,85 @@
           <w:sz w:val="18"/>
           <w:lang w:eastAsia="zh-TW"/>
         </w:rPr>
+        <w:t xml:space="preserve">ni </w:t>
+      </w:r>
+      <w:r>
+        <w:rPr>
+          <w:rStyle w:val="VerbatimChar"/>
+          <w:rFonts w:ascii="menlo" w:eastAsiaTheme="minorEastAsia" w:hAnsi="menlo" w:cs="menlo"/>
+          <w:color w:val="000000"/>
+          <w:sz w:val="18"/>
+          <w:lang w:eastAsia="zh-TW"/>
+        </w:rPr>
+        <w:t>templates</w:t>
+      </w:r>
+      <w:r>
+        <w:rPr>
+          <w:rStyle w:val="VerbatimChar"/>
+          <w:rFonts w:ascii="menlo" w:eastAsiaTheme="minorEastAsia" w:hAnsi="menlo" w:cs="menlo" w:hint="eastAsia"/>
+          <w:color w:val="000000"/>
+          <w:sz w:val="18"/>
+          <w:lang w:eastAsia="zh-TW"/>
+        </w:rPr>
+        <w:t>\</w:t>
+      </w:r>
+      <w:r>
+        <w:rPr>
+          <w:rStyle w:val="VerbatimChar"/>
+          <w:rFonts w:ascii="menlo" w:eastAsiaTheme="minorEastAsia" w:hAnsi="menlo" w:cs="menlo"/>
+          <w:color w:val="000000"/>
+          <w:sz w:val="18"/>
+          <w:lang w:eastAsia="zh-TW"/>
+        </w:rPr>
+        <w:t>core</w:t>
+      </w:r>
+      <w:r>
+        <w:rPr>
+          <w:rStyle w:val="VerbatimChar"/>
+          <w:rFonts w:ascii="menlo" w:eastAsiaTheme="minorEastAsia" w:hAnsi="menlo" w:cs="menlo" w:hint="eastAsia"/>
+          <w:color w:val="000000"/>
+          <w:sz w:val="18"/>
+          <w:lang w:eastAsia="zh-TW"/>
+        </w:rPr>
+        <w:t>\</w:t>
+      </w:r>
+      <w:r>
+        <w:rPr>
+          <w:rStyle w:val="VerbatimChar"/>
+          <w:rFonts w:ascii="menlo" w:eastAsiaTheme="minorEastAsia" w:hAnsi="menlo" w:cs="menlo"/>
+          <w:color w:val="000000"/>
+          <w:sz w:val="18"/>
+          <w:lang w:eastAsia="zh-TW"/>
+        </w:rPr>
+        <w:t>building_saved.html</w:t>
+      </w:r>
+      <w:r>
+        <w:rPr>
+          <w:rStyle w:val="VerbatimChar"/>
+          <w:rFonts w:ascii="menlo" w:eastAsiaTheme="minorEastAsia" w:hAnsi="menlo" w:cs="menlo"/>
+          <w:color w:val="000000"/>
+          <w:sz w:val="18"/>
+          <w:lang w:eastAsia="zh-TW"/>
+        </w:rPr>
+        <w:br/>
+      </w:r>
+      <w:r>
+        <w:rPr>
+          <w:rStyle w:val="VerbatimChar"/>
+          <w:rFonts w:ascii="menlo" w:eastAsia="menlo" w:hAnsi="menlo" w:cs="menlo"/>
+          <w:color w:val="000000"/>
+          <w:sz w:val="18"/>
+        </w:rPr>
+        <w:t>ni templates\core\building</w:t>
+      </w:r>
+      <w:r>
+        <w:rPr>
+          <w:rStyle w:val="VerbatimChar"/>
+          <w:rFonts w:ascii="menlo" w:eastAsiaTheme="minorEastAsia" w:hAnsi="menlo" w:cs="menlo" w:hint="eastAsia"/>
+          <w:color w:val="000000"/>
+          <w:sz w:val="18"/>
+          <w:lang w:eastAsia="zh-TW"/>
+        </w:rPr>
         <w:t>_report</w:t>
       </w:r>
       <w:r>
@@ -1366,55 +936,33 @@
         </w:rPr>
         <w:br/>
       </w:r>
-      <w:proofErr w:type="spellStart"/>
-      <w:r>
-        <w:rPr>
-          <w:rStyle w:val="VerbatimChar"/>
-          <w:rFonts w:ascii="menlo" w:eastAsia="menlo" w:hAnsi="menlo" w:cs="menlo"/>
-          <w:color w:val="000000"/>
-          <w:sz w:val="18"/>
-        </w:rPr>
-        <w:t>ni</w:t>
-      </w:r>
-      <w:proofErr w:type="spellEnd"/>
-      <w:r>
-        <w:rPr>
-          <w:rStyle w:val="VerbatimChar"/>
-          <w:rFonts w:ascii="menlo" w:eastAsia="menlo" w:hAnsi="menlo" w:cs="menlo"/>
-          <w:color w:val="000000"/>
-          <w:sz w:val="18"/>
-        </w:rPr>
-        <w:t xml:space="preserve"> templates\core\groups.html</w:t>
-      </w:r>
-      <w:r>
-        <w:rPr>
-          <w:rStyle w:val="VerbatimChar"/>
-          <w:rFonts w:ascii="menlo" w:eastAsiaTheme="minorEastAsia" w:hAnsi="menlo" w:cs="menlo"/>
-          <w:color w:val="000000"/>
-          <w:sz w:val="18"/>
-          <w:lang w:eastAsia="zh-TW"/>
-        </w:rPr>
-        <w:br/>
-      </w:r>
-      <w:proofErr w:type="spellStart"/>
-      <w:r>
-        <w:rPr>
-          <w:rStyle w:val="VerbatimChar"/>
-          <w:rFonts w:ascii="menlo" w:eastAsia="menlo" w:hAnsi="menlo" w:cs="menlo"/>
-          <w:color w:val="000000"/>
-          <w:sz w:val="18"/>
-        </w:rPr>
-        <w:t>ni</w:t>
-      </w:r>
-      <w:proofErr w:type="spellEnd"/>
-      <w:r>
-        <w:rPr>
-          <w:rStyle w:val="VerbatimChar"/>
-          <w:rFonts w:ascii="menlo" w:eastAsia="menlo" w:hAnsi="menlo" w:cs="menlo"/>
-          <w:color w:val="000000"/>
-          <w:sz w:val="18"/>
-        </w:rPr>
-        <w:t xml:space="preserve"> templates\core\group</w:t>
+      <w:r>
+        <w:rPr>
+          <w:rStyle w:val="VerbatimChar"/>
+          <w:rFonts w:ascii="menlo" w:eastAsia="menlo" w:hAnsi="menlo" w:cs="menlo"/>
+          <w:color w:val="000000"/>
+          <w:sz w:val="18"/>
+        </w:rPr>
+        <w:t>ni templates\core\groups.html</w:t>
+      </w:r>
+      <w:r>
+        <w:rPr>
+          <w:rStyle w:val="VerbatimChar"/>
+          <w:rFonts w:ascii="menlo" w:eastAsiaTheme="minorEastAsia" w:hAnsi="menlo" w:cs="menlo"/>
+          <w:color w:val="000000"/>
+          <w:sz w:val="18"/>
+          <w:lang w:eastAsia="zh-TW"/>
+        </w:rPr>
+        <w:br/>
+      </w:r>
+      <w:r>
+        <w:rPr>
+          <w:rStyle w:val="VerbatimChar"/>
+          <w:rFonts w:ascii="menlo" w:eastAsia="menlo" w:hAnsi="menlo" w:cs="menlo"/>
+          <w:color w:val="000000"/>
+          <w:sz w:val="18"/>
+        </w:rPr>
+        <w:t>ni templates\core\group</w:t>
       </w:r>
       <w:r>
         <w:rPr>
@@ -1445,25 +993,14 @@
         </w:rPr>
         <w:br/>
       </w:r>
-      <w:proofErr w:type="spellStart"/>
-      <w:r>
-        <w:rPr>
-          <w:rStyle w:val="VerbatimChar"/>
-          <w:rFonts w:ascii="menlo" w:eastAsia="menlo" w:hAnsi="menlo" w:cs="menlo"/>
-          <w:color w:val="000000"/>
-          <w:sz w:val="18"/>
-        </w:rPr>
-        <w:t>ni</w:t>
-      </w:r>
-      <w:proofErr w:type="spellEnd"/>
-      <w:r>
-        <w:rPr>
-          <w:rStyle w:val="VerbatimChar"/>
-          <w:rFonts w:ascii="menlo" w:eastAsia="menlo" w:hAnsi="menlo" w:cs="menlo"/>
-          <w:color w:val="000000"/>
-          <w:sz w:val="18"/>
-        </w:rPr>
-        <w:t xml:space="preserve"> templates\core\group</w:t>
+      <w:r>
+        <w:rPr>
+          <w:rStyle w:val="VerbatimChar"/>
+          <w:rFonts w:ascii="menlo" w:eastAsia="menlo" w:hAnsi="menlo" w:cs="menlo"/>
+          <w:color w:val="000000"/>
+          <w:sz w:val="18"/>
+        </w:rPr>
+        <w:t>ni templates\core\group</w:t>
       </w:r>
       <w:r>
         <w:rPr>
@@ -1494,25 +1031,14 @@
         </w:rPr>
         <w:br/>
       </w:r>
-      <w:proofErr w:type="spellStart"/>
-      <w:r>
-        <w:rPr>
-          <w:rStyle w:val="VerbatimChar"/>
-          <w:rFonts w:ascii="menlo" w:eastAsia="menlo" w:hAnsi="menlo" w:cs="menlo"/>
-          <w:color w:val="000000"/>
-          <w:sz w:val="18"/>
-        </w:rPr>
-        <w:t>ni</w:t>
-      </w:r>
-      <w:proofErr w:type="spellEnd"/>
-      <w:r>
-        <w:rPr>
-          <w:rStyle w:val="VerbatimChar"/>
-          <w:rFonts w:ascii="menlo" w:eastAsia="menlo" w:hAnsi="menlo" w:cs="menlo"/>
-          <w:color w:val="000000"/>
-          <w:sz w:val="18"/>
-        </w:rPr>
-        <w:t xml:space="preserve"> templates\core\group</w:t>
+      <w:r>
+        <w:rPr>
+          <w:rStyle w:val="VerbatimChar"/>
+          <w:rFonts w:ascii="menlo" w:eastAsia="menlo" w:hAnsi="menlo" w:cs="menlo"/>
+          <w:color w:val="000000"/>
+          <w:sz w:val="18"/>
+        </w:rPr>
+        <w:t>ni templates\core\group</w:t>
       </w:r>
       <w:r>
         <w:rPr>
@@ -1543,55 +1069,33 @@
         </w:rPr>
         <w:br/>
       </w:r>
-      <w:proofErr w:type="spellStart"/>
-      <w:r>
-        <w:rPr>
-          <w:rStyle w:val="VerbatimChar"/>
-          <w:rFonts w:ascii="menlo" w:eastAsia="menlo" w:hAnsi="menlo" w:cs="menlo"/>
-          <w:color w:val="000000"/>
-          <w:sz w:val="18"/>
-        </w:rPr>
-        <w:t>ni</w:t>
-      </w:r>
-      <w:proofErr w:type="spellEnd"/>
-      <w:r>
-        <w:rPr>
-          <w:rStyle w:val="VerbatimChar"/>
-          <w:rFonts w:ascii="menlo" w:eastAsia="menlo" w:hAnsi="menlo" w:cs="menlo"/>
-          <w:color w:val="000000"/>
-          <w:sz w:val="18"/>
-        </w:rPr>
-        <w:t xml:space="preserve"> templates\core\users.html</w:t>
-      </w:r>
-      <w:r>
-        <w:rPr>
-          <w:rStyle w:val="VerbatimChar"/>
-          <w:rFonts w:ascii="menlo" w:eastAsiaTheme="minorEastAsia" w:hAnsi="menlo" w:cs="menlo"/>
-          <w:color w:val="000000"/>
-          <w:sz w:val="18"/>
-          <w:lang w:eastAsia="zh-TW"/>
-        </w:rPr>
-        <w:br/>
-      </w:r>
-      <w:proofErr w:type="spellStart"/>
-      <w:r>
-        <w:rPr>
-          <w:rStyle w:val="VerbatimChar"/>
-          <w:rFonts w:ascii="menlo" w:eastAsia="menlo" w:hAnsi="menlo" w:cs="menlo"/>
-          <w:color w:val="000000"/>
-          <w:sz w:val="18"/>
-        </w:rPr>
-        <w:t>ni</w:t>
-      </w:r>
-      <w:proofErr w:type="spellEnd"/>
-      <w:r>
-        <w:rPr>
-          <w:rStyle w:val="VerbatimChar"/>
-          <w:rFonts w:ascii="menlo" w:eastAsia="menlo" w:hAnsi="menlo" w:cs="menlo"/>
-          <w:color w:val="000000"/>
-          <w:sz w:val="18"/>
-        </w:rPr>
-        <w:t xml:space="preserve"> templates\core\user</w:t>
+      <w:r>
+        <w:rPr>
+          <w:rStyle w:val="VerbatimChar"/>
+          <w:rFonts w:ascii="menlo" w:eastAsia="menlo" w:hAnsi="menlo" w:cs="menlo"/>
+          <w:color w:val="000000"/>
+          <w:sz w:val="18"/>
+        </w:rPr>
+        <w:t>ni templates\core\users.html</w:t>
+      </w:r>
+      <w:r>
+        <w:rPr>
+          <w:rStyle w:val="VerbatimChar"/>
+          <w:rFonts w:ascii="menlo" w:eastAsiaTheme="minorEastAsia" w:hAnsi="menlo" w:cs="menlo"/>
+          <w:color w:val="000000"/>
+          <w:sz w:val="18"/>
+          <w:lang w:eastAsia="zh-TW"/>
+        </w:rPr>
+        <w:br/>
+      </w:r>
+      <w:r>
+        <w:rPr>
+          <w:rStyle w:val="VerbatimChar"/>
+          <w:rFonts w:ascii="menlo" w:eastAsia="menlo" w:hAnsi="menlo" w:cs="menlo"/>
+          <w:color w:val="000000"/>
+          <w:sz w:val="18"/>
+        </w:rPr>
+        <w:t>ni templates\core\user</w:t>
       </w:r>
       <w:r>
         <w:rPr>
@@ -1632,95 +1136,33 @@
         </w:rPr>
         <w:br/>
       </w:r>
-      <w:proofErr w:type="spellStart"/>
-      <w:r>
-        <w:rPr>
-          <w:rStyle w:val="VerbatimChar"/>
-          <w:rFonts w:ascii="menlo" w:eastAsia="menlo" w:hAnsi="menlo" w:cs="menlo"/>
-          <w:color w:val="000000"/>
-          <w:sz w:val="18"/>
-        </w:rPr>
-        <w:t>ni</w:t>
-      </w:r>
-      <w:proofErr w:type="spellEnd"/>
-      <w:r>
-        <w:rPr>
-          <w:rStyle w:val="VerbatimChar"/>
-          <w:rFonts w:ascii="menlo" w:eastAsia="menlo" w:hAnsi="menlo" w:cs="menlo"/>
-          <w:color w:val="000000"/>
-          <w:sz w:val="18"/>
-        </w:rPr>
-        <w:t xml:space="preserve"> static\</w:t>
-      </w:r>
-      <w:proofErr w:type="spellStart"/>
-      <w:r>
-        <w:rPr>
-          <w:rStyle w:val="VerbatimChar"/>
-          <w:rFonts w:ascii="menlo" w:eastAsia="menlo" w:hAnsi="menlo" w:cs="menlo"/>
-          <w:color w:val="000000"/>
-          <w:sz w:val="18"/>
-        </w:rPr>
-        <w:t>css</w:t>
-      </w:r>
-      <w:proofErr w:type="spellEnd"/>
-      <w:r>
-        <w:rPr>
-          <w:rStyle w:val="VerbatimChar"/>
-          <w:rFonts w:ascii="menlo" w:eastAsia="menlo" w:hAnsi="menlo" w:cs="menlo"/>
-          <w:color w:val="000000"/>
-          <w:sz w:val="18"/>
-        </w:rPr>
-        <w:t>\app.css</w:t>
-      </w:r>
-      <w:r>
-        <w:rPr>
-          <w:rStyle w:val="VerbatimChar"/>
-          <w:rFonts w:ascii="menlo" w:eastAsiaTheme="minorEastAsia" w:hAnsi="menlo" w:cs="menlo"/>
-          <w:color w:val="000000"/>
-          <w:sz w:val="18"/>
-          <w:lang w:eastAsia="zh-TW"/>
-        </w:rPr>
-        <w:br/>
-      </w:r>
-      <w:proofErr w:type="spellStart"/>
-      <w:r>
-        <w:rPr>
-          <w:rStyle w:val="VerbatimChar"/>
-          <w:rFonts w:ascii="menlo" w:eastAsia="menlo" w:hAnsi="menlo" w:cs="menlo"/>
-          <w:color w:val="000000"/>
-          <w:sz w:val="18"/>
-        </w:rPr>
-        <w:t>ni</w:t>
-      </w:r>
-      <w:proofErr w:type="spellEnd"/>
-      <w:r>
-        <w:rPr>
-          <w:rStyle w:val="VerbatimChar"/>
-          <w:rFonts w:ascii="menlo" w:eastAsia="menlo" w:hAnsi="menlo" w:cs="menlo"/>
-          <w:color w:val="000000"/>
-          <w:sz w:val="18"/>
-        </w:rPr>
-        <w:t xml:space="preserve"> static\</w:t>
-      </w:r>
-      <w:proofErr w:type="spellStart"/>
-      <w:r>
-        <w:rPr>
-          <w:rStyle w:val="VerbatimChar"/>
-          <w:rFonts w:ascii="menlo" w:eastAsia="menlo" w:hAnsi="menlo" w:cs="menlo"/>
-          <w:color w:val="000000"/>
-          <w:sz w:val="18"/>
-        </w:rPr>
-        <w:t>js</w:t>
-      </w:r>
-      <w:proofErr w:type="spellEnd"/>
-      <w:r>
-        <w:rPr>
-          <w:rStyle w:val="VerbatimChar"/>
-          <w:rFonts w:ascii="menlo" w:eastAsia="menlo" w:hAnsi="menlo" w:cs="menlo"/>
-          <w:color w:val="000000"/>
-          <w:sz w:val="18"/>
-        </w:rPr>
-        <w:t>\app.js</w:t>
+      <w:r>
+        <w:rPr>
+          <w:rStyle w:val="VerbatimChar"/>
+          <w:rFonts w:ascii="menlo" w:eastAsia="menlo" w:hAnsi="menlo" w:cs="menlo"/>
+          <w:color w:val="000000"/>
+          <w:sz w:val="18"/>
+        </w:rPr>
+        <w:t>ni static\css\app.css</w:t>
+      </w:r>
+      <w:r>
+        <w:rPr>
+          <w:rStyle w:val="VerbatimChar"/>
+          <w:rFonts w:ascii="menlo" w:eastAsiaTheme="minorEastAsia" w:hAnsi="menlo" w:cs="menlo"/>
+          <w:color w:val="000000"/>
+          <w:sz w:val="18"/>
+          <w:lang w:eastAsia="zh-TW"/>
+        </w:rPr>
+        <w:br/>
+      </w:r>
+      <w:r>
+        <w:rPr>
+          <w:rStyle w:val="VerbatimChar"/>
+          <w:rFonts w:ascii="menlo" w:eastAsia="menlo" w:hAnsi="menlo" w:cs="menlo"/>
+          <w:color w:val="000000"/>
+          <w:sz w:val="18"/>
+        </w:rPr>
+        <w:t>ni static\js\app.js</w:t>
       </w:r>
       <w:r>
         <w:rPr>
@@ -1753,7 +1195,7 @@
         <w:shd w:val="clear" w:color="auto" w:fill="F8F8FA"/>
         <w:spacing w:line="336" w:lineRule="auto"/>
         <w:rPr>
-          <w:rFonts w:eastAsiaTheme="minorEastAsia" w:hint="eastAsia"/>
+          <w:rFonts w:eastAsiaTheme="minorEastAsia"/>
           <w:lang w:eastAsia="zh-TW"/>
         </w:rPr>
       </w:pPr>
@@ -1764,27 +1206,7 @@
           <w:color w:val="000000"/>
           <w:sz w:val="18"/>
         </w:rPr>
-        <w:t>Django&gt;=5.</w:t>
-      </w:r>
-      <w:proofErr w:type="gramStart"/>
-      <w:r>
-        <w:rPr>
-          <w:rStyle w:val="VerbatimChar"/>
-          <w:rFonts w:ascii="menlo" w:eastAsia="menlo" w:hAnsi="menlo" w:cs="menlo"/>
-          <w:color w:val="000000"/>
-          <w:sz w:val="18"/>
-        </w:rPr>
-        <w:t>1,&lt;</w:t>
-      </w:r>
-      <w:proofErr w:type="gramEnd"/>
-      <w:r>
-        <w:rPr>
-          <w:rStyle w:val="VerbatimChar"/>
-          <w:rFonts w:ascii="menlo" w:eastAsia="menlo" w:hAnsi="menlo" w:cs="menlo"/>
-          <w:color w:val="000000"/>
-          <w:sz w:val="18"/>
-        </w:rPr>
-        <w:t>6.0</w:t>
+        <w:t>Django&gt;=5.1,&lt;6.0</w:t>
       </w:r>
       <w:r>
         <w:rPr>
@@ -1804,27 +1226,7 @@
           <w:sz w:val="18"/>
         </w:rPr>
         <w:br/>
-        <w:t>python-</w:t>
-      </w:r>
-      <w:proofErr w:type="spellStart"/>
-      <w:r>
-        <w:rPr>
-          <w:rStyle w:val="VerbatimChar"/>
-          <w:rFonts w:ascii="menlo" w:eastAsia="menlo" w:hAnsi="menlo" w:cs="menlo"/>
-          <w:color w:val="000000"/>
-          <w:sz w:val="18"/>
-        </w:rPr>
-        <w:t>dotenv</w:t>
-      </w:r>
-      <w:proofErr w:type="spellEnd"/>
-      <w:r>
-        <w:rPr>
-          <w:rStyle w:val="VerbatimChar"/>
-          <w:rFonts w:ascii="menlo" w:eastAsia="menlo" w:hAnsi="menlo" w:cs="menlo"/>
-          <w:color w:val="000000"/>
-          <w:sz w:val="18"/>
-        </w:rPr>
-        <w:t>&gt;=1.0</w:t>
+        <w:t>python-dotenv&gt;=1.0</w:t>
       </w:r>
       <w:r>
         <w:rPr>
@@ -1844,6 +1246,25 @@
           <w:sz w:val="18"/>
         </w:rPr>
         <w:t>pillow==12.3.0</w:t>
+      </w:r>
+      <w:r>
+        <w:rPr>
+          <w:rStyle w:val="VerbatimChar"/>
+          <w:rFonts w:ascii="menlo" w:eastAsiaTheme="minorEastAsia" w:hAnsi="menlo" w:cs="menlo"/>
+          <w:color w:val="000000"/>
+          <w:sz w:val="18"/>
+          <w:lang w:eastAsia="zh-TW"/>
+        </w:rPr>
+        <w:br/>
+      </w:r>
+      <w:r>
+        <w:rPr>
+          <w:rStyle w:val="VerbatimChar"/>
+          <w:rFonts w:ascii="menlo" w:eastAsia="menlo" w:hAnsi="menlo" w:cs="menlo"/>
+          <w:color w:val="000000"/>
+          <w:sz w:val="18"/>
+        </w:rPr>
+        <w:t>requests==2.34.2</w:t>
       </w:r>
       <w:r>
         <w:rPr>
@@ -1881,27 +1302,7 @@
           <w:color w:val="000000"/>
           <w:sz w:val="18"/>
         </w:rPr>
-        <w:t xml:space="preserve">python manage.py </w:t>
-      </w:r>
-      <w:proofErr w:type="spellStart"/>
-      <w:r>
-        <w:rPr>
-          <w:rStyle w:val="VerbatimChar"/>
-          <w:rFonts w:ascii="menlo" w:eastAsia="menlo" w:hAnsi="menlo" w:cs="menlo"/>
-          <w:color w:val="000000"/>
-          <w:sz w:val="18"/>
-        </w:rPr>
-        <w:t>makemigrations</w:t>
-      </w:r>
-      <w:proofErr w:type="spellEnd"/>
-      <w:r>
-        <w:rPr>
-          <w:rStyle w:val="VerbatimChar"/>
-          <w:rFonts w:ascii="menlo" w:eastAsia="menlo" w:hAnsi="menlo" w:cs="menlo"/>
-          <w:color w:val="000000"/>
-          <w:sz w:val="18"/>
-        </w:rPr>
-        <w:t xml:space="preserve"> accounts core</w:t>
+        <w:t>python manage.py makemigrations accounts core</w:t>
       </w:r>
       <w:r>
         <w:rPr>
@@ -1921,40 +1322,18 @@
           <w:sz w:val="18"/>
         </w:rPr>
         <w:br/>
-        <w:t xml:space="preserve">python manage.py </w:t>
-      </w:r>
-      <w:proofErr w:type="spellStart"/>
-      <w:r>
-        <w:rPr>
-          <w:rStyle w:val="VerbatimChar"/>
-          <w:rFonts w:ascii="menlo" w:eastAsia="menlo" w:hAnsi="menlo" w:cs="menlo"/>
-          <w:color w:val="000000"/>
-          <w:sz w:val="18"/>
-        </w:rPr>
-        <w:t>createsuperuser</w:t>
-      </w:r>
-      <w:proofErr w:type="spellEnd"/>
-      <w:r>
-        <w:rPr>
-          <w:rStyle w:val="VerbatimChar"/>
-          <w:rFonts w:ascii="menlo" w:eastAsia="menlo" w:hAnsi="menlo" w:cs="menlo"/>
-          <w:color w:val="000000"/>
-          <w:sz w:val="18"/>
-        </w:rPr>
-        <w:br/>
-        <w:t xml:space="preserve">python manage.py </w:t>
-      </w:r>
-      <w:proofErr w:type="spellStart"/>
-      <w:r>
-        <w:rPr>
-          <w:rStyle w:val="VerbatimChar"/>
-          <w:rFonts w:ascii="menlo" w:eastAsia="menlo" w:hAnsi="menlo" w:cs="menlo"/>
-          <w:color w:val="000000"/>
-          <w:sz w:val="18"/>
-        </w:rPr>
-        <w:t>runserver</w:t>
-      </w:r>
-      <w:proofErr w:type="spellEnd"/>
+        <w:t>python manage.py createsuperuser</w:t>
+      </w:r>
+      <w:r>
+        <w:rPr>
+          <w:rStyle w:val="VerbatimChar"/>
+          <w:rFonts w:ascii="menlo" w:eastAsia="menlo" w:hAnsi="menlo" w:cs="menlo"/>
+          <w:color w:val="000000"/>
+          <w:sz w:val="18"/>
+        </w:rPr>
+        <w:br/>
+        <w:t>python manage.py runserver</w:t>
+      </w:r>
       <w:r>
         <w:rPr>
           <w:rStyle w:val="VerbatimChar"/>

</xml_diff>

<commit_message>
Updated Client Tag for client-building linkage
</commit_message>
<xml_diff>
--- a/Keep_Docs/Run_Server.docx
+++ b/Keep_Docs/Run_Server.docx
@@ -74,7 +74,23 @@
           <w:rFonts w:ascii="source serif 4" w:eastAsia="source serif 4" w:hAnsi="source serif 4" w:cs="source serif 4"/>
           <w:color w:val="000000"/>
         </w:rPr>
-        <w:t>For Windows PowerShell, this is a simple setup flow using Django, PostgreSQL driver, and dotenv support. Django’s admin site already gives you the kind of administration screen shown in your second image, and you can extend it with custom model admin classes.</w:t>
+        <w:t xml:space="preserve">For Windows PowerShell, this is a simple setup flow using Django, PostgreSQL driver, and </w:t>
+      </w:r>
+      <w:proofErr w:type="spellStart"/>
+      <w:r>
+        <w:rPr>
+          <w:rFonts w:ascii="source serif 4" w:eastAsia="source serif 4" w:hAnsi="source serif 4" w:cs="source serif 4"/>
+          <w:color w:val="000000"/>
+        </w:rPr>
+        <w:t>dotenv</w:t>
+      </w:r>
+      <w:proofErr w:type="spellEnd"/>
+      <w:r>
+        <w:rPr>
+          <w:rFonts w:ascii="source serif 4" w:eastAsia="source serif 4" w:hAnsi="source serif 4" w:cs="source serif 4"/>
+          <w:color w:val="000000"/>
+        </w:rPr>
+        <w:t xml:space="preserve"> support. Django’s admin site already gives you the kind of administration screen shown in your second image, and you can extend it with custom model admin classes.</w:t>
       </w:r>
       <w:bookmarkStart w:id="1" w:name="fnref2_5"/>
       <w:bookmarkEnd w:id="1"/>
@@ -110,80 +126,186 @@
           <w:sz w:val="18"/>
         </w:rPr>
       </w:pPr>
-      <w:r>
-        <w:rPr>
-          <w:rStyle w:val="VerbatimChar"/>
-          <w:rFonts w:ascii="menlo" w:eastAsia="menlo" w:hAnsi="menlo" w:cs="menlo"/>
-          <w:color w:val="000000"/>
-          <w:sz w:val="18"/>
-        </w:rPr>
-        <w:t>mkdir myportal</w:t>
-      </w:r>
-      <w:r>
-        <w:rPr>
-          <w:rStyle w:val="VerbatimChar"/>
-          <w:rFonts w:ascii="menlo" w:eastAsia="menlo" w:hAnsi="menlo" w:cs="menlo"/>
-          <w:color w:val="000000"/>
-          <w:sz w:val="18"/>
-        </w:rPr>
-        <w:br/>
-      </w:r>
-      <w:r>
-        <w:rPr>
-          <w:rStyle w:val="VerbatimChar"/>
-          <w:rFonts w:ascii="menlo" w:eastAsia="menlo" w:hAnsi="menlo" w:cs="menlo"/>
-          <w:color w:val="000000"/>
-          <w:sz w:val="18"/>
-        </w:rPr>
-        <w:br/>
-      </w:r>
-      <w:r>
-        <w:rPr>
-          <w:rStyle w:val="VerbatimChar"/>
-          <w:rFonts w:ascii="menlo" w:eastAsia="menlo" w:hAnsi="menlo" w:cs="menlo"/>
-          <w:color w:val="000000"/>
-          <w:sz w:val="18"/>
-        </w:rPr>
-        <w:t>cd myportal</w:t>
-      </w:r>
-      <w:r>
-        <w:rPr>
-          <w:rStyle w:val="VerbatimChar"/>
-          <w:rFonts w:ascii="menlo" w:eastAsia="menlo" w:hAnsi="menlo" w:cs="menlo"/>
-          <w:color w:val="000000"/>
-          <w:sz w:val="18"/>
-        </w:rPr>
-        <w:br/>
-        <w:t>python -m venv .venv</w:t>
-      </w:r>
-      <w:r>
-        <w:rPr>
-          <w:rStyle w:val="VerbatimChar"/>
-          <w:rFonts w:ascii="menlo" w:eastAsia="menlo" w:hAnsi="menlo" w:cs="menlo"/>
-          <w:color w:val="000000"/>
-          <w:sz w:val="18"/>
-        </w:rPr>
-        <w:br/>
-        <w:t>.venv\Scripts\activate</w:t>
-      </w:r>
-      <w:r>
-        <w:rPr>
-          <w:rStyle w:val="VerbatimChar"/>
-          <w:rFonts w:ascii="menlo" w:eastAsia="menlo" w:hAnsi="menlo" w:cs="menlo"/>
-          <w:color w:val="000000"/>
-          <w:sz w:val="18"/>
-        </w:rPr>
-        <w:br/>
-      </w:r>
-      <w:r>
-        <w:rPr>
-          <w:rStyle w:val="VerbatimChar"/>
-          <w:rFonts w:ascii="menlo" w:eastAsia="menlo" w:hAnsi="menlo" w:cs="menlo"/>
-          <w:color w:val="000000"/>
-          <w:sz w:val="18"/>
-        </w:rPr>
-        <w:br/>
-        <w:t xml:space="preserve">pip install django </w:t>
+      <w:proofErr w:type="spellStart"/>
+      <w:r>
+        <w:rPr>
+          <w:rStyle w:val="VerbatimChar"/>
+          <w:rFonts w:ascii="menlo" w:eastAsia="menlo" w:hAnsi="menlo" w:cs="menlo"/>
+          <w:color w:val="000000"/>
+          <w:sz w:val="18"/>
+        </w:rPr>
+        <w:t>mkdir</w:t>
+      </w:r>
+      <w:proofErr w:type="spellEnd"/>
+      <w:r>
+        <w:rPr>
+          <w:rStyle w:val="VerbatimChar"/>
+          <w:rFonts w:ascii="menlo" w:eastAsia="menlo" w:hAnsi="menlo" w:cs="menlo"/>
+          <w:color w:val="000000"/>
+          <w:sz w:val="18"/>
+        </w:rPr>
+        <w:t xml:space="preserve"> </w:t>
+      </w:r>
+      <w:proofErr w:type="spellStart"/>
+      <w:r>
+        <w:rPr>
+          <w:rStyle w:val="VerbatimChar"/>
+          <w:rFonts w:ascii="menlo" w:eastAsia="menlo" w:hAnsi="menlo" w:cs="menlo"/>
+          <w:color w:val="000000"/>
+          <w:sz w:val="18"/>
+        </w:rPr>
+        <w:t>myportal</w:t>
+      </w:r>
+      <w:proofErr w:type="spellEnd"/>
+      <w:r>
+        <w:rPr>
+          <w:rStyle w:val="VerbatimChar"/>
+          <w:rFonts w:ascii="menlo" w:eastAsia="menlo" w:hAnsi="menlo" w:cs="menlo"/>
+          <w:color w:val="000000"/>
+          <w:sz w:val="18"/>
+        </w:rPr>
+        <w:br/>
+      </w:r>
+      <w:r>
+        <w:rPr>
+          <w:rStyle w:val="VerbatimChar"/>
+          <w:rFonts w:ascii="menlo" w:eastAsia="menlo" w:hAnsi="menlo" w:cs="menlo"/>
+          <w:color w:val="000000"/>
+          <w:sz w:val="18"/>
+        </w:rPr>
+        <w:br/>
+      </w:r>
+      <w:r>
+        <w:rPr>
+          <w:rStyle w:val="VerbatimChar"/>
+          <w:rFonts w:ascii="menlo" w:eastAsia="menlo" w:hAnsi="menlo" w:cs="menlo"/>
+          <w:color w:val="000000"/>
+          <w:sz w:val="18"/>
+        </w:rPr>
+        <w:t xml:space="preserve">cd </w:t>
+      </w:r>
+      <w:proofErr w:type="spellStart"/>
+      <w:r>
+        <w:rPr>
+          <w:rStyle w:val="VerbatimChar"/>
+          <w:rFonts w:ascii="menlo" w:eastAsia="menlo" w:hAnsi="menlo" w:cs="menlo"/>
+          <w:color w:val="000000"/>
+          <w:sz w:val="18"/>
+        </w:rPr>
+        <w:t>myportal</w:t>
+      </w:r>
+      <w:proofErr w:type="spellEnd"/>
+      <w:r>
+        <w:rPr>
+          <w:rStyle w:val="VerbatimChar"/>
+          <w:rFonts w:ascii="menlo" w:eastAsia="menlo" w:hAnsi="menlo" w:cs="menlo"/>
+          <w:color w:val="000000"/>
+          <w:sz w:val="18"/>
+        </w:rPr>
+        <w:br/>
+        <w:t xml:space="preserve">python -m </w:t>
+      </w:r>
+      <w:proofErr w:type="spellStart"/>
+      <w:proofErr w:type="gramStart"/>
+      <w:r>
+        <w:rPr>
+          <w:rStyle w:val="VerbatimChar"/>
+          <w:rFonts w:ascii="menlo" w:eastAsia="menlo" w:hAnsi="menlo" w:cs="menlo"/>
+          <w:color w:val="000000"/>
+          <w:sz w:val="18"/>
+        </w:rPr>
+        <w:t>venv</w:t>
+      </w:r>
+      <w:proofErr w:type="spellEnd"/>
+      <w:r>
+        <w:rPr>
+          <w:rStyle w:val="VerbatimChar"/>
+          <w:rFonts w:ascii="menlo" w:eastAsia="menlo" w:hAnsi="menlo" w:cs="menlo"/>
+          <w:color w:val="000000"/>
+          <w:sz w:val="18"/>
+        </w:rPr>
+        <w:t xml:space="preserve"> .</w:t>
+      </w:r>
+      <w:proofErr w:type="spellStart"/>
+      <w:r>
+        <w:rPr>
+          <w:rStyle w:val="VerbatimChar"/>
+          <w:rFonts w:ascii="menlo" w:eastAsia="menlo" w:hAnsi="menlo" w:cs="menlo"/>
+          <w:color w:val="000000"/>
+          <w:sz w:val="18"/>
+        </w:rPr>
+        <w:t>venv</w:t>
+      </w:r>
+      <w:proofErr w:type="spellEnd"/>
+      <w:proofErr w:type="gramEnd"/>
+      <w:r>
+        <w:rPr>
+          <w:rStyle w:val="VerbatimChar"/>
+          <w:rFonts w:ascii="menlo" w:eastAsia="menlo" w:hAnsi="menlo" w:cs="menlo"/>
+          <w:color w:val="000000"/>
+          <w:sz w:val="18"/>
+        </w:rPr>
+        <w:br/>
+        <w:t>.</w:t>
+      </w:r>
+      <w:proofErr w:type="spellStart"/>
+      <w:r>
+        <w:rPr>
+          <w:rStyle w:val="VerbatimChar"/>
+          <w:rFonts w:ascii="menlo" w:eastAsia="menlo" w:hAnsi="menlo" w:cs="menlo"/>
+          <w:color w:val="000000"/>
+          <w:sz w:val="18"/>
+        </w:rPr>
+        <w:t>venv</w:t>
+      </w:r>
+      <w:proofErr w:type="spellEnd"/>
+      <w:r>
+        <w:rPr>
+          <w:rStyle w:val="VerbatimChar"/>
+          <w:rFonts w:ascii="menlo" w:eastAsia="menlo" w:hAnsi="menlo" w:cs="menlo"/>
+          <w:color w:val="000000"/>
+          <w:sz w:val="18"/>
+        </w:rPr>
+        <w:t>\Scripts\activate</w:t>
+      </w:r>
+      <w:r>
+        <w:rPr>
+          <w:rStyle w:val="VerbatimChar"/>
+          <w:rFonts w:ascii="menlo" w:eastAsia="menlo" w:hAnsi="menlo" w:cs="menlo"/>
+          <w:color w:val="000000"/>
+          <w:sz w:val="18"/>
+        </w:rPr>
+        <w:br/>
+      </w:r>
+      <w:r>
+        <w:rPr>
+          <w:rStyle w:val="VerbatimChar"/>
+          <w:rFonts w:ascii="menlo" w:eastAsia="menlo" w:hAnsi="menlo" w:cs="menlo"/>
+          <w:color w:val="000000"/>
+          <w:sz w:val="18"/>
+        </w:rPr>
+        <w:br/>
+        <w:t xml:space="preserve">pip install </w:t>
+      </w:r>
+      <w:proofErr w:type="spellStart"/>
+      <w:r>
+        <w:rPr>
+          <w:rStyle w:val="VerbatimChar"/>
+          <w:rFonts w:ascii="menlo" w:eastAsia="menlo" w:hAnsi="menlo" w:cs="menlo"/>
+          <w:color w:val="000000"/>
+          <w:sz w:val="18"/>
+        </w:rPr>
+        <w:t>django</w:t>
+      </w:r>
+      <w:proofErr w:type="spellEnd"/>
+      <w:r>
+        <w:rPr>
+          <w:rStyle w:val="VerbatimChar"/>
+          <w:rFonts w:ascii="menlo" w:eastAsia="menlo" w:hAnsi="menlo" w:cs="menlo"/>
+          <w:color w:val="000000"/>
+          <w:sz w:val="18"/>
+        </w:rPr>
+        <w:t xml:space="preserve"> </w:t>
       </w:r>
       <w:r>
         <w:rPr>
@@ -209,8 +331,19 @@
           <w:color w:val="000000"/>
           <w:sz w:val="18"/>
         </w:rPr>
-        <w:t>python-dotenv</w:t>
-      </w:r>
+        <w:t>python-</w:t>
+      </w:r>
+      <w:proofErr w:type="spellStart"/>
+      <w:r>
+        <w:rPr>
+          <w:rStyle w:val="VerbatimChar"/>
+          <w:rFonts w:ascii="menlo" w:eastAsia="menlo" w:hAnsi="menlo" w:cs="menlo"/>
+          <w:color w:val="000000"/>
+          <w:sz w:val="18"/>
+        </w:rPr>
+        <w:t>dotenv</w:t>
+      </w:r>
+      <w:proofErr w:type="spellEnd"/>
       <w:r>
         <w:rPr>
           <w:rStyle w:val="VerbatimChar"/>
@@ -267,27 +400,117 @@
           <w:sz w:val="18"/>
         </w:rPr>
         <w:br/>
-        <w:t>django-admin startproject config .</w:t>
-      </w:r>
-      <w:r>
-        <w:rPr>
-          <w:rStyle w:val="VerbatimChar"/>
-          <w:rFonts w:ascii="menlo" w:eastAsia="menlo" w:hAnsi="menlo" w:cs="menlo"/>
-          <w:color w:val="000000"/>
-          <w:sz w:val="18"/>
-        </w:rPr>
-        <w:br/>
-        <w:t>python manage.py startapp accounts</w:t>
-      </w:r>
-      <w:r>
-        <w:rPr>
-          <w:rStyle w:val="VerbatimChar"/>
-          <w:rFonts w:ascii="menlo" w:eastAsia="menlo" w:hAnsi="menlo" w:cs="menlo"/>
-          <w:color w:val="000000"/>
-          <w:sz w:val="18"/>
-        </w:rPr>
-        <w:br/>
-        <w:t>python manage.py startapp core</w:t>
+      </w:r>
+      <w:proofErr w:type="spellStart"/>
+      <w:r>
+        <w:rPr>
+          <w:rStyle w:val="VerbatimChar"/>
+          <w:rFonts w:ascii="menlo" w:eastAsia="menlo" w:hAnsi="menlo" w:cs="menlo"/>
+          <w:color w:val="000000"/>
+          <w:sz w:val="18"/>
+        </w:rPr>
+        <w:t>django</w:t>
+      </w:r>
+      <w:proofErr w:type="spellEnd"/>
+      <w:r>
+        <w:rPr>
+          <w:rStyle w:val="VerbatimChar"/>
+          <w:rFonts w:ascii="menlo" w:eastAsia="menlo" w:hAnsi="menlo" w:cs="menlo"/>
+          <w:color w:val="000000"/>
+          <w:sz w:val="18"/>
+        </w:rPr>
+        <w:t xml:space="preserve">-admin </w:t>
+      </w:r>
+      <w:proofErr w:type="spellStart"/>
+      <w:r>
+        <w:rPr>
+          <w:rStyle w:val="VerbatimChar"/>
+          <w:rFonts w:ascii="menlo" w:eastAsia="menlo" w:hAnsi="menlo" w:cs="menlo"/>
+          <w:color w:val="000000"/>
+          <w:sz w:val="18"/>
+        </w:rPr>
+        <w:t>startproject</w:t>
+      </w:r>
+      <w:proofErr w:type="spellEnd"/>
+      <w:r>
+        <w:rPr>
+          <w:rStyle w:val="VerbatimChar"/>
+          <w:rFonts w:ascii="menlo" w:eastAsia="menlo" w:hAnsi="menlo" w:cs="menlo"/>
+          <w:color w:val="000000"/>
+          <w:sz w:val="18"/>
+        </w:rPr>
+        <w:t xml:space="preserve"> </w:t>
+      </w:r>
+      <w:proofErr w:type="gramStart"/>
+      <w:r>
+        <w:rPr>
+          <w:rStyle w:val="VerbatimChar"/>
+          <w:rFonts w:ascii="menlo" w:eastAsia="menlo" w:hAnsi="menlo" w:cs="menlo"/>
+          <w:color w:val="000000"/>
+          <w:sz w:val="18"/>
+        </w:rPr>
+        <w:t>config .</w:t>
+      </w:r>
+      <w:proofErr w:type="gramEnd"/>
+      <w:r>
+        <w:rPr>
+          <w:rStyle w:val="VerbatimChar"/>
+          <w:rFonts w:ascii="menlo" w:eastAsia="menlo" w:hAnsi="menlo" w:cs="menlo"/>
+          <w:color w:val="000000"/>
+          <w:sz w:val="18"/>
+        </w:rPr>
+        <w:br/>
+        <w:t xml:space="preserve">python manage.py </w:t>
+      </w:r>
+      <w:proofErr w:type="spellStart"/>
+      <w:r>
+        <w:rPr>
+          <w:rStyle w:val="VerbatimChar"/>
+          <w:rFonts w:ascii="menlo" w:eastAsia="menlo" w:hAnsi="menlo" w:cs="menlo"/>
+          <w:color w:val="000000"/>
+          <w:sz w:val="18"/>
+        </w:rPr>
+        <w:t>startapp</w:t>
+      </w:r>
+      <w:proofErr w:type="spellEnd"/>
+      <w:r>
+        <w:rPr>
+          <w:rStyle w:val="VerbatimChar"/>
+          <w:rFonts w:ascii="menlo" w:eastAsia="menlo" w:hAnsi="menlo" w:cs="menlo"/>
+          <w:color w:val="000000"/>
+          <w:sz w:val="18"/>
+        </w:rPr>
+        <w:t xml:space="preserve"> accounts</w:t>
+      </w:r>
+      <w:r>
+        <w:rPr>
+          <w:rStyle w:val="VerbatimChar"/>
+          <w:rFonts w:ascii="menlo" w:eastAsia="menlo" w:hAnsi="menlo" w:cs="menlo"/>
+          <w:color w:val="000000"/>
+          <w:sz w:val="18"/>
+        </w:rPr>
+        <w:br/>
+        <w:t xml:space="preserve">python manage.py </w:t>
+      </w:r>
+      <w:proofErr w:type="spellStart"/>
+      <w:r>
+        <w:rPr>
+          <w:rStyle w:val="VerbatimChar"/>
+          <w:rFonts w:ascii="menlo" w:eastAsia="menlo" w:hAnsi="menlo" w:cs="menlo"/>
+          <w:color w:val="000000"/>
+          <w:sz w:val="18"/>
+        </w:rPr>
+        <w:t>startapp</w:t>
+      </w:r>
+      <w:proofErr w:type="spellEnd"/>
+      <w:r>
+        <w:rPr>
+          <w:rStyle w:val="VerbatimChar"/>
+          <w:rFonts w:ascii="menlo" w:eastAsia="menlo" w:hAnsi="menlo" w:cs="menlo"/>
+          <w:color w:val="000000"/>
+          <w:sz w:val="18"/>
+        </w:rPr>
+        <w:t xml:space="preserve"> core</w:t>
       </w:r>
       <w:r>
         <w:rPr>
@@ -305,129 +528,97 @@
         </w:rPr>
         <w:br/>
       </w:r>
-      <w:r>
-        <w:rPr>
-          <w:rStyle w:val="VerbatimChar"/>
-          <w:rFonts w:ascii="menlo" w:eastAsia="menlo" w:hAnsi="menlo" w:cs="menlo"/>
-          <w:color w:val="000000"/>
-          <w:sz w:val="18"/>
-        </w:rPr>
-        <w:t>mkdir templates</w:t>
-      </w:r>
-      <w:r>
-        <w:rPr>
-          <w:rStyle w:val="VerbatimChar"/>
-          <w:rFonts w:ascii="menlo" w:eastAsiaTheme="minorEastAsia" w:hAnsi="menlo" w:cs="menlo"/>
-          <w:color w:val="000000"/>
-          <w:sz w:val="18"/>
-          <w:lang w:eastAsia="zh-TW"/>
-        </w:rPr>
-        <w:br/>
-      </w:r>
-      <w:r>
-        <w:rPr>
-          <w:rStyle w:val="VerbatimChar"/>
-          <w:rFonts w:ascii="menlo" w:eastAsia="menlo" w:hAnsi="menlo" w:cs="menlo"/>
-          <w:color w:val="000000"/>
-          <w:sz w:val="18"/>
-        </w:rPr>
-        <w:t>mkdir templates\accounts</w:t>
-      </w:r>
-      <w:r>
-        <w:rPr>
-          <w:rStyle w:val="VerbatimChar"/>
-          <w:rFonts w:ascii="menlo" w:eastAsiaTheme="minorEastAsia" w:hAnsi="menlo" w:cs="menlo"/>
-          <w:color w:val="000000"/>
-          <w:sz w:val="18"/>
-          <w:lang w:eastAsia="zh-TW"/>
-        </w:rPr>
-        <w:br/>
-      </w:r>
-      <w:r>
-        <w:rPr>
-          <w:rStyle w:val="VerbatimChar"/>
-          <w:rFonts w:ascii="menlo" w:eastAsia="menlo" w:hAnsi="menlo" w:cs="menlo"/>
-          <w:color w:val="000000"/>
-          <w:sz w:val="18"/>
-        </w:rPr>
-        <w:t>mkdir templates\core</w:t>
-      </w:r>
-      <w:r>
-        <w:rPr>
-          <w:rStyle w:val="VerbatimChar"/>
-          <w:rFonts w:ascii="menlo" w:eastAsiaTheme="minorEastAsia" w:hAnsi="menlo" w:cs="menlo"/>
-          <w:color w:val="000000"/>
-          <w:sz w:val="18"/>
-          <w:lang w:eastAsia="zh-TW"/>
-        </w:rPr>
-        <w:br/>
-      </w:r>
-      <w:r>
-        <w:rPr>
-          <w:rStyle w:val="VerbatimChar"/>
-          <w:rFonts w:ascii="menlo" w:eastAsia="menlo" w:hAnsi="menlo" w:cs="menlo"/>
-          <w:color w:val="000000"/>
-          <w:sz w:val="18"/>
-        </w:rPr>
-        <w:t>mkdir static</w:t>
-      </w:r>
-      <w:r>
-        <w:rPr>
-          <w:rStyle w:val="VerbatimChar"/>
-          <w:rFonts w:ascii="menlo" w:eastAsiaTheme="minorEastAsia" w:hAnsi="menlo" w:cs="menlo"/>
-          <w:color w:val="000000"/>
-          <w:sz w:val="18"/>
-          <w:lang w:eastAsia="zh-TW"/>
-        </w:rPr>
-        <w:br/>
-      </w:r>
-      <w:r>
-        <w:rPr>
-          <w:rStyle w:val="VerbatimChar"/>
-          <w:rFonts w:ascii="menlo" w:eastAsia="menlo" w:hAnsi="menlo" w:cs="menlo"/>
-          <w:color w:val="000000"/>
-          <w:sz w:val="18"/>
-        </w:rPr>
-        <w:t>mkdir static\css</w:t>
-      </w:r>
-      <w:r>
-        <w:rPr>
-          <w:rStyle w:val="VerbatimChar"/>
-          <w:rFonts w:ascii="menlo" w:eastAsiaTheme="minorEastAsia" w:hAnsi="menlo" w:cs="menlo"/>
-          <w:color w:val="000000"/>
-          <w:sz w:val="18"/>
-          <w:lang w:eastAsia="zh-TW"/>
-        </w:rPr>
-        <w:br/>
-      </w:r>
-      <w:r>
-        <w:rPr>
-          <w:rStyle w:val="VerbatimChar"/>
-          <w:rFonts w:ascii="menlo" w:eastAsia="menlo" w:hAnsi="menlo" w:cs="menlo"/>
-          <w:color w:val="000000"/>
-          <w:sz w:val="18"/>
-        </w:rPr>
-        <w:t>mkdir static\js</w:t>
-      </w:r>
-      <w:r>
-        <w:rPr>
-          <w:rStyle w:val="VerbatimChar"/>
-          <w:rFonts w:ascii="menlo" w:eastAsiaTheme="minorEastAsia" w:hAnsi="menlo" w:cs="menlo"/>
-          <w:color w:val="000000"/>
-          <w:sz w:val="18"/>
-          <w:lang w:eastAsia="zh-TW"/>
-        </w:rPr>
-        <w:br/>
-      </w:r>
-      <w:r>
-        <w:rPr>
-          <w:rStyle w:val="VerbatimChar"/>
-          <w:rFonts w:ascii="menlo" w:eastAsia="menlo" w:hAnsi="menlo" w:cs="menlo"/>
-          <w:color w:val="000000"/>
-          <w:sz w:val="18"/>
-        </w:rPr>
-        <w:t>mkdir static\</w:t>
-      </w:r>
+      <w:proofErr w:type="spellStart"/>
+      <w:r>
+        <w:rPr>
+          <w:rStyle w:val="VerbatimChar"/>
+          <w:rFonts w:ascii="menlo" w:eastAsia="menlo" w:hAnsi="menlo" w:cs="menlo"/>
+          <w:color w:val="000000"/>
+          <w:sz w:val="18"/>
+        </w:rPr>
+        <w:t>mkdir</w:t>
+      </w:r>
+      <w:proofErr w:type="spellEnd"/>
+      <w:r>
+        <w:rPr>
+          <w:rStyle w:val="VerbatimChar"/>
+          <w:rFonts w:ascii="menlo" w:eastAsia="menlo" w:hAnsi="menlo" w:cs="menlo"/>
+          <w:color w:val="000000"/>
+          <w:sz w:val="18"/>
+        </w:rPr>
+        <w:t xml:space="preserve"> templates</w:t>
+      </w:r>
+      <w:r>
+        <w:rPr>
+          <w:rStyle w:val="VerbatimChar"/>
+          <w:rFonts w:ascii="menlo" w:eastAsiaTheme="minorEastAsia" w:hAnsi="menlo" w:cs="menlo"/>
+          <w:color w:val="000000"/>
+          <w:sz w:val="18"/>
+          <w:lang w:eastAsia="zh-TW"/>
+        </w:rPr>
+        <w:br/>
+      </w:r>
+      <w:proofErr w:type="spellStart"/>
+      <w:r>
+        <w:rPr>
+          <w:rStyle w:val="VerbatimChar"/>
+          <w:rFonts w:ascii="menlo" w:eastAsia="menlo" w:hAnsi="menlo" w:cs="menlo"/>
+          <w:color w:val="000000"/>
+          <w:sz w:val="18"/>
+        </w:rPr>
+        <w:t>mkdir</w:t>
+      </w:r>
+      <w:proofErr w:type="spellEnd"/>
+      <w:r>
+        <w:rPr>
+          <w:rStyle w:val="VerbatimChar"/>
+          <w:rFonts w:ascii="menlo" w:eastAsia="menlo" w:hAnsi="menlo" w:cs="menlo"/>
+          <w:color w:val="000000"/>
+          <w:sz w:val="18"/>
+        </w:rPr>
+        <w:t xml:space="preserve"> templates\accounts</w:t>
+      </w:r>
+      <w:r>
+        <w:rPr>
+          <w:rStyle w:val="VerbatimChar"/>
+          <w:rFonts w:ascii="menlo" w:eastAsiaTheme="minorEastAsia" w:hAnsi="menlo" w:cs="menlo"/>
+          <w:color w:val="000000"/>
+          <w:sz w:val="18"/>
+          <w:lang w:eastAsia="zh-TW"/>
+        </w:rPr>
+        <w:br/>
+      </w:r>
+      <w:proofErr w:type="spellStart"/>
+      <w:r>
+        <w:rPr>
+          <w:rStyle w:val="VerbatimChar"/>
+          <w:rFonts w:ascii="menlo" w:eastAsia="menlo" w:hAnsi="menlo" w:cs="menlo"/>
+          <w:color w:val="000000"/>
+          <w:sz w:val="18"/>
+        </w:rPr>
+        <w:t>mkdir</w:t>
+      </w:r>
+      <w:proofErr w:type="spellEnd"/>
+      <w:r>
+        <w:rPr>
+          <w:rStyle w:val="VerbatimChar"/>
+          <w:rFonts w:ascii="menlo" w:eastAsia="menlo" w:hAnsi="menlo" w:cs="menlo"/>
+          <w:color w:val="000000"/>
+          <w:sz w:val="18"/>
+        </w:rPr>
+        <w:t xml:space="preserve"> templates\core</w:t>
+      </w:r>
+      <w:r>
+        <w:rPr>
+          <w:rStyle w:val="VerbatimChar"/>
+          <w:rFonts w:ascii="menlo" w:eastAsiaTheme="minorEastAsia" w:hAnsi="menlo" w:cs="menlo"/>
+          <w:color w:val="000000"/>
+          <w:sz w:val="18"/>
+          <w:lang w:eastAsia="zh-TW"/>
+        </w:rPr>
+        <w:br/>
+      </w:r>
+      <w:proofErr w:type="spellStart"/>
       <w:r>
         <w:rPr>
           <w:rStyle w:val="VerbatimChar"/>
@@ -436,45 +627,250 @@
           <w:sz w:val="18"/>
           <w:lang w:eastAsia="zh-TW"/>
         </w:rPr>
+        <w:t>mkdir</w:t>
+      </w:r>
+      <w:proofErr w:type="spellEnd"/>
+      <w:r>
+        <w:rPr>
+          <w:rStyle w:val="VerbatimChar"/>
+          <w:rFonts w:ascii="menlo" w:eastAsiaTheme="minorEastAsia" w:hAnsi="menlo" w:cs="menlo" w:hint="eastAsia"/>
+          <w:color w:val="000000"/>
+          <w:sz w:val="18"/>
+          <w:lang w:eastAsia="zh-TW"/>
+        </w:rPr>
+        <w:t xml:space="preserve"> templates\includes</w:t>
+      </w:r>
+      <w:r>
+        <w:rPr>
+          <w:rStyle w:val="VerbatimChar"/>
+          <w:rFonts w:ascii="menlo" w:eastAsia="menlo" w:hAnsi="menlo" w:cs="menlo"/>
+          <w:color w:val="000000"/>
+          <w:sz w:val="18"/>
+        </w:rPr>
+        <w:t xml:space="preserve"> </w:t>
+      </w:r>
+      <w:r>
+        <w:rPr>
+          <w:rStyle w:val="VerbatimChar"/>
+          <w:rFonts w:ascii="menlo" w:eastAsiaTheme="minorEastAsia" w:hAnsi="menlo" w:cs="menlo"/>
+          <w:color w:val="000000"/>
+          <w:sz w:val="18"/>
+          <w:lang w:eastAsia="zh-TW"/>
+        </w:rPr>
+        <w:br/>
+      </w:r>
+      <w:proofErr w:type="spellStart"/>
+      <w:r>
+        <w:rPr>
+          <w:rStyle w:val="VerbatimChar"/>
+          <w:rFonts w:ascii="menlo" w:eastAsia="menlo" w:hAnsi="menlo" w:cs="menlo"/>
+          <w:color w:val="000000"/>
+          <w:sz w:val="18"/>
+        </w:rPr>
+        <w:t>mkdir</w:t>
+      </w:r>
+      <w:proofErr w:type="spellEnd"/>
+      <w:r>
+        <w:rPr>
+          <w:rStyle w:val="VerbatimChar"/>
+          <w:rFonts w:ascii="menlo" w:eastAsia="menlo" w:hAnsi="menlo" w:cs="menlo"/>
+          <w:color w:val="000000"/>
+          <w:sz w:val="18"/>
+        </w:rPr>
+        <w:t xml:space="preserve"> static</w:t>
+      </w:r>
+      <w:r>
+        <w:rPr>
+          <w:rStyle w:val="VerbatimChar"/>
+          <w:rFonts w:ascii="menlo" w:eastAsiaTheme="minorEastAsia" w:hAnsi="menlo" w:cs="menlo"/>
+          <w:color w:val="000000"/>
+          <w:sz w:val="18"/>
+          <w:lang w:eastAsia="zh-TW"/>
+        </w:rPr>
+        <w:br/>
+      </w:r>
+      <w:proofErr w:type="spellStart"/>
+      <w:r>
+        <w:rPr>
+          <w:rStyle w:val="VerbatimChar"/>
+          <w:rFonts w:ascii="menlo" w:eastAsia="menlo" w:hAnsi="menlo" w:cs="menlo"/>
+          <w:color w:val="000000"/>
+          <w:sz w:val="18"/>
+        </w:rPr>
+        <w:t>mkdir</w:t>
+      </w:r>
+      <w:proofErr w:type="spellEnd"/>
+      <w:r>
+        <w:rPr>
+          <w:rStyle w:val="VerbatimChar"/>
+          <w:rFonts w:ascii="menlo" w:eastAsia="menlo" w:hAnsi="menlo" w:cs="menlo"/>
+          <w:color w:val="000000"/>
+          <w:sz w:val="18"/>
+        </w:rPr>
+        <w:t xml:space="preserve"> static\</w:t>
+      </w:r>
+      <w:proofErr w:type="spellStart"/>
+      <w:r>
+        <w:rPr>
+          <w:rStyle w:val="VerbatimChar"/>
+          <w:rFonts w:ascii="menlo" w:eastAsia="menlo" w:hAnsi="menlo" w:cs="menlo"/>
+          <w:color w:val="000000"/>
+          <w:sz w:val="18"/>
+        </w:rPr>
+        <w:t>css</w:t>
+      </w:r>
+      <w:proofErr w:type="spellEnd"/>
+      <w:r>
+        <w:rPr>
+          <w:rStyle w:val="VerbatimChar"/>
+          <w:rFonts w:ascii="menlo" w:eastAsiaTheme="minorEastAsia" w:hAnsi="menlo" w:cs="menlo"/>
+          <w:color w:val="000000"/>
+          <w:sz w:val="18"/>
+          <w:lang w:eastAsia="zh-TW"/>
+        </w:rPr>
+        <w:br/>
+      </w:r>
+      <w:proofErr w:type="spellStart"/>
+      <w:r>
+        <w:rPr>
+          <w:rStyle w:val="VerbatimChar"/>
+          <w:rFonts w:ascii="menlo" w:eastAsia="menlo" w:hAnsi="menlo" w:cs="menlo"/>
+          <w:color w:val="000000"/>
+          <w:sz w:val="18"/>
+        </w:rPr>
+        <w:t>mkdir</w:t>
+      </w:r>
+      <w:proofErr w:type="spellEnd"/>
+      <w:r>
+        <w:rPr>
+          <w:rStyle w:val="VerbatimChar"/>
+          <w:rFonts w:ascii="menlo" w:eastAsia="menlo" w:hAnsi="menlo" w:cs="menlo"/>
+          <w:color w:val="000000"/>
+          <w:sz w:val="18"/>
+        </w:rPr>
+        <w:t xml:space="preserve"> static\</w:t>
+      </w:r>
+      <w:proofErr w:type="spellStart"/>
+      <w:r>
+        <w:rPr>
+          <w:rStyle w:val="VerbatimChar"/>
+          <w:rFonts w:ascii="menlo" w:eastAsia="menlo" w:hAnsi="menlo" w:cs="menlo"/>
+          <w:color w:val="000000"/>
+          <w:sz w:val="18"/>
+        </w:rPr>
+        <w:t>js</w:t>
+      </w:r>
+      <w:proofErr w:type="spellEnd"/>
+      <w:r>
+        <w:rPr>
+          <w:rStyle w:val="VerbatimChar"/>
+          <w:rFonts w:ascii="menlo" w:eastAsiaTheme="minorEastAsia" w:hAnsi="menlo" w:cs="menlo"/>
+          <w:color w:val="000000"/>
+          <w:sz w:val="18"/>
+          <w:lang w:eastAsia="zh-TW"/>
+        </w:rPr>
+        <w:br/>
+      </w:r>
+      <w:proofErr w:type="spellStart"/>
+      <w:r>
+        <w:rPr>
+          <w:rStyle w:val="VerbatimChar"/>
+          <w:rFonts w:ascii="menlo" w:eastAsia="menlo" w:hAnsi="menlo" w:cs="menlo"/>
+          <w:color w:val="000000"/>
+          <w:sz w:val="18"/>
+        </w:rPr>
+        <w:t>mkdir</w:t>
+      </w:r>
+      <w:proofErr w:type="spellEnd"/>
+      <w:r>
+        <w:rPr>
+          <w:rStyle w:val="VerbatimChar"/>
+          <w:rFonts w:ascii="menlo" w:eastAsia="menlo" w:hAnsi="menlo" w:cs="menlo"/>
+          <w:color w:val="000000"/>
+          <w:sz w:val="18"/>
+        </w:rPr>
+        <w:t xml:space="preserve"> static\</w:t>
+      </w:r>
+      <w:proofErr w:type="spellStart"/>
+      <w:r>
+        <w:rPr>
+          <w:rStyle w:val="VerbatimChar"/>
+          <w:rFonts w:ascii="menlo" w:eastAsiaTheme="minorEastAsia" w:hAnsi="menlo" w:cs="menlo" w:hint="eastAsia"/>
+          <w:color w:val="000000"/>
+          <w:sz w:val="18"/>
+          <w:lang w:eastAsia="zh-TW"/>
+        </w:rPr>
         <w:t>img</w:t>
       </w:r>
-      <w:r>
-        <w:rPr>
-          <w:rStyle w:val="VerbatimChar"/>
-          <w:rFonts w:ascii="menlo" w:eastAsia="menlo" w:hAnsi="menlo" w:cs="menlo"/>
-          <w:color w:val="000000"/>
-          <w:sz w:val="18"/>
-        </w:rPr>
-        <w:br/>
-      </w:r>
-      <w:r>
-        <w:rPr>
-          <w:rStyle w:val="VerbatimChar"/>
-          <w:rFonts w:ascii="menlo" w:eastAsia="menlo" w:hAnsi="menlo" w:cs="menlo"/>
-          <w:color w:val="000000"/>
-          <w:sz w:val="18"/>
-        </w:rPr>
-        <w:br/>
-        <w:t>ni .env</w:t>
-      </w:r>
-      <w:r>
-        <w:rPr>
-          <w:rStyle w:val="VerbatimChar"/>
-          <w:rFonts w:ascii="menlo" w:eastAsiaTheme="minorEastAsia" w:hAnsi="menlo" w:cs="menlo"/>
-          <w:color w:val="000000"/>
-          <w:sz w:val="18"/>
-          <w:lang w:eastAsia="zh-TW"/>
-        </w:rPr>
-        <w:br/>
-      </w:r>
-      <w:r>
-        <w:rPr>
-          <w:rStyle w:val="VerbatimChar"/>
-          <w:rFonts w:ascii="menlo" w:eastAsia="menlo" w:hAnsi="menlo" w:cs="menlo"/>
-          <w:color w:val="000000"/>
-          <w:sz w:val="18"/>
-        </w:rPr>
-        <w:t>ni README.md</w:t>
+      <w:proofErr w:type="spellEnd"/>
+      <w:r>
+        <w:rPr>
+          <w:rStyle w:val="VerbatimChar"/>
+          <w:rFonts w:ascii="menlo" w:eastAsiaTheme="minorEastAsia" w:hAnsi="menlo" w:cs="menlo"/>
+          <w:color w:val="000000"/>
+          <w:sz w:val="18"/>
+          <w:lang w:eastAsia="zh-TW"/>
+        </w:rPr>
+        <w:br/>
+      </w:r>
+      <w:r>
+        <w:rPr>
+          <w:rStyle w:val="VerbatimChar"/>
+          <w:rFonts w:ascii="menlo" w:eastAsia="menlo" w:hAnsi="menlo" w:cs="menlo"/>
+          <w:color w:val="000000"/>
+          <w:sz w:val="18"/>
+        </w:rPr>
+        <w:br/>
+      </w:r>
+      <w:proofErr w:type="spellStart"/>
+      <w:r>
+        <w:rPr>
+          <w:rStyle w:val="VerbatimChar"/>
+          <w:rFonts w:ascii="menlo" w:eastAsia="menlo" w:hAnsi="menlo" w:cs="menlo"/>
+          <w:color w:val="000000"/>
+          <w:sz w:val="18"/>
+        </w:rPr>
+        <w:t>ni</w:t>
+      </w:r>
+      <w:proofErr w:type="spellEnd"/>
+      <w:r>
+        <w:rPr>
+          <w:rStyle w:val="VerbatimChar"/>
+          <w:rFonts w:ascii="menlo" w:eastAsia="menlo" w:hAnsi="menlo" w:cs="menlo"/>
+          <w:color w:val="000000"/>
+          <w:sz w:val="18"/>
+        </w:rPr>
+        <w:t xml:space="preserve"> .env</w:t>
+      </w:r>
+      <w:r>
+        <w:rPr>
+          <w:rStyle w:val="VerbatimChar"/>
+          <w:rFonts w:ascii="menlo" w:eastAsiaTheme="minorEastAsia" w:hAnsi="menlo" w:cs="menlo"/>
+          <w:color w:val="000000"/>
+          <w:sz w:val="18"/>
+          <w:lang w:eastAsia="zh-TW"/>
+        </w:rPr>
+        <w:br/>
+      </w:r>
+      <w:proofErr w:type="spellStart"/>
+      <w:r>
+        <w:rPr>
+          <w:rStyle w:val="VerbatimChar"/>
+          <w:rFonts w:ascii="menlo" w:eastAsia="menlo" w:hAnsi="menlo" w:cs="menlo"/>
+          <w:color w:val="000000"/>
+          <w:sz w:val="18"/>
+        </w:rPr>
+        <w:t>ni</w:t>
+      </w:r>
+      <w:proofErr w:type="spellEnd"/>
+      <w:r>
+        <w:rPr>
+          <w:rStyle w:val="VerbatimChar"/>
+          <w:rFonts w:ascii="menlo" w:eastAsia="menlo" w:hAnsi="menlo" w:cs="menlo"/>
+          <w:color w:val="000000"/>
+          <w:sz w:val="18"/>
+        </w:rPr>
+        <w:t xml:space="preserve"> README.md</w:t>
       </w:r>
     </w:p>
     <w:p>
@@ -498,33 +894,55 @@
         </w:rPr>
         <w:br/>
       </w:r>
-      <w:r>
-        <w:rPr>
-          <w:rStyle w:val="VerbatimChar"/>
-          <w:rFonts w:ascii="menlo" w:eastAsia="menlo" w:hAnsi="menlo" w:cs="menlo"/>
-          <w:color w:val="000000"/>
-          <w:sz w:val="18"/>
-        </w:rPr>
-        <w:t>ni accounts\forms.py</w:t>
-      </w:r>
-      <w:r>
-        <w:rPr>
-          <w:rStyle w:val="VerbatimChar"/>
-          <w:rFonts w:ascii="menlo" w:eastAsiaTheme="minorEastAsia" w:hAnsi="menlo" w:cs="menlo"/>
-          <w:color w:val="000000"/>
-          <w:sz w:val="18"/>
-          <w:lang w:eastAsia="zh-TW"/>
-        </w:rPr>
-        <w:br/>
-      </w:r>
-      <w:r>
-        <w:rPr>
-          <w:rStyle w:val="VerbatimChar"/>
-          <w:rFonts w:ascii="menlo" w:eastAsia="menlo" w:hAnsi="menlo" w:cs="menlo"/>
-          <w:color w:val="000000"/>
-          <w:sz w:val="18"/>
-        </w:rPr>
-        <w:t>ni accounts\urls.py</w:t>
+      <w:proofErr w:type="spellStart"/>
+      <w:r>
+        <w:rPr>
+          <w:rStyle w:val="VerbatimChar"/>
+          <w:rFonts w:ascii="menlo" w:eastAsia="menlo" w:hAnsi="menlo" w:cs="menlo"/>
+          <w:color w:val="000000"/>
+          <w:sz w:val="18"/>
+        </w:rPr>
+        <w:t>ni</w:t>
+      </w:r>
+      <w:proofErr w:type="spellEnd"/>
+      <w:r>
+        <w:rPr>
+          <w:rStyle w:val="VerbatimChar"/>
+          <w:rFonts w:ascii="menlo" w:eastAsia="menlo" w:hAnsi="menlo" w:cs="menlo"/>
+          <w:color w:val="000000"/>
+          <w:sz w:val="18"/>
+        </w:rPr>
+        <w:t xml:space="preserve"> accounts\forms.py</w:t>
+      </w:r>
+      <w:r>
+        <w:rPr>
+          <w:rStyle w:val="VerbatimChar"/>
+          <w:rFonts w:ascii="menlo" w:eastAsiaTheme="minorEastAsia" w:hAnsi="menlo" w:cs="menlo"/>
+          <w:color w:val="000000"/>
+          <w:sz w:val="18"/>
+          <w:lang w:eastAsia="zh-TW"/>
+        </w:rPr>
+        <w:br/>
+      </w:r>
+      <w:proofErr w:type="spellStart"/>
+      <w:r>
+        <w:rPr>
+          <w:rStyle w:val="VerbatimChar"/>
+          <w:rFonts w:ascii="menlo" w:eastAsia="menlo" w:hAnsi="menlo" w:cs="menlo"/>
+          <w:color w:val="000000"/>
+          <w:sz w:val="18"/>
+        </w:rPr>
+        <w:t>ni</w:t>
+      </w:r>
+      <w:proofErr w:type="spellEnd"/>
+      <w:r>
+        <w:rPr>
+          <w:rStyle w:val="VerbatimChar"/>
+          <w:rFonts w:ascii="menlo" w:eastAsia="menlo" w:hAnsi="menlo" w:cs="menlo"/>
+          <w:color w:val="000000"/>
+          <w:sz w:val="18"/>
+        </w:rPr>
+        <w:t xml:space="preserve"> accounts\urls.py</w:t>
       </w:r>
     </w:p>
     <w:p>
@@ -533,9 +951,10 @@
         <w:spacing w:line="336" w:lineRule="auto"/>
         <w:rPr>
           <w:rStyle w:val="VerbatimChar"/>
-          <w:rFonts w:ascii="menlo" w:eastAsia="menlo" w:hAnsi="menlo" w:cs="menlo"/>
-          <w:color w:val="000000"/>
-          <w:sz w:val="18"/>
+          <w:rFonts w:ascii="menlo" w:eastAsiaTheme="minorEastAsia" w:hAnsi="menlo" w:cs="menlo" w:hint="eastAsia"/>
+          <w:color w:val="000000"/>
+          <w:sz w:val="18"/>
+          <w:lang w:eastAsia="zh-TW"/>
         </w:rPr>
       </w:pPr>
       <w:r>
@@ -548,33 +967,55 @@
         </w:rPr>
         <w:br/>
       </w:r>
-      <w:r>
-        <w:rPr>
-          <w:rStyle w:val="VerbatimChar"/>
-          <w:rFonts w:ascii="menlo" w:eastAsia="menlo" w:hAnsi="menlo" w:cs="menlo"/>
-          <w:color w:val="000000"/>
-          <w:sz w:val="18"/>
-        </w:rPr>
-        <w:t>ni core\forms.py</w:t>
-      </w:r>
-      <w:r>
-        <w:rPr>
-          <w:rStyle w:val="VerbatimChar"/>
-          <w:rFonts w:ascii="menlo" w:eastAsiaTheme="minorEastAsia" w:hAnsi="menlo" w:cs="menlo"/>
-          <w:color w:val="000000"/>
-          <w:sz w:val="18"/>
-          <w:lang w:eastAsia="zh-TW"/>
-        </w:rPr>
-        <w:br/>
-      </w:r>
-      <w:r>
-        <w:rPr>
-          <w:rStyle w:val="VerbatimChar"/>
-          <w:rFonts w:ascii="menlo" w:eastAsia="menlo" w:hAnsi="menlo" w:cs="menlo"/>
-          <w:color w:val="000000"/>
-          <w:sz w:val="18"/>
-        </w:rPr>
-        <w:t>ni core\</w:t>
+      <w:proofErr w:type="spellStart"/>
+      <w:r>
+        <w:rPr>
+          <w:rStyle w:val="VerbatimChar"/>
+          <w:rFonts w:ascii="menlo" w:eastAsia="menlo" w:hAnsi="menlo" w:cs="menlo"/>
+          <w:color w:val="000000"/>
+          <w:sz w:val="18"/>
+        </w:rPr>
+        <w:t>ni</w:t>
+      </w:r>
+      <w:proofErr w:type="spellEnd"/>
+      <w:r>
+        <w:rPr>
+          <w:rStyle w:val="VerbatimChar"/>
+          <w:rFonts w:ascii="menlo" w:eastAsia="menlo" w:hAnsi="menlo" w:cs="menlo"/>
+          <w:color w:val="000000"/>
+          <w:sz w:val="18"/>
+        </w:rPr>
+        <w:t xml:space="preserve"> core\forms.py</w:t>
+      </w:r>
+      <w:r>
+        <w:rPr>
+          <w:rStyle w:val="VerbatimChar"/>
+          <w:rFonts w:ascii="menlo" w:eastAsiaTheme="minorEastAsia" w:hAnsi="menlo" w:cs="menlo"/>
+          <w:color w:val="000000"/>
+          <w:sz w:val="18"/>
+          <w:lang w:eastAsia="zh-TW"/>
+        </w:rPr>
+        <w:br/>
+      </w:r>
+      <w:proofErr w:type="spellStart"/>
+      <w:r>
+        <w:rPr>
+          <w:rStyle w:val="VerbatimChar"/>
+          <w:rFonts w:ascii="menlo" w:eastAsia="menlo" w:hAnsi="menlo" w:cs="menlo"/>
+          <w:color w:val="000000"/>
+          <w:sz w:val="18"/>
+        </w:rPr>
+        <w:t>ni</w:t>
+      </w:r>
+      <w:proofErr w:type="spellEnd"/>
+      <w:r>
+        <w:rPr>
+          <w:rStyle w:val="VerbatimChar"/>
+          <w:rFonts w:ascii="menlo" w:eastAsia="menlo" w:hAnsi="menlo" w:cs="menlo"/>
+          <w:color w:val="000000"/>
+          <w:sz w:val="18"/>
+        </w:rPr>
+        <w:t xml:space="preserve"> core\</w:t>
       </w:r>
       <w:r>
         <w:rPr>
@@ -594,6 +1035,1175 @@
           <w:sz w:val="18"/>
         </w:rPr>
         <w:t>.py</w:t>
+      </w:r>
+      <w:r>
+        <w:rPr>
+          <w:rStyle w:val="VerbatimChar"/>
+          <w:rFonts w:ascii="menlo" w:eastAsiaTheme="minorEastAsia" w:hAnsi="menlo" w:cs="menlo"/>
+          <w:color w:val="000000"/>
+          <w:sz w:val="18"/>
+          <w:lang w:eastAsia="zh-TW"/>
+        </w:rPr>
+        <w:br/>
+      </w:r>
+      <w:proofErr w:type="spellStart"/>
+      <w:r>
+        <w:rPr>
+          <w:rStyle w:val="VerbatimChar"/>
+          <w:rFonts w:ascii="menlo" w:eastAsiaTheme="minorEastAsia" w:hAnsi="menlo" w:cs="menlo" w:hint="eastAsia"/>
+          <w:color w:val="000000"/>
+          <w:sz w:val="18"/>
+          <w:lang w:eastAsia="zh-TW"/>
+        </w:rPr>
+        <w:t>ni</w:t>
+      </w:r>
+      <w:proofErr w:type="spellEnd"/>
+      <w:r>
+        <w:rPr>
+          <w:rStyle w:val="VerbatimChar"/>
+          <w:rFonts w:ascii="menlo" w:eastAsiaTheme="minorEastAsia" w:hAnsi="menlo" w:cs="menlo" w:hint="eastAsia"/>
+          <w:color w:val="000000"/>
+          <w:sz w:val="18"/>
+          <w:lang w:eastAsia="zh-TW"/>
+        </w:rPr>
+        <w:t xml:space="preserve"> core\context_processors.py</w:t>
+      </w:r>
+      <w:r>
+        <w:rPr>
+          <w:rStyle w:val="VerbatimChar"/>
+          <w:rFonts w:ascii="menlo" w:eastAsiaTheme="minorEastAsia" w:hAnsi="menlo" w:cs="menlo"/>
+          <w:color w:val="000000"/>
+          <w:sz w:val="18"/>
+          <w:lang w:eastAsia="zh-TW"/>
+        </w:rPr>
+        <w:br/>
+      </w:r>
+      <w:proofErr w:type="spellStart"/>
+      <w:r>
+        <w:rPr>
+          <w:rStyle w:val="VerbatimChar"/>
+          <w:rFonts w:ascii="menlo" w:eastAsiaTheme="minorEastAsia" w:hAnsi="menlo" w:cs="menlo" w:hint="eastAsia"/>
+          <w:color w:val="000000"/>
+          <w:sz w:val="18"/>
+          <w:lang w:eastAsia="zh-TW"/>
+        </w:rPr>
+        <w:t>ni</w:t>
+      </w:r>
+      <w:proofErr w:type="spellEnd"/>
+      <w:r>
+        <w:rPr>
+          <w:rStyle w:val="VerbatimChar"/>
+          <w:rFonts w:ascii="menlo" w:eastAsiaTheme="minorEastAsia" w:hAnsi="menlo" w:cs="menlo" w:hint="eastAsia"/>
+          <w:color w:val="000000"/>
+          <w:sz w:val="18"/>
+          <w:lang w:eastAsia="zh-TW"/>
+        </w:rPr>
+        <w:t xml:space="preserve"> core\sidebar.py</w:t>
+      </w:r>
+      <w:r>
+        <w:rPr>
+          <w:rStyle w:val="VerbatimChar"/>
+          <w:rFonts w:ascii="menlo" w:eastAsiaTheme="minorEastAsia" w:hAnsi="menlo" w:cs="menlo"/>
+          <w:color w:val="000000"/>
+          <w:sz w:val="18"/>
+          <w:lang w:eastAsia="zh-TW"/>
+        </w:rPr>
+        <w:br/>
+      </w:r>
+      <w:r>
+        <w:rPr>
+          <w:rStyle w:val="VerbatimChar"/>
+          <w:rFonts w:ascii="menlo" w:eastAsiaTheme="minorEastAsia" w:hAnsi="menlo" w:cs="menlo"/>
+          <w:color w:val="000000"/>
+          <w:sz w:val="18"/>
+          <w:lang w:eastAsia="zh-TW"/>
+        </w:rPr>
+        <w:lastRenderedPageBreak/>
+        <w:br/>
+      </w:r>
+      <w:proofErr w:type="spellStart"/>
+      <w:r>
+        <w:rPr>
+          <w:rStyle w:val="VerbatimChar"/>
+          <w:rFonts w:ascii="menlo" w:eastAsia="menlo" w:hAnsi="menlo" w:cs="menlo"/>
+          <w:color w:val="000000"/>
+          <w:sz w:val="18"/>
+        </w:rPr>
+        <w:t>ni</w:t>
+      </w:r>
+      <w:proofErr w:type="spellEnd"/>
+      <w:r>
+        <w:rPr>
+          <w:rStyle w:val="VerbatimChar"/>
+          <w:rFonts w:ascii="menlo" w:eastAsia="menlo" w:hAnsi="menlo" w:cs="menlo"/>
+          <w:color w:val="000000"/>
+          <w:sz w:val="18"/>
+        </w:rPr>
+        <w:t xml:space="preserve"> templates\base.html</w:t>
+      </w:r>
+      <w:r>
+        <w:rPr>
+          <w:rStyle w:val="VerbatimChar"/>
+          <w:rFonts w:ascii="menlo" w:eastAsiaTheme="minorEastAsia" w:hAnsi="menlo" w:cs="menlo"/>
+          <w:color w:val="000000"/>
+          <w:sz w:val="18"/>
+          <w:lang w:eastAsia="zh-TW"/>
+        </w:rPr>
+        <w:t xml:space="preserve"> </w:t>
+      </w:r>
+      <w:r>
+        <w:rPr>
+          <w:rStyle w:val="VerbatimChar"/>
+          <w:rFonts w:ascii="menlo" w:eastAsiaTheme="minorEastAsia" w:hAnsi="menlo" w:cs="menlo"/>
+          <w:color w:val="000000"/>
+          <w:sz w:val="18"/>
+          <w:lang w:eastAsia="zh-TW"/>
+        </w:rPr>
+        <w:br/>
+      </w:r>
+      <w:proofErr w:type="spellStart"/>
+      <w:r>
+        <w:rPr>
+          <w:rStyle w:val="VerbatimChar"/>
+          <w:rFonts w:ascii="menlo" w:eastAsia="menlo" w:hAnsi="menlo" w:cs="menlo"/>
+          <w:color w:val="000000"/>
+          <w:sz w:val="18"/>
+        </w:rPr>
+        <w:t>ni</w:t>
+      </w:r>
+      <w:proofErr w:type="spellEnd"/>
+      <w:r>
+        <w:rPr>
+          <w:rStyle w:val="VerbatimChar"/>
+          <w:rFonts w:ascii="menlo" w:eastAsia="menlo" w:hAnsi="menlo" w:cs="menlo"/>
+          <w:color w:val="000000"/>
+          <w:sz w:val="18"/>
+        </w:rPr>
+        <w:t xml:space="preserve"> templates\dashboard.html</w:t>
+      </w:r>
+      <w:r>
+        <w:rPr>
+          <w:rStyle w:val="VerbatimChar"/>
+          <w:rFonts w:ascii="menlo" w:eastAsiaTheme="minorEastAsia" w:hAnsi="menlo" w:cs="menlo"/>
+          <w:color w:val="000000"/>
+          <w:sz w:val="18"/>
+          <w:lang w:eastAsia="zh-TW"/>
+        </w:rPr>
+        <w:br/>
+      </w:r>
+      <w:proofErr w:type="spellStart"/>
+      <w:r>
+        <w:rPr>
+          <w:rStyle w:val="VerbatimChar"/>
+          <w:rFonts w:ascii="menlo" w:eastAsia="menlo" w:hAnsi="menlo" w:cs="menlo"/>
+          <w:color w:val="000000"/>
+          <w:sz w:val="18"/>
+        </w:rPr>
+        <w:t>ni</w:t>
+      </w:r>
+      <w:proofErr w:type="spellEnd"/>
+      <w:r>
+        <w:rPr>
+          <w:rStyle w:val="VerbatimChar"/>
+          <w:rFonts w:ascii="menlo" w:eastAsia="menlo" w:hAnsi="menlo" w:cs="menlo"/>
+          <w:color w:val="000000"/>
+          <w:sz w:val="18"/>
+        </w:rPr>
+        <w:t xml:space="preserve"> templates\accounts\login.html</w:t>
+      </w:r>
+      <w:r>
+        <w:rPr>
+          <w:rStyle w:val="VerbatimChar"/>
+          <w:rFonts w:ascii="menlo" w:eastAsiaTheme="minorEastAsia" w:hAnsi="menlo" w:cs="menlo"/>
+          <w:color w:val="000000"/>
+          <w:sz w:val="18"/>
+          <w:lang w:eastAsia="zh-TW"/>
+        </w:rPr>
+        <w:br/>
+      </w:r>
+      <w:proofErr w:type="spellStart"/>
+      <w:r>
+        <w:rPr>
+          <w:rStyle w:val="VerbatimChar"/>
+          <w:rFonts w:ascii="menlo" w:eastAsia="menlo" w:hAnsi="menlo" w:cs="menlo"/>
+          <w:color w:val="000000"/>
+          <w:sz w:val="18"/>
+        </w:rPr>
+        <w:t>ni</w:t>
+      </w:r>
+      <w:proofErr w:type="spellEnd"/>
+      <w:r>
+        <w:rPr>
+          <w:rStyle w:val="VerbatimChar"/>
+          <w:rFonts w:ascii="menlo" w:eastAsia="menlo" w:hAnsi="menlo" w:cs="menlo"/>
+          <w:color w:val="000000"/>
+          <w:sz w:val="18"/>
+        </w:rPr>
+        <w:t xml:space="preserve"> templates\accounts\profile.html</w:t>
+      </w:r>
+      <w:r>
+        <w:rPr>
+          <w:rStyle w:val="VerbatimChar"/>
+          <w:rFonts w:ascii="menlo" w:eastAsiaTheme="minorEastAsia" w:hAnsi="menlo" w:cs="menlo"/>
+          <w:color w:val="000000"/>
+          <w:sz w:val="18"/>
+          <w:lang w:eastAsia="zh-TW"/>
+        </w:rPr>
+        <w:br/>
+      </w:r>
+      <w:proofErr w:type="spellStart"/>
+      <w:r>
+        <w:rPr>
+          <w:rStyle w:val="VerbatimChar"/>
+          <w:rFonts w:ascii="menlo" w:eastAsia="menlo" w:hAnsi="menlo" w:cs="menlo"/>
+          <w:color w:val="000000"/>
+          <w:sz w:val="18"/>
+        </w:rPr>
+        <w:t>ni</w:t>
+      </w:r>
+      <w:proofErr w:type="spellEnd"/>
+      <w:r>
+        <w:rPr>
+          <w:rStyle w:val="VerbatimChar"/>
+          <w:rFonts w:ascii="menlo" w:eastAsia="menlo" w:hAnsi="menlo" w:cs="menlo"/>
+          <w:color w:val="000000"/>
+          <w:sz w:val="18"/>
+        </w:rPr>
+        <w:t xml:space="preserve"> templates\core\clients.html</w:t>
+      </w:r>
+      <w:r>
+        <w:rPr>
+          <w:rStyle w:val="VerbatimChar"/>
+          <w:rFonts w:ascii="menlo" w:eastAsiaTheme="minorEastAsia" w:hAnsi="menlo" w:cs="menlo"/>
+          <w:color w:val="000000"/>
+          <w:sz w:val="18"/>
+          <w:lang w:eastAsia="zh-TW"/>
+        </w:rPr>
+        <w:br/>
+      </w:r>
+      <w:proofErr w:type="spellStart"/>
+      <w:r>
+        <w:rPr>
+          <w:rStyle w:val="VerbatimChar"/>
+          <w:rFonts w:ascii="menlo" w:eastAsia="menlo" w:hAnsi="menlo" w:cs="menlo"/>
+          <w:color w:val="000000"/>
+          <w:sz w:val="18"/>
+        </w:rPr>
+        <w:t>ni</w:t>
+      </w:r>
+      <w:proofErr w:type="spellEnd"/>
+      <w:r>
+        <w:rPr>
+          <w:rStyle w:val="VerbatimChar"/>
+          <w:rFonts w:ascii="menlo" w:eastAsia="menlo" w:hAnsi="menlo" w:cs="menlo"/>
+          <w:color w:val="000000"/>
+          <w:sz w:val="18"/>
+        </w:rPr>
+        <w:t xml:space="preserve"> templates\core\client_detail.html</w:t>
+      </w:r>
+      <w:r>
+        <w:rPr>
+          <w:rStyle w:val="VerbatimChar"/>
+          <w:rFonts w:ascii="menlo" w:eastAsiaTheme="minorEastAsia" w:hAnsi="menlo" w:cs="menlo"/>
+          <w:color w:val="000000"/>
+          <w:sz w:val="18"/>
+          <w:lang w:eastAsia="zh-TW"/>
+        </w:rPr>
+        <w:br/>
+      </w:r>
+      <w:proofErr w:type="spellStart"/>
+      <w:r>
+        <w:rPr>
+          <w:rStyle w:val="VerbatimChar"/>
+          <w:rFonts w:ascii="menlo" w:eastAsia="menlo" w:hAnsi="menlo" w:cs="menlo"/>
+          <w:color w:val="000000"/>
+          <w:sz w:val="18"/>
+        </w:rPr>
+        <w:t>ni</w:t>
+      </w:r>
+      <w:proofErr w:type="spellEnd"/>
+      <w:r>
+        <w:rPr>
+          <w:rStyle w:val="VerbatimChar"/>
+          <w:rFonts w:ascii="menlo" w:eastAsia="menlo" w:hAnsi="menlo" w:cs="menlo"/>
+          <w:color w:val="000000"/>
+          <w:sz w:val="18"/>
+        </w:rPr>
+        <w:t xml:space="preserve"> templates\core\client_</w:t>
+      </w:r>
+      <w:r>
+        <w:rPr>
+          <w:rStyle w:val="VerbatimChar"/>
+          <w:rFonts w:ascii="menlo" w:eastAsiaTheme="minorEastAsia" w:hAnsi="menlo" w:cs="menlo" w:hint="eastAsia"/>
+          <w:color w:val="000000"/>
+          <w:sz w:val="18"/>
+          <w:lang w:eastAsia="zh-TW"/>
+        </w:rPr>
+        <w:t>saved</w:t>
+      </w:r>
+      <w:r>
+        <w:rPr>
+          <w:rStyle w:val="VerbatimChar"/>
+          <w:rFonts w:ascii="menlo" w:eastAsia="menlo" w:hAnsi="menlo" w:cs="menlo"/>
+          <w:color w:val="000000"/>
+          <w:sz w:val="18"/>
+        </w:rPr>
+        <w:t>.html</w:t>
+      </w:r>
+      <w:r>
+        <w:rPr>
+          <w:rStyle w:val="VerbatimChar"/>
+          <w:rFonts w:ascii="menlo" w:eastAsiaTheme="minorEastAsia" w:hAnsi="menlo" w:cs="menlo"/>
+          <w:color w:val="000000"/>
+          <w:sz w:val="18"/>
+          <w:lang w:eastAsia="zh-TW"/>
+        </w:rPr>
+        <w:br/>
+      </w:r>
+      <w:proofErr w:type="spellStart"/>
+      <w:r>
+        <w:rPr>
+          <w:rStyle w:val="VerbatimChar"/>
+          <w:rFonts w:ascii="menlo" w:eastAsia="menlo" w:hAnsi="menlo" w:cs="menlo"/>
+          <w:color w:val="000000"/>
+          <w:sz w:val="18"/>
+        </w:rPr>
+        <w:t>ni</w:t>
+      </w:r>
+      <w:proofErr w:type="spellEnd"/>
+      <w:r>
+        <w:rPr>
+          <w:rStyle w:val="VerbatimChar"/>
+          <w:rFonts w:ascii="menlo" w:eastAsia="menlo" w:hAnsi="menlo" w:cs="menlo"/>
+          <w:color w:val="000000"/>
+          <w:sz w:val="18"/>
+        </w:rPr>
+        <w:t xml:space="preserve"> templates\core\buildings.html</w:t>
+      </w:r>
+      <w:r>
+        <w:rPr>
+          <w:rStyle w:val="VerbatimChar"/>
+          <w:rFonts w:ascii="menlo" w:eastAsiaTheme="minorEastAsia" w:hAnsi="menlo" w:cs="menlo"/>
+          <w:color w:val="000000"/>
+          <w:sz w:val="18"/>
+          <w:lang w:eastAsia="zh-TW"/>
+        </w:rPr>
+        <w:br/>
+      </w:r>
+      <w:proofErr w:type="spellStart"/>
+      <w:r>
+        <w:rPr>
+          <w:rStyle w:val="VerbatimChar"/>
+          <w:rFonts w:ascii="menlo" w:eastAsia="menlo" w:hAnsi="menlo" w:cs="menlo"/>
+          <w:color w:val="000000"/>
+          <w:sz w:val="18"/>
+        </w:rPr>
+        <w:t>ni</w:t>
+      </w:r>
+      <w:proofErr w:type="spellEnd"/>
+      <w:r>
+        <w:rPr>
+          <w:rStyle w:val="VerbatimChar"/>
+          <w:rFonts w:ascii="menlo" w:eastAsia="menlo" w:hAnsi="menlo" w:cs="menlo"/>
+          <w:color w:val="000000"/>
+          <w:sz w:val="18"/>
+        </w:rPr>
+        <w:t xml:space="preserve"> templates\core\building</w:t>
+      </w:r>
+      <w:r>
+        <w:rPr>
+          <w:rStyle w:val="VerbatimChar"/>
+          <w:rFonts w:ascii="menlo" w:eastAsiaTheme="minorEastAsia" w:hAnsi="menlo" w:cs="menlo" w:hint="eastAsia"/>
+          <w:color w:val="000000"/>
+          <w:sz w:val="18"/>
+          <w:lang w:eastAsia="zh-TW"/>
+        </w:rPr>
+        <w:t>_detail</w:t>
+      </w:r>
+      <w:r>
+        <w:rPr>
+          <w:rStyle w:val="VerbatimChar"/>
+          <w:rFonts w:ascii="menlo" w:eastAsia="menlo" w:hAnsi="menlo" w:cs="menlo"/>
+          <w:color w:val="000000"/>
+          <w:sz w:val="18"/>
+        </w:rPr>
+        <w:t>.html</w:t>
+      </w:r>
+      <w:r>
+        <w:rPr>
+          <w:rStyle w:val="VerbatimChar"/>
+          <w:rFonts w:ascii="menlo" w:eastAsiaTheme="minorEastAsia" w:hAnsi="menlo" w:cs="menlo"/>
+          <w:color w:val="000000"/>
+          <w:sz w:val="18"/>
+          <w:lang w:eastAsia="zh-TW"/>
+        </w:rPr>
+        <w:br/>
+      </w:r>
+      <w:proofErr w:type="spellStart"/>
+      <w:r>
+        <w:rPr>
+          <w:rStyle w:val="VerbatimChar"/>
+          <w:rFonts w:ascii="menlo" w:eastAsiaTheme="minorEastAsia" w:hAnsi="menlo" w:cs="menlo" w:hint="eastAsia"/>
+          <w:color w:val="000000"/>
+          <w:sz w:val="18"/>
+          <w:lang w:eastAsia="zh-TW"/>
+        </w:rPr>
+        <w:t>ni</w:t>
+      </w:r>
+      <w:proofErr w:type="spellEnd"/>
+      <w:r>
+        <w:rPr>
+          <w:rStyle w:val="VerbatimChar"/>
+          <w:rFonts w:ascii="menlo" w:eastAsiaTheme="minorEastAsia" w:hAnsi="menlo" w:cs="menlo" w:hint="eastAsia"/>
+          <w:color w:val="000000"/>
+          <w:sz w:val="18"/>
+          <w:lang w:eastAsia="zh-TW"/>
+        </w:rPr>
+        <w:t xml:space="preserve"> </w:t>
+      </w:r>
+      <w:r>
+        <w:rPr>
+          <w:rStyle w:val="VerbatimChar"/>
+          <w:rFonts w:ascii="menlo" w:eastAsiaTheme="minorEastAsia" w:hAnsi="menlo" w:cs="menlo"/>
+          <w:color w:val="000000"/>
+          <w:sz w:val="18"/>
+          <w:lang w:eastAsia="zh-TW"/>
+        </w:rPr>
+        <w:t>templates</w:t>
+      </w:r>
+      <w:r>
+        <w:rPr>
+          <w:rStyle w:val="VerbatimChar"/>
+          <w:rFonts w:ascii="menlo" w:eastAsiaTheme="minorEastAsia" w:hAnsi="menlo" w:cs="menlo" w:hint="eastAsia"/>
+          <w:color w:val="000000"/>
+          <w:sz w:val="18"/>
+          <w:lang w:eastAsia="zh-TW"/>
+        </w:rPr>
+        <w:t>\</w:t>
+      </w:r>
+      <w:r>
+        <w:rPr>
+          <w:rStyle w:val="VerbatimChar"/>
+          <w:rFonts w:ascii="menlo" w:eastAsiaTheme="minorEastAsia" w:hAnsi="menlo" w:cs="menlo"/>
+          <w:color w:val="000000"/>
+          <w:sz w:val="18"/>
+          <w:lang w:eastAsia="zh-TW"/>
+        </w:rPr>
+        <w:t>core</w:t>
+      </w:r>
+      <w:r>
+        <w:rPr>
+          <w:rStyle w:val="VerbatimChar"/>
+          <w:rFonts w:ascii="menlo" w:eastAsiaTheme="minorEastAsia" w:hAnsi="menlo" w:cs="menlo" w:hint="eastAsia"/>
+          <w:color w:val="000000"/>
+          <w:sz w:val="18"/>
+          <w:lang w:eastAsia="zh-TW"/>
+        </w:rPr>
+        <w:t>\</w:t>
+      </w:r>
+      <w:r>
+        <w:rPr>
+          <w:rStyle w:val="VerbatimChar"/>
+          <w:rFonts w:ascii="menlo" w:eastAsiaTheme="minorEastAsia" w:hAnsi="menlo" w:cs="menlo"/>
+          <w:color w:val="000000"/>
+          <w:sz w:val="18"/>
+          <w:lang w:eastAsia="zh-TW"/>
+        </w:rPr>
+        <w:t>building_saved.html</w:t>
+      </w:r>
+      <w:r>
+        <w:rPr>
+          <w:rStyle w:val="VerbatimChar"/>
+          <w:rFonts w:ascii="menlo" w:eastAsiaTheme="minorEastAsia" w:hAnsi="menlo" w:cs="menlo"/>
+          <w:color w:val="000000"/>
+          <w:sz w:val="18"/>
+          <w:lang w:eastAsia="zh-TW"/>
+        </w:rPr>
+        <w:br/>
+      </w:r>
+      <w:proofErr w:type="spellStart"/>
+      <w:r>
+        <w:rPr>
+          <w:rStyle w:val="VerbatimChar"/>
+          <w:rFonts w:ascii="menlo" w:eastAsia="menlo" w:hAnsi="menlo" w:cs="menlo"/>
+          <w:color w:val="000000"/>
+          <w:sz w:val="18"/>
+        </w:rPr>
+        <w:t>ni</w:t>
+      </w:r>
+      <w:proofErr w:type="spellEnd"/>
+      <w:r>
+        <w:rPr>
+          <w:rStyle w:val="VerbatimChar"/>
+          <w:rFonts w:ascii="menlo" w:eastAsia="menlo" w:hAnsi="menlo" w:cs="menlo"/>
+          <w:color w:val="000000"/>
+          <w:sz w:val="18"/>
+        </w:rPr>
+        <w:t xml:space="preserve"> templates\core\building</w:t>
+      </w:r>
+      <w:r>
+        <w:rPr>
+          <w:rStyle w:val="VerbatimChar"/>
+          <w:rFonts w:ascii="menlo" w:eastAsiaTheme="minorEastAsia" w:hAnsi="menlo" w:cs="menlo" w:hint="eastAsia"/>
+          <w:color w:val="000000"/>
+          <w:sz w:val="18"/>
+          <w:lang w:eastAsia="zh-TW"/>
+        </w:rPr>
+        <w:t>_report</w:t>
+      </w:r>
+      <w:r>
+        <w:rPr>
+          <w:rStyle w:val="VerbatimChar"/>
+          <w:rFonts w:ascii="menlo" w:eastAsia="menlo" w:hAnsi="menlo" w:cs="menlo"/>
+          <w:color w:val="000000"/>
+          <w:sz w:val="18"/>
+        </w:rPr>
+        <w:t>.html</w:t>
+      </w:r>
+      <w:r>
+        <w:rPr>
+          <w:rStyle w:val="VerbatimChar"/>
+          <w:rFonts w:ascii="menlo" w:eastAsiaTheme="minorEastAsia" w:hAnsi="menlo" w:cs="menlo"/>
+          <w:color w:val="000000"/>
+          <w:sz w:val="18"/>
+          <w:lang w:eastAsia="zh-TW"/>
+        </w:rPr>
+        <w:br/>
+      </w:r>
+      <w:proofErr w:type="spellStart"/>
+      <w:r>
+        <w:rPr>
+          <w:rStyle w:val="VerbatimChar"/>
+          <w:rFonts w:ascii="menlo" w:eastAsia="menlo" w:hAnsi="menlo" w:cs="menlo"/>
+          <w:color w:val="000000"/>
+          <w:sz w:val="18"/>
+        </w:rPr>
+        <w:t>ni</w:t>
+      </w:r>
+      <w:proofErr w:type="spellEnd"/>
+      <w:r>
+        <w:rPr>
+          <w:rStyle w:val="VerbatimChar"/>
+          <w:rFonts w:ascii="menlo" w:eastAsia="menlo" w:hAnsi="menlo" w:cs="menlo"/>
+          <w:color w:val="000000"/>
+          <w:sz w:val="18"/>
+        </w:rPr>
+        <w:t xml:space="preserve"> templates\core\groups.html</w:t>
+      </w:r>
+      <w:r>
+        <w:rPr>
+          <w:rStyle w:val="VerbatimChar"/>
+          <w:rFonts w:ascii="menlo" w:eastAsiaTheme="minorEastAsia" w:hAnsi="menlo" w:cs="menlo"/>
+          <w:color w:val="000000"/>
+          <w:sz w:val="18"/>
+          <w:lang w:eastAsia="zh-TW"/>
+        </w:rPr>
+        <w:br/>
+      </w:r>
+      <w:proofErr w:type="spellStart"/>
+      <w:r>
+        <w:rPr>
+          <w:rStyle w:val="VerbatimChar"/>
+          <w:rFonts w:ascii="menlo" w:eastAsia="menlo" w:hAnsi="menlo" w:cs="menlo"/>
+          <w:color w:val="000000"/>
+          <w:sz w:val="18"/>
+        </w:rPr>
+        <w:t>ni</w:t>
+      </w:r>
+      <w:proofErr w:type="spellEnd"/>
+      <w:r>
+        <w:rPr>
+          <w:rStyle w:val="VerbatimChar"/>
+          <w:rFonts w:ascii="menlo" w:eastAsia="menlo" w:hAnsi="menlo" w:cs="menlo"/>
+          <w:color w:val="000000"/>
+          <w:sz w:val="18"/>
+        </w:rPr>
+        <w:t xml:space="preserve"> templates\core\group</w:t>
+      </w:r>
+      <w:r>
+        <w:rPr>
+          <w:rStyle w:val="VerbatimChar"/>
+          <w:rFonts w:ascii="menlo" w:eastAsiaTheme="minorEastAsia" w:hAnsi="menlo" w:cs="menlo" w:hint="eastAsia"/>
+          <w:color w:val="000000"/>
+          <w:sz w:val="18"/>
+          <w:lang w:eastAsia="zh-TW"/>
+        </w:rPr>
+        <w:t>_detail</w:t>
+      </w:r>
+      <w:r>
+        <w:rPr>
+          <w:rStyle w:val="VerbatimChar"/>
+          <w:rFonts w:ascii="menlo" w:eastAsia="menlo" w:hAnsi="menlo" w:cs="menlo"/>
+          <w:color w:val="000000"/>
+          <w:sz w:val="18"/>
+        </w:rPr>
+        <w:t>.html</w:t>
+      </w:r>
+      <w:r>
+        <w:rPr>
+          <w:rStyle w:val="VerbatimChar"/>
+          <w:rFonts w:ascii="menlo" w:eastAsiaTheme="minorEastAsia" w:hAnsi="menlo" w:cs="menlo"/>
+          <w:color w:val="000000"/>
+          <w:sz w:val="18"/>
+          <w:lang w:eastAsia="zh-TW"/>
+        </w:rPr>
+        <w:br/>
+      </w:r>
+      <w:proofErr w:type="spellStart"/>
+      <w:r>
+        <w:rPr>
+          <w:rStyle w:val="VerbatimChar"/>
+          <w:rFonts w:ascii="menlo" w:eastAsia="menlo" w:hAnsi="menlo" w:cs="menlo"/>
+          <w:color w:val="000000"/>
+          <w:sz w:val="18"/>
+        </w:rPr>
+        <w:t>ni</w:t>
+      </w:r>
+      <w:proofErr w:type="spellEnd"/>
+      <w:r>
+        <w:rPr>
+          <w:rStyle w:val="VerbatimChar"/>
+          <w:rFonts w:ascii="menlo" w:eastAsia="menlo" w:hAnsi="menlo" w:cs="menlo"/>
+          <w:color w:val="000000"/>
+          <w:sz w:val="18"/>
+        </w:rPr>
+        <w:t xml:space="preserve"> templates\core\group</w:t>
+      </w:r>
+      <w:r>
+        <w:rPr>
+          <w:rStyle w:val="VerbatimChar"/>
+          <w:rFonts w:ascii="menlo" w:eastAsiaTheme="minorEastAsia" w:hAnsi="menlo" w:cs="menlo" w:hint="eastAsia"/>
+          <w:color w:val="000000"/>
+          <w:sz w:val="18"/>
+          <w:lang w:eastAsia="zh-TW"/>
+        </w:rPr>
+        <w:t>_saved</w:t>
+      </w:r>
+      <w:r>
+        <w:rPr>
+          <w:rStyle w:val="VerbatimChar"/>
+          <w:rFonts w:ascii="menlo" w:eastAsia="menlo" w:hAnsi="menlo" w:cs="menlo"/>
+          <w:color w:val="000000"/>
+          <w:sz w:val="18"/>
+        </w:rPr>
+        <w:t>.html</w:t>
+      </w:r>
+      <w:r>
+        <w:rPr>
+          <w:rStyle w:val="VerbatimChar"/>
+          <w:rFonts w:ascii="menlo" w:eastAsiaTheme="minorEastAsia" w:hAnsi="menlo" w:cs="menlo"/>
+          <w:color w:val="000000"/>
+          <w:sz w:val="18"/>
+          <w:lang w:eastAsia="zh-TW"/>
+        </w:rPr>
+        <w:br/>
+      </w:r>
+      <w:proofErr w:type="spellStart"/>
+      <w:r>
+        <w:rPr>
+          <w:rStyle w:val="VerbatimChar"/>
+          <w:rFonts w:ascii="menlo" w:eastAsia="menlo" w:hAnsi="menlo" w:cs="menlo"/>
+          <w:color w:val="000000"/>
+          <w:sz w:val="18"/>
+        </w:rPr>
+        <w:t>ni</w:t>
+      </w:r>
+      <w:proofErr w:type="spellEnd"/>
+      <w:r>
+        <w:rPr>
+          <w:rStyle w:val="VerbatimChar"/>
+          <w:rFonts w:ascii="menlo" w:eastAsia="menlo" w:hAnsi="menlo" w:cs="menlo"/>
+          <w:color w:val="000000"/>
+          <w:sz w:val="18"/>
+        </w:rPr>
+        <w:t xml:space="preserve"> templates\core\group</w:t>
+      </w:r>
+      <w:r>
+        <w:rPr>
+          <w:rStyle w:val="VerbatimChar"/>
+          <w:rFonts w:ascii="menlo" w:eastAsiaTheme="minorEastAsia" w:hAnsi="menlo" w:cs="menlo" w:hint="eastAsia"/>
+          <w:color w:val="000000"/>
+          <w:sz w:val="18"/>
+          <w:lang w:eastAsia="zh-TW"/>
+        </w:rPr>
+        <w:t>_members</w:t>
+      </w:r>
+      <w:r>
+        <w:rPr>
+          <w:rStyle w:val="VerbatimChar"/>
+          <w:rFonts w:ascii="menlo" w:eastAsia="menlo" w:hAnsi="menlo" w:cs="menlo"/>
+          <w:color w:val="000000"/>
+          <w:sz w:val="18"/>
+        </w:rPr>
+        <w:t>.html</w:t>
+      </w:r>
+      <w:r>
+        <w:rPr>
+          <w:rStyle w:val="VerbatimChar"/>
+          <w:rFonts w:ascii="menlo" w:eastAsiaTheme="minorEastAsia" w:hAnsi="menlo" w:cs="menlo"/>
+          <w:color w:val="000000"/>
+          <w:sz w:val="18"/>
+          <w:lang w:eastAsia="zh-TW"/>
+        </w:rPr>
+        <w:br/>
+      </w:r>
+      <w:proofErr w:type="spellStart"/>
+      <w:r>
+        <w:rPr>
+          <w:rStyle w:val="VerbatimChar"/>
+          <w:rFonts w:ascii="menlo" w:eastAsia="menlo" w:hAnsi="menlo" w:cs="menlo"/>
+          <w:color w:val="000000"/>
+          <w:sz w:val="18"/>
+        </w:rPr>
+        <w:t>ni</w:t>
+      </w:r>
+      <w:proofErr w:type="spellEnd"/>
+      <w:r>
+        <w:rPr>
+          <w:rStyle w:val="VerbatimChar"/>
+          <w:rFonts w:ascii="menlo" w:eastAsia="menlo" w:hAnsi="menlo" w:cs="menlo"/>
+          <w:color w:val="000000"/>
+          <w:sz w:val="18"/>
+        </w:rPr>
+        <w:t xml:space="preserve"> templates\core\users.html</w:t>
+      </w:r>
+      <w:r>
+        <w:rPr>
+          <w:rStyle w:val="VerbatimChar"/>
+          <w:rFonts w:ascii="menlo" w:eastAsiaTheme="minorEastAsia" w:hAnsi="menlo" w:cs="menlo"/>
+          <w:color w:val="000000"/>
+          <w:sz w:val="18"/>
+          <w:lang w:eastAsia="zh-TW"/>
+        </w:rPr>
+        <w:br/>
+      </w:r>
+      <w:proofErr w:type="spellStart"/>
+      <w:r>
+        <w:rPr>
+          <w:rStyle w:val="VerbatimChar"/>
+          <w:rFonts w:ascii="menlo" w:eastAsia="menlo" w:hAnsi="menlo" w:cs="menlo"/>
+          <w:color w:val="000000"/>
+          <w:sz w:val="18"/>
+        </w:rPr>
+        <w:t>ni</w:t>
+      </w:r>
+      <w:proofErr w:type="spellEnd"/>
+      <w:r>
+        <w:rPr>
+          <w:rStyle w:val="VerbatimChar"/>
+          <w:rFonts w:ascii="menlo" w:eastAsia="menlo" w:hAnsi="menlo" w:cs="menlo"/>
+          <w:color w:val="000000"/>
+          <w:sz w:val="18"/>
+        </w:rPr>
+        <w:t xml:space="preserve"> templates\core\user</w:t>
+      </w:r>
+      <w:r>
+        <w:rPr>
+          <w:rStyle w:val="VerbatimChar"/>
+          <w:rFonts w:ascii="menlo" w:eastAsiaTheme="minorEastAsia" w:hAnsi="menlo" w:cs="menlo" w:hint="eastAsia"/>
+          <w:color w:val="000000"/>
+          <w:sz w:val="18"/>
+          <w:lang w:eastAsia="zh-TW"/>
+        </w:rPr>
+        <w:t>_detail</w:t>
+      </w:r>
+      <w:r>
+        <w:rPr>
+          <w:rStyle w:val="VerbatimChar"/>
+          <w:rFonts w:ascii="menlo" w:eastAsia="menlo" w:hAnsi="menlo" w:cs="menlo"/>
+          <w:color w:val="000000"/>
+          <w:sz w:val="18"/>
+        </w:rPr>
+        <w:t>.html</w:t>
+      </w:r>
+      <w:r>
+        <w:rPr>
+          <w:rStyle w:val="VerbatimChar"/>
+          <w:rFonts w:ascii="menlo" w:eastAsiaTheme="minorEastAsia" w:hAnsi="menlo" w:cs="menlo"/>
+          <w:color w:val="000000"/>
+          <w:sz w:val="18"/>
+          <w:lang w:eastAsia="zh-TW"/>
+        </w:rPr>
+        <w:br/>
+      </w:r>
+      <w:r>
+        <w:rPr>
+          <w:rStyle w:val="VerbatimChar"/>
+          <w:rFonts w:ascii="menlo" w:eastAsiaTheme="minorEastAsia" w:hAnsi="menlo" w:cs="menlo"/>
+          <w:color w:val="000000"/>
+          <w:sz w:val="18"/>
+          <w:lang w:eastAsia="zh-TW"/>
+        </w:rPr>
+        <w:br/>
+      </w:r>
+      <w:proofErr w:type="spellStart"/>
+      <w:r>
+        <w:rPr>
+          <w:rStyle w:val="VerbatimChar"/>
+          <w:rFonts w:ascii="menlo" w:eastAsiaTheme="minorEastAsia" w:hAnsi="menlo" w:cs="menlo" w:hint="eastAsia"/>
+          <w:color w:val="000000"/>
+          <w:sz w:val="18"/>
+          <w:lang w:eastAsia="zh-TW"/>
+        </w:rPr>
+        <w:t>ni</w:t>
+      </w:r>
+      <w:proofErr w:type="spellEnd"/>
+      <w:r>
+        <w:rPr>
+          <w:rStyle w:val="VerbatimChar"/>
+          <w:rFonts w:ascii="menlo" w:eastAsiaTheme="minorEastAsia" w:hAnsi="menlo" w:cs="menlo" w:hint="eastAsia"/>
+          <w:color w:val="000000"/>
+          <w:sz w:val="18"/>
+          <w:lang w:eastAsia="zh-TW"/>
+        </w:rPr>
+        <w:t xml:space="preserve"> templates\includes\left_panel.html</w:t>
+      </w:r>
+      <w:r>
+        <w:rPr>
+          <w:rStyle w:val="VerbatimChar"/>
+          <w:rFonts w:ascii="menlo" w:eastAsiaTheme="minorEastAsia" w:hAnsi="menlo" w:cs="menlo"/>
+          <w:color w:val="000000"/>
+          <w:sz w:val="18"/>
+          <w:lang w:eastAsia="zh-TW"/>
+        </w:rPr>
+        <w:br/>
+      </w:r>
+      <w:proofErr w:type="spellStart"/>
+      <w:r>
+        <w:rPr>
+          <w:rStyle w:val="VerbatimChar"/>
+          <w:rFonts w:ascii="menlo" w:eastAsia="menlo" w:hAnsi="menlo" w:cs="menlo"/>
+          <w:color w:val="000000"/>
+          <w:sz w:val="18"/>
+        </w:rPr>
+        <w:t>ni</w:t>
+      </w:r>
+      <w:proofErr w:type="spellEnd"/>
+      <w:r>
+        <w:rPr>
+          <w:rStyle w:val="VerbatimChar"/>
+          <w:rFonts w:ascii="menlo" w:eastAsia="menlo" w:hAnsi="menlo" w:cs="menlo"/>
+          <w:color w:val="000000"/>
+          <w:sz w:val="18"/>
+        </w:rPr>
+        <w:t xml:space="preserve"> templates\base</w:t>
+      </w:r>
+      <w:r>
+        <w:rPr>
+          <w:rStyle w:val="VerbatimChar"/>
+          <w:rFonts w:ascii="menlo" w:eastAsiaTheme="minorEastAsia" w:hAnsi="menlo" w:cs="menlo" w:hint="eastAsia"/>
+          <w:color w:val="000000"/>
+          <w:sz w:val="18"/>
+          <w:lang w:eastAsia="zh-TW"/>
+        </w:rPr>
+        <w:t>2</w:t>
+      </w:r>
+      <w:r>
+        <w:rPr>
+          <w:rStyle w:val="VerbatimChar"/>
+          <w:rFonts w:ascii="menlo" w:eastAsia="menlo" w:hAnsi="menlo" w:cs="menlo"/>
+          <w:color w:val="000000"/>
+          <w:sz w:val="18"/>
+        </w:rPr>
+        <w:t>.html</w:t>
+      </w:r>
+      <w:r>
+        <w:rPr>
+          <w:rStyle w:val="VerbatimChar"/>
+          <w:rFonts w:ascii="menlo" w:eastAsiaTheme="minorEastAsia" w:hAnsi="menlo" w:cs="menlo"/>
+          <w:color w:val="000000"/>
+          <w:sz w:val="18"/>
+          <w:lang w:eastAsia="zh-TW"/>
+        </w:rPr>
+        <w:br/>
+      </w:r>
+      <w:proofErr w:type="spellStart"/>
+      <w:r>
+        <w:rPr>
+          <w:rStyle w:val="VerbatimChar"/>
+          <w:rFonts w:ascii="menlo" w:eastAsiaTheme="minorEastAsia" w:hAnsi="menlo" w:cs="menlo" w:hint="eastAsia"/>
+          <w:color w:val="000000"/>
+          <w:sz w:val="18"/>
+          <w:lang w:eastAsia="zh-TW"/>
+        </w:rPr>
+        <w:t>ni</w:t>
+      </w:r>
+      <w:proofErr w:type="spellEnd"/>
+      <w:r>
+        <w:rPr>
+          <w:rStyle w:val="VerbatimChar"/>
+          <w:rFonts w:ascii="menlo" w:eastAsiaTheme="minorEastAsia" w:hAnsi="menlo" w:cs="menlo" w:hint="eastAsia"/>
+          <w:color w:val="000000"/>
+          <w:sz w:val="18"/>
+          <w:lang w:eastAsia="zh-TW"/>
+        </w:rPr>
+        <w:t xml:space="preserve"> templates\core\building_dashboard.html</w:t>
+      </w:r>
+      <w:r>
+        <w:rPr>
+          <w:rStyle w:val="VerbatimChar"/>
+          <w:rFonts w:ascii="menlo" w:eastAsiaTheme="minorEastAsia" w:hAnsi="menlo" w:cs="menlo"/>
+          <w:color w:val="000000"/>
+          <w:sz w:val="18"/>
+          <w:lang w:eastAsia="zh-TW"/>
+        </w:rPr>
+        <w:br/>
+      </w:r>
+      <w:proofErr w:type="spellStart"/>
+      <w:r>
+        <w:rPr>
+          <w:rStyle w:val="VerbatimChar"/>
+          <w:rFonts w:ascii="menlo" w:eastAsiaTheme="minorEastAsia" w:hAnsi="menlo" w:cs="menlo" w:hint="eastAsia"/>
+          <w:color w:val="000000"/>
+          <w:sz w:val="18"/>
+          <w:lang w:eastAsia="zh-TW"/>
+        </w:rPr>
+        <w:t>ni</w:t>
+      </w:r>
+      <w:proofErr w:type="spellEnd"/>
+      <w:r>
+        <w:rPr>
+          <w:rStyle w:val="VerbatimChar"/>
+          <w:rFonts w:ascii="menlo" w:eastAsiaTheme="minorEastAsia" w:hAnsi="menlo" w:cs="menlo" w:hint="eastAsia"/>
+          <w:color w:val="000000"/>
+          <w:sz w:val="18"/>
+          <w:lang w:eastAsia="zh-TW"/>
+        </w:rPr>
+        <w:t xml:space="preserve"> templates\core\</w:t>
+      </w:r>
+      <w:r>
+        <w:rPr>
+          <w:rStyle w:val="VerbatimChar"/>
+          <w:rFonts w:ascii="menlo" w:eastAsiaTheme="minorEastAsia" w:hAnsi="menlo" w:cs="menlo" w:hint="eastAsia"/>
+          <w:color w:val="000000"/>
+          <w:sz w:val="18"/>
+          <w:lang w:eastAsia="zh-TW"/>
+        </w:rPr>
+        <w:t>client</w:t>
+      </w:r>
+      <w:r>
+        <w:rPr>
+          <w:rStyle w:val="VerbatimChar"/>
+          <w:rFonts w:ascii="menlo" w:eastAsiaTheme="minorEastAsia" w:hAnsi="menlo" w:cs="menlo" w:hint="eastAsia"/>
+          <w:color w:val="000000"/>
+          <w:sz w:val="18"/>
+          <w:lang w:eastAsia="zh-TW"/>
+        </w:rPr>
+        <w:t>_dashboard.html</w:t>
+      </w:r>
+      <w:r>
+        <w:rPr>
+          <w:rStyle w:val="VerbatimChar"/>
+          <w:rFonts w:ascii="menlo" w:eastAsiaTheme="minorEastAsia" w:hAnsi="menlo" w:cs="menlo"/>
+          <w:color w:val="000000"/>
+          <w:sz w:val="18"/>
+          <w:lang w:eastAsia="zh-TW"/>
+        </w:rPr>
+        <w:br/>
+      </w:r>
+      <w:r>
+        <w:rPr>
+          <w:rStyle w:val="VerbatimChar"/>
+          <w:rFonts w:ascii="menlo" w:eastAsiaTheme="minorEastAsia" w:hAnsi="menlo" w:cs="menlo"/>
+          <w:color w:val="000000"/>
+          <w:sz w:val="18"/>
+          <w:lang w:eastAsia="zh-TW"/>
+        </w:rPr>
+        <w:br/>
+      </w:r>
+      <w:proofErr w:type="spellStart"/>
+      <w:r>
+        <w:rPr>
+          <w:rStyle w:val="VerbatimChar"/>
+          <w:rFonts w:ascii="menlo" w:eastAsia="menlo" w:hAnsi="menlo" w:cs="menlo"/>
+          <w:color w:val="000000"/>
+          <w:sz w:val="18"/>
+        </w:rPr>
+        <w:t>ni</w:t>
+      </w:r>
+      <w:proofErr w:type="spellEnd"/>
+      <w:r>
+        <w:rPr>
+          <w:rStyle w:val="VerbatimChar"/>
+          <w:rFonts w:ascii="menlo" w:eastAsia="menlo" w:hAnsi="menlo" w:cs="menlo"/>
+          <w:color w:val="000000"/>
+          <w:sz w:val="18"/>
+        </w:rPr>
+        <w:t xml:space="preserve"> static\</w:t>
+      </w:r>
+      <w:proofErr w:type="spellStart"/>
+      <w:r>
+        <w:rPr>
+          <w:rStyle w:val="VerbatimChar"/>
+          <w:rFonts w:ascii="menlo" w:eastAsia="menlo" w:hAnsi="menlo" w:cs="menlo"/>
+          <w:color w:val="000000"/>
+          <w:sz w:val="18"/>
+        </w:rPr>
+        <w:t>css</w:t>
+      </w:r>
+      <w:proofErr w:type="spellEnd"/>
+      <w:r>
+        <w:rPr>
+          <w:rStyle w:val="VerbatimChar"/>
+          <w:rFonts w:ascii="menlo" w:eastAsia="menlo" w:hAnsi="menlo" w:cs="menlo"/>
+          <w:color w:val="000000"/>
+          <w:sz w:val="18"/>
+        </w:rPr>
+        <w:t>\app.css</w:t>
+      </w:r>
+      <w:r>
+        <w:rPr>
+          <w:rStyle w:val="VerbatimChar"/>
+          <w:rFonts w:ascii="menlo" w:eastAsiaTheme="minorEastAsia" w:hAnsi="menlo" w:cs="menlo"/>
+          <w:color w:val="000000"/>
+          <w:sz w:val="18"/>
+          <w:lang w:eastAsia="zh-TW"/>
+        </w:rPr>
+        <w:br/>
+      </w:r>
+      <w:proofErr w:type="spellStart"/>
+      <w:r>
+        <w:rPr>
+          <w:rStyle w:val="VerbatimChar"/>
+          <w:rFonts w:ascii="menlo" w:eastAsia="menlo" w:hAnsi="menlo" w:cs="menlo"/>
+          <w:color w:val="000000"/>
+          <w:sz w:val="18"/>
+        </w:rPr>
+        <w:t>ni</w:t>
+      </w:r>
+      <w:proofErr w:type="spellEnd"/>
+      <w:r>
+        <w:rPr>
+          <w:rStyle w:val="VerbatimChar"/>
+          <w:rFonts w:ascii="menlo" w:eastAsia="menlo" w:hAnsi="menlo" w:cs="menlo"/>
+          <w:color w:val="000000"/>
+          <w:sz w:val="18"/>
+        </w:rPr>
+        <w:t xml:space="preserve"> static\</w:t>
+      </w:r>
+      <w:proofErr w:type="spellStart"/>
+      <w:r>
+        <w:rPr>
+          <w:rStyle w:val="VerbatimChar"/>
+          <w:rFonts w:ascii="menlo" w:eastAsia="menlo" w:hAnsi="menlo" w:cs="menlo"/>
+          <w:color w:val="000000"/>
+          <w:sz w:val="18"/>
+        </w:rPr>
+        <w:t>js</w:t>
+      </w:r>
+      <w:proofErr w:type="spellEnd"/>
+      <w:r>
+        <w:rPr>
+          <w:rStyle w:val="VerbatimChar"/>
+          <w:rFonts w:ascii="menlo" w:eastAsia="menlo" w:hAnsi="menlo" w:cs="menlo"/>
+          <w:color w:val="000000"/>
+          <w:sz w:val="18"/>
+        </w:rPr>
+        <w:t>\app.js</w:t>
+      </w:r>
+      <w:r>
+        <w:rPr>
+          <w:rStyle w:val="VerbatimChar"/>
+          <w:rFonts w:ascii="menlo" w:eastAsiaTheme="minorEastAsia" w:hAnsi="menlo" w:cs="menlo"/>
+          <w:color w:val="000000"/>
+          <w:sz w:val="18"/>
+          <w:lang w:eastAsia="zh-TW"/>
+        </w:rPr>
+        <w:br/>
+      </w:r>
+      <w:r>
+        <w:rPr>
+          <w:rStyle w:val="VerbatimChar"/>
+          <w:rFonts w:ascii="menlo" w:eastAsiaTheme="minorEastAsia" w:hAnsi="menlo" w:cs="menlo"/>
+          <w:color w:val="000000"/>
+          <w:sz w:val="18"/>
+          <w:lang w:eastAsia="zh-TW"/>
+        </w:rPr>
+        <w:br/>
+      </w:r>
+      <w:proofErr w:type="spellStart"/>
+      <w:r>
+        <w:rPr>
+          <w:rStyle w:val="VerbatimChar"/>
+          <w:rFonts w:ascii="menlo" w:eastAsia="menlo" w:hAnsi="menlo" w:cs="menlo"/>
+          <w:color w:val="000000"/>
+          <w:sz w:val="18"/>
+        </w:rPr>
+        <w:t>ni</w:t>
+      </w:r>
+      <w:proofErr w:type="spellEnd"/>
+      <w:r>
+        <w:rPr>
+          <w:rStyle w:val="VerbatimChar"/>
+          <w:rFonts w:ascii="menlo" w:eastAsia="menlo" w:hAnsi="menlo" w:cs="menlo"/>
+          <w:color w:val="000000"/>
+          <w:sz w:val="18"/>
+        </w:rPr>
+        <w:t xml:space="preserve"> static\</w:t>
+      </w:r>
+      <w:proofErr w:type="spellStart"/>
+      <w:r>
+        <w:rPr>
+          <w:rStyle w:val="VerbatimChar"/>
+          <w:rFonts w:ascii="menlo" w:eastAsia="menlo" w:hAnsi="menlo" w:cs="menlo"/>
+          <w:color w:val="000000"/>
+          <w:sz w:val="18"/>
+        </w:rPr>
+        <w:t>css</w:t>
+      </w:r>
+      <w:proofErr w:type="spellEnd"/>
+      <w:r>
+        <w:rPr>
+          <w:rStyle w:val="VerbatimChar"/>
+          <w:rFonts w:ascii="menlo" w:eastAsia="menlo" w:hAnsi="menlo" w:cs="menlo"/>
+          <w:color w:val="000000"/>
+          <w:sz w:val="18"/>
+        </w:rPr>
+        <w:t>\app</w:t>
+      </w:r>
+      <w:r>
+        <w:rPr>
+          <w:rStyle w:val="VerbatimChar"/>
+          <w:rFonts w:ascii="menlo" w:eastAsiaTheme="minorEastAsia" w:hAnsi="menlo" w:cs="menlo" w:hint="eastAsia"/>
+          <w:color w:val="000000"/>
+          <w:sz w:val="18"/>
+          <w:lang w:eastAsia="zh-TW"/>
+        </w:rPr>
+        <w:t>2</w:t>
+      </w:r>
+      <w:r>
+        <w:rPr>
+          <w:rStyle w:val="VerbatimChar"/>
+          <w:rFonts w:ascii="menlo" w:eastAsia="menlo" w:hAnsi="menlo" w:cs="menlo"/>
+          <w:color w:val="000000"/>
+          <w:sz w:val="18"/>
+        </w:rPr>
+        <w:t>.css</w:t>
+      </w:r>
+      <w:r>
+        <w:rPr>
+          <w:rStyle w:val="VerbatimChar"/>
+          <w:rFonts w:ascii="menlo" w:eastAsiaTheme="minorEastAsia" w:hAnsi="menlo" w:cs="menlo"/>
+          <w:color w:val="000000"/>
+          <w:sz w:val="18"/>
+          <w:lang w:eastAsia="zh-TW"/>
+        </w:rPr>
+        <w:br/>
+      </w:r>
+    </w:p>
+    <w:p>
+      <w:pPr>
+        <w:spacing w:after="210" w:line="360" w:lineRule="auto"/>
+      </w:pPr>
+      <w:r>
+        <w:rPr>
+          <w:rStyle w:val="VerbatimChar"/>
+          <w:rFonts w:ascii="menlo" w:eastAsia="menlo" w:hAnsi="menlo" w:cs="menlo"/>
+          <w:color w:val="000000"/>
+          <w:sz w:val="18"/>
+          <w:shd w:val="clear" w:color="auto" w:fill="F8F8FA"/>
+        </w:rPr>
+        <w:t>requirements.txt</w:t>
       </w:r>
     </w:p>
     <w:p>
@@ -601,612 +2211,38 @@
         <w:shd w:val="clear" w:color="auto" w:fill="F8F8FA"/>
         <w:spacing w:line="336" w:lineRule="auto"/>
         <w:rPr>
-          <w:rStyle w:val="VerbatimChar"/>
-          <w:rFonts w:ascii="menlo" w:eastAsiaTheme="minorEastAsia" w:hAnsi="menlo" w:cs="menlo" w:hint="eastAsia"/>
-          <w:color w:val="000000"/>
-          <w:sz w:val="18"/>
+          <w:rFonts w:eastAsiaTheme="minorEastAsia"/>
           <w:lang w:eastAsia="zh-TW"/>
         </w:rPr>
       </w:pPr>
       <w:r>
         <w:rPr>
           <w:rStyle w:val="VerbatimChar"/>
-          <w:rFonts w:ascii="menlo" w:eastAsiaTheme="minorEastAsia" w:hAnsi="menlo" w:cs="menlo"/>
-          <w:color w:val="000000"/>
-          <w:sz w:val="18"/>
-          <w:lang w:eastAsia="zh-TW"/>
-        </w:rPr>
-        <w:br/>
-      </w:r>
-      <w:r>
-        <w:rPr>
-          <w:rStyle w:val="VerbatimChar"/>
-          <w:rFonts w:ascii="menlo" w:eastAsia="menlo" w:hAnsi="menlo" w:cs="menlo"/>
-          <w:color w:val="000000"/>
-          <w:sz w:val="18"/>
-        </w:rPr>
-        <w:t>ni templates\base.html</w:t>
-      </w:r>
-      <w:r>
-        <w:rPr>
-          <w:rStyle w:val="VerbatimChar"/>
-          <w:rFonts w:ascii="menlo" w:eastAsiaTheme="minorEastAsia" w:hAnsi="menlo" w:cs="menlo"/>
-          <w:color w:val="000000"/>
-          <w:sz w:val="18"/>
-          <w:lang w:eastAsia="zh-TW"/>
-        </w:rPr>
-        <w:br/>
-      </w:r>
-      <w:r>
-        <w:rPr>
-          <w:rStyle w:val="VerbatimChar"/>
-          <w:rFonts w:ascii="menlo" w:eastAsia="menlo" w:hAnsi="menlo" w:cs="menlo"/>
-          <w:color w:val="000000"/>
-          <w:sz w:val="18"/>
-        </w:rPr>
-        <w:t>ni templates\dashboard.html</w:t>
-      </w:r>
-      <w:r>
-        <w:rPr>
-          <w:rStyle w:val="VerbatimChar"/>
-          <w:rFonts w:ascii="menlo" w:eastAsiaTheme="minorEastAsia" w:hAnsi="menlo" w:cs="menlo"/>
-          <w:color w:val="000000"/>
-          <w:sz w:val="18"/>
-          <w:lang w:eastAsia="zh-TW"/>
-        </w:rPr>
-        <w:br/>
-      </w:r>
-      <w:r>
-        <w:rPr>
-          <w:rStyle w:val="VerbatimChar"/>
-          <w:rFonts w:ascii="menlo" w:eastAsia="menlo" w:hAnsi="menlo" w:cs="menlo"/>
-          <w:color w:val="000000"/>
-          <w:sz w:val="18"/>
-        </w:rPr>
-        <w:lastRenderedPageBreak/>
-        <w:t>ni templates\accounts\login.html</w:t>
-      </w:r>
-      <w:r>
-        <w:rPr>
-          <w:rStyle w:val="VerbatimChar"/>
-          <w:rFonts w:ascii="menlo" w:eastAsiaTheme="minorEastAsia" w:hAnsi="menlo" w:cs="menlo"/>
-          <w:color w:val="000000"/>
-          <w:sz w:val="18"/>
-          <w:lang w:eastAsia="zh-TW"/>
-        </w:rPr>
-        <w:br/>
-      </w:r>
-      <w:r>
-        <w:rPr>
-          <w:rStyle w:val="VerbatimChar"/>
-          <w:rFonts w:ascii="menlo" w:eastAsia="menlo" w:hAnsi="menlo" w:cs="menlo"/>
-          <w:color w:val="000000"/>
-          <w:sz w:val="18"/>
-        </w:rPr>
-        <w:t>ni templates\accounts\profile.html</w:t>
-      </w:r>
-      <w:r>
-        <w:rPr>
-          <w:rStyle w:val="VerbatimChar"/>
-          <w:rFonts w:ascii="menlo" w:eastAsiaTheme="minorEastAsia" w:hAnsi="menlo" w:cs="menlo"/>
-          <w:color w:val="000000"/>
-          <w:sz w:val="18"/>
-          <w:lang w:eastAsia="zh-TW"/>
-        </w:rPr>
-        <w:br/>
-      </w:r>
-      <w:r>
-        <w:rPr>
-          <w:rStyle w:val="VerbatimChar"/>
-          <w:rFonts w:ascii="menlo" w:eastAsia="menlo" w:hAnsi="menlo" w:cs="menlo"/>
-          <w:color w:val="000000"/>
-          <w:sz w:val="18"/>
-        </w:rPr>
-        <w:t>ni templates\core\clients.html</w:t>
-      </w:r>
-      <w:r>
-        <w:rPr>
-          <w:rStyle w:val="VerbatimChar"/>
-          <w:rFonts w:ascii="menlo" w:eastAsiaTheme="minorEastAsia" w:hAnsi="menlo" w:cs="menlo"/>
-          <w:color w:val="000000"/>
-          <w:sz w:val="18"/>
-          <w:lang w:eastAsia="zh-TW"/>
-        </w:rPr>
-        <w:br/>
-      </w:r>
-      <w:r>
-        <w:rPr>
-          <w:rStyle w:val="VerbatimChar"/>
-          <w:rFonts w:ascii="menlo" w:eastAsia="menlo" w:hAnsi="menlo" w:cs="menlo"/>
-          <w:color w:val="000000"/>
-          <w:sz w:val="18"/>
-        </w:rPr>
-        <w:t>ni templates\core\client_detail.html</w:t>
-      </w:r>
-      <w:r>
-        <w:rPr>
-          <w:rStyle w:val="VerbatimChar"/>
-          <w:rFonts w:ascii="menlo" w:eastAsiaTheme="minorEastAsia" w:hAnsi="menlo" w:cs="menlo"/>
-          <w:color w:val="000000"/>
-          <w:sz w:val="18"/>
-          <w:lang w:eastAsia="zh-TW"/>
-        </w:rPr>
-        <w:br/>
-      </w:r>
-      <w:r>
-        <w:rPr>
-          <w:rStyle w:val="VerbatimChar"/>
-          <w:rFonts w:ascii="menlo" w:eastAsia="menlo" w:hAnsi="menlo" w:cs="menlo"/>
-          <w:color w:val="000000"/>
-          <w:sz w:val="18"/>
-        </w:rPr>
-        <w:t>ni templates\core\client_</w:t>
-      </w:r>
-      <w:r>
-        <w:rPr>
-          <w:rStyle w:val="VerbatimChar"/>
-          <w:rFonts w:ascii="menlo" w:eastAsiaTheme="minorEastAsia" w:hAnsi="menlo" w:cs="menlo" w:hint="eastAsia"/>
-          <w:color w:val="000000"/>
-          <w:sz w:val="18"/>
-          <w:lang w:eastAsia="zh-TW"/>
-        </w:rPr>
-        <w:t>saved</w:t>
-      </w:r>
-      <w:r>
-        <w:rPr>
-          <w:rStyle w:val="VerbatimChar"/>
-          <w:rFonts w:ascii="menlo" w:eastAsia="menlo" w:hAnsi="menlo" w:cs="menlo"/>
-          <w:color w:val="000000"/>
-          <w:sz w:val="18"/>
-        </w:rPr>
-        <w:t>.html</w:t>
-      </w:r>
-      <w:r>
-        <w:rPr>
-          <w:rStyle w:val="VerbatimChar"/>
-          <w:rFonts w:ascii="menlo" w:eastAsiaTheme="minorEastAsia" w:hAnsi="menlo" w:cs="menlo"/>
-          <w:color w:val="000000"/>
-          <w:sz w:val="18"/>
-          <w:lang w:eastAsia="zh-TW"/>
-        </w:rPr>
-        <w:br/>
-      </w:r>
-      <w:r>
-        <w:rPr>
-          <w:rStyle w:val="VerbatimChar"/>
-          <w:rFonts w:ascii="menlo" w:eastAsia="menlo" w:hAnsi="menlo" w:cs="menlo"/>
-          <w:color w:val="000000"/>
-          <w:sz w:val="18"/>
-        </w:rPr>
-        <w:t>ni templates\core\buildings.html</w:t>
-      </w:r>
-      <w:r>
-        <w:rPr>
-          <w:rStyle w:val="VerbatimChar"/>
-          <w:rFonts w:ascii="menlo" w:eastAsiaTheme="minorEastAsia" w:hAnsi="menlo" w:cs="menlo"/>
-          <w:color w:val="000000"/>
-          <w:sz w:val="18"/>
-          <w:lang w:eastAsia="zh-TW"/>
-        </w:rPr>
-        <w:br/>
-      </w:r>
-      <w:r>
-        <w:rPr>
-          <w:rStyle w:val="VerbatimChar"/>
-          <w:rFonts w:ascii="menlo" w:eastAsia="menlo" w:hAnsi="menlo" w:cs="menlo"/>
-          <w:color w:val="000000"/>
-          <w:sz w:val="18"/>
-        </w:rPr>
-        <w:t>ni templates\core\building</w:t>
-      </w:r>
-      <w:r>
-        <w:rPr>
-          <w:rStyle w:val="VerbatimChar"/>
-          <w:rFonts w:ascii="menlo" w:eastAsiaTheme="minorEastAsia" w:hAnsi="menlo" w:cs="menlo" w:hint="eastAsia"/>
-          <w:color w:val="000000"/>
-          <w:sz w:val="18"/>
-          <w:lang w:eastAsia="zh-TW"/>
-        </w:rPr>
-        <w:t>_detail</w:t>
-      </w:r>
-      <w:r>
-        <w:rPr>
-          <w:rStyle w:val="VerbatimChar"/>
-          <w:rFonts w:ascii="menlo" w:eastAsia="menlo" w:hAnsi="menlo" w:cs="menlo"/>
-          <w:color w:val="000000"/>
-          <w:sz w:val="18"/>
-        </w:rPr>
-        <w:t>.html</w:t>
-      </w:r>
-      <w:r>
-        <w:rPr>
-          <w:rStyle w:val="VerbatimChar"/>
-          <w:rFonts w:ascii="menlo" w:eastAsiaTheme="minorEastAsia" w:hAnsi="menlo" w:cs="menlo"/>
-          <w:color w:val="000000"/>
-          <w:sz w:val="18"/>
-          <w:lang w:eastAsia="zh-TW"/>
-        </w:rPr>
-        <w:br/>
-      </w:r>
-      <w:r>
-        <w:rPr>
-          <w:rStyle w:val="VerbatimChar"/>
-          <w:rFonts w:ascii="menlo" w:eastAsiaTheme="minorEastAsia" w:hAnsi="menlo" w:cs="menlo" w:hint="eastAsia"/>
-          <w:color w:val="000000"/>
-          <w:sz w:val="18"/>
-          <w:lang w:eastAsia="zh-TW"/>
-        </w:rPr>
-        <w:t xml:space="preserve">ni </w:t>
-      </w:r>
-      <w:r>
-        <w:rPr>
-          <w:rStyle w:val="VerbatimChar"/>
-          <w:rFonts w:ascii="menlo" w:eastAsiaTheme="minorEastAsia" w:hAnsi="menlo" w:cs="menlo"/>
-          <w:color w:val="000000"/>
-          <w:sz w:val="18"/>
-          <w:lang w:eastAsia="zh-TW"/>
-        </w:rPr>
-        <w:t>templates</w:t>
-      </w:r>
-      <w:r>
-        <w:rPr>
-          <w:rStyle w:val="VerbatimChar"/>
-          <w:rFonts w:ascii="menlo" w:eastAsiaTheme="minorEastAsia" w:hAnsi="menlo" w:cs="menlo" w:hint="eastAsia"/>
-          <w:color w:val="000000"/>
-          <w:sz w:val="18"/>
-          <w:lang w:eastAsia="zh-TW"/>
-        </w:rPr>
-        <w:t>\</w:t>
-      </w:r>
-      <w:r>
-        <w:rPr>
-          <w:rStyle w:val="VerbatimChar"/>
-          <w:rFonts w:ascii="menlo" w:eastAsiaTheme="minorEastAsia" w:hAnsi="menlo" w:cs="menlo"/>
-          <w:color w:val="000000"/>
-          <w:sz w:val="18"/>
-          <w:lang w:eastAsia="zh-TW"/>
-        </w:rPr>
-        <w:t>core</w:t>
-      </w:r>
-      <w:r>
-        <w:rPr>
-          <w:rStyle w:val="VerbatimChar"/>
-          <w:rFonts w:ascii="menlo" w:eastAsiaTheme="minorEastAsia" w:hAnsi="menlo" w:cs="menlo" w:hint="eastAsia"/>
-          <w:color w:val="000000"/>
-          <w:sz w:val="18"/>
-          <w:lang w:eastAsia="zh-TW"/>
-        </w:rPr>
-        <w:t>\</w:t>
-      </w:r>
-      <w:r>
-        <w:rPr>
-          <w:rStyle w:val="VerbatimChar"/>
-          <w:rFonts w:ascii="menlo" w:eastAsiaTheme="minorEastAsia" w:hAnsi="menlo" w:cs="menlo"/>
-          <w:color w:val="000000"/>
-          <w:sz w:val="18"/>
-          <w:lang w:eastAsia="zh-TW"/>
-        </w:rPr>
-        <w:t>building_saved.html</w:t>
-      </w:r>
-      <w:r>
-        <w:rPr>
-          <w:rStyle w:val="VerbatimChar"/>
-          <w:rFonts w:ascii="menlo" w:eastAsiaTheme="minorEastAsia" w:hAnsi="menlo" w:cs="menlo"/>
-          <w:color w:val="000000"/>
-          <w:sz w:val="18"/>
-          <w:lang w:eastAsia="zh-TW"/>
-        </w:rPr>
-        <w:br/>
-      </w:r>
-      <w:r>
-        <w:rPr>
-          <w:rStyle w:val="VerbatimChar"/>
-          <w:rFonts w:ascii="menlo" w:eastAsia="menlo" w:hAnsi="menlo" w:cs="menlo"/>
-          <w:color w:val="000000"/>
-          <w:sz w:val="18"/>
-        </w:rPr>
-        <w:t>ni templates\core\building</w:t>
-      </w:r>
-      <w:r>
-        <w:rPr>
-          <w:rStyle w:val="VerbatimChar"/>
-          <w:rFonts w:ascii="menlo" w:eastAsiaTheme="minorEastAsia" w:hAnsi="menlo" w:cs="menlo" w:hint="eastAsia"/>
-          <w:color w:val="000000"/>
-          <w:sz w:val="18"/>
-          <w:lang w:eastAsia="zh-TW"/>
-        </w:rPr>
-        <w:t>_report</w:t>
-      </w:r>
-      <w:r>
-        <w:rPr>
-          <w:rStyle w:val="VerbatimChar"/>
-          <w:rFonts w:ascii="menlo" w:eastAsia="menlo" w:hAnsi="menlo" w:cs="menlo"/>
-          <w:color w:val="000000"/>
-          <w:sz w:val="18"/>
-        </w:rPr>
-        <w:t>.html</w:t>
-      </w:r>
-      <w:r>
-        <w:rPr>
-          <w:rStyle w:val="VerbatimChar"/>
-          <w:rFonts w:ascii="menlo" w:eastAsiaTheme="minorEastAsia" w:hAnsi="menlo" w:cs="menlo"/>
-          <w:color w:val="000000"/>
-          <w:sz w:val="18"/>
-          <w:lang w:eastAsia="zh-TW"/>
-        </w:rPr>
-        <w:br/>
-      </w:r>
-      <w:r>
-        <w:rPr>
-          <w:rStyle w:val="VerbatimChar"/>
-          <w:rFonts w:ascii="menlo" w:eastAsia="menlo" w:hAnsi="menlo" w:cs="menlo"/>
-          <w:color w:val="000000"/>
-          <w:sz w:val="18"/>
-        </w:rPr>
-        <w:t>ni templates\core\groups.html</w:t>
-      </w:r>
-      <w:r>
-        <w:rPr>
-          <w:rStyle w:val="VerbatimChar"/>
-          <w:rFonts w:ascii="menlo" w:eastAsiaTheme="minorEastAsia" w:hAnsi="menlo" w:cs="menlo"/>
-          <w:color w:val="000000"/>
-          <w:sz w:val="18"/>
-          <w:lang w:eastAsia="zh-TW"/>
-        </w:rPr>
-        <w:br/>
-      </w:r>
-      <w:r>
-        <w:rPr>
-          <w:rStyle w:val="VerbatimChar"/>
-          <w:rFonts w:ascii="menlo" w:eastAsia="menlo" w:hAnsi="menlo" w:cs="menlo"/>
-          <w:color w:val="000000"/>
-          <w:sz w:val="18"/>
-        </w:rPr>
-        <w:t>ni templates\core\group</w:t>
-      </w:r>
-      <w:r>
-        <w:rPr>
-          <w:rStyle w:val="VerbatimChar"/>
-          <w:rFonts w:ascii="menlo" w:eastAsiaTheme="minorEastAsia" w:hAnsi="menlo" w:cs="menlo" w:hint="eastAsia"/>
-          <w:color w:val="000000"/>
-          <w:sz w:val="18"/>
-          <w:lang w:eastAsia="zh-TW"/>
-        </w:rPr>
-        <w:t>_detail</w:t>
-      </w:r>
-      <w:r>
-        <w:rPr>
-          <w:rStyle w:val="VerbatimChar"/>
-          <w:rFonts w:ascii="menlo" w:eastAsia="menlo" w:hAnsi="menlo" w:cs="menlo"/>
-          <w:color w:val="000000"/>
-          <w:sz w:val="18"/>
-        </w:rPr>
-        <w:t>.html</w:t>
-      </w:r>
-      <w:r>
-        <w:rPr>
-          <w:rStyle w:val="VerbatimChar"/>
-          <w:rFonts w:ascii="menlo" w:eastAsiaTheme="minorEastAsia" w:hAnsi="menlo" w:cs="menlo"/>
-          <w:color w:val="000000"/>
-          <w:sz w:val="18"/>
-          <w:lang w:eastAsia="zh-TW"/>
-        </w:rPr>
-        <w:br/>
-      </w:r>
-      <w:r>
-        <w:rPr>
-          <w:rStyle w:val="VerbatimChar"/>
-          <w:rFonts w:ascii="menlo" w:eastAsia="menlo" w:hAnsi="menlo" w:cs="menlo"/>
-          <w:color w:val="000000"/>
-          <w:sz w:val="18"/>
-        </w:rPr>
-        <w:t>ni templates\core\group</w:t>
-      </w:r>
-      <w:r>
-        <w:rPr>
-          <w:rStyle w:val="VerbatimChar"/>
-          <w:rFonts w:ascii="menlo" w:eastAsiaTheme="minorEastAsia" w:hAnsi="menlo" w:cs="menlo" w:hint="eastAsia"/>
-          <w:color w:val="000000"/>
-          <w:sz w:val="18"/>
-          <w:lang w:eastAsia="zh-TW"/>
-        </w:rPr>
-        <w:t>_saved</w:t>
-      </w:r>
-      <w:r>
-        <w:rPr>
-          <w:rStyle w:val="VerbatimChar"/>
-          <w:rFonts w:ascii="menlo" w:eastAsia="menlo" w:hAnsi="menlo" w:cs="menlo"/>
-          <w:color w:val="000000"/>
-          <w:sz w:val="18"/>
-        </w:rPr>
-        <w:t>.html</w:t>
-      </w:r>
-      <w:r>
-        <w:rPr>
-          <w:rStyle w:val="VerbatimChar"/>
-          <w:rFonts w:ascii="menlo" w:eastAsiaTheme="minorEastAsia" w:hAnsi="menlo" w:cs="menlo"/>
-          <w:color w:val="000000"/>
-          <w:sz w:val="18"/>
-          <w:lang w:eastAsia="zh-TW"/>
-        </w:rPr>
-        <w:br/>
-      </w:r>
-      <w:r>
-        <w:rPr>
-          <w:rStyle w:val="VerbatimChar"/>
-          <w:rFonts w:ascii="menlo" w:eastAsia="menlo" w:hAnsi="menlo" w:cs="menlo"/>
-          <w:color w:val="000000"/>
-          <w:sz w:val="18"/>
-        </w:rPr>
-        <w:t>ni templates\core\group</w:t>
-      </w:r>
-      <w:r>
-        <w:rPr>
-          <w:rStyle w:val="VerbatimChar"/>
-          <w:rFonts w:ascii="menlo" w:eastAsiaTheme="minorEastAsia" w:hAnsi="menlo" w:cs="menlo" w:hint="eastAsia"/>
-          <w:color w:val="000000"/>
-          <w:sz w:val="18"/>
-          <w:lang w:eastAsia="zh-TW"/>
-        </w:rPr>
-        <w:t>_members</w:t>
-      </w:r>
-      <w:r>
-        <w:rPr>
-          <w:rStyle w:val="VerbatimChar"/>
-          <w:rFonts w:ascii="menlo" w:eastAsia="menlo" w:hAnsi="menlo" w:cs="menlo"/>
-          <w:color w:val="000000"/>
-          <w:sz w:val="18"/>
-        </w:rPr>
-        <w:t>.html</w:t>
-      </w:r>
-      <w:r>
-        <w:rPr>
-          <w:rStyle w:val="VerbatimChar"/>
-          <w:rFonts w:ascii="menlo" w:eastAsiaTheme="minorEastAsia" w:hAnsi="menlo" w:cs="menlo"/>
-          <w:color w:val="000000"/>
-          <w:sz w:val="18"/>
-          <w:lang w:eastAsia="zh-TW"/>
-        </w:rPr>
-        <w:br/>
-      </w:r>
-      <w:r>
-        <w:rPr>
-          <w:rStyle w:val="VerbatimChar"/>
-          <w:rFonts w:ascii="menlo" w:eastAsia="menlo" w:hAnsi="menlo" w:cs="menlo"/>
-          <w:color w:val="000000"/>
-          <w:sz w:val="18"/>
-        </w:rPr>
-        <w:t>ni templates\core\users.html</w:t>
-      </w:r>
-      <w:r>
-        <w:rPr>
-          <w:rStyle w:val="VerbatimChar"/>
-          <w:rFonts w:ascii="menlo" w:eastAsiaTheme="minorEastAsia" w:hAnsi="menlo" w:cs="menlo"/>
-          <w:color w:val="000000"/>
-          <w:sz w:val="18"/>
-          <w:lang w:eastAsia="zh-TW"/>
-        </w:rPr>
-        <w:br/>
-      </w:r>
-      <w:r>
-        <w:rPr>
-          <w:rStyle w:val="VerbatimChar"/>
-          <w:rFonts w:ascii="menlo" w:eastAsia="menlo" w:hAnsi="menlo" w:cs="menlo"/>
-          <w:color w:val="000000"/>
-          <w:sz w:val="18"/>
-        </w:rPr>
-        <w:t>ni templates\core\user</w:t>
-      </w:r>
-      <w:r>
-        <w:rPr>
-          <w:rStyle w:val="VerbatimChar"/>
-          <w:rFonts w:ascii="menlo" w:eastAsiaTheme="minorEastAsia" w:hAnsi="menlo" w:cs="menlo" w:hint="eastAsia"/>
-          <w:color w:val="000000"/>
-          <w:sz w:val="18"/>
-          <w:lang w:eastAsia="zh-TW"/>
-        </w:rPr>
-        <w:t>_detail</w:t>
-      </w:r>
-      <w:r>
-        <w:rPr>
-          <w:rStyle w:val="VerbatimChar"/>
-          <w:rFonts w:ascii="menlo" w:eastAsia="menlo" w:hAnsi="menlo" w:cs="menlo"/>
-          <w:color w:val="000000"/>
-          <w:sz w:val="18"/>
-        </w:rPr>
-        <w:t>.html</w:t>
-      </w:r>
-      <w:r>
-        <w:rPr>
-          <w:rStyle w:val="VerbatimChar"/>
-          <w:rFonts w:ascii="menlo" w:eastAsiaTheme="minorEastAsia" w:hAnsi="menlo" w:cs="menlo"/>
-          <w:color w:val="000000"/>
-          <w:sz w:val="18"/>
-          <w:lang w:eastAsia="zh-TW"/>
-        </w:rPr>
-        <w:br/>
-      </w:r>
-      <w:r>
-        <w:rPr>
-          <w:rStyle w:val="VerbatimChar"/>
-          <w:rFonts w:ascii="menlo" w:eastAsiaTheme="minorEastAsia" w:hAnsi="menlo" w:cs="menlo"/>
-          <w:color w:val="000000"/>
-          <w:sz w:val="18"/>
-          <w:lang w:eastAsia="zh-TW"/>
-        </w:rPr>
-        <w:br/>
-      </w:r>
-      <w:r>
-        <w:rPr>
-          <w:rStyle w:val="VerbatimChar"/>
-          <w:rFonts w:ascii="menlo" w:eastAsia="menlo" w:hAnsi="menlo" w:cs="menlo"/>
-          <w:color w:val="000000"/>
-          <w:sz w:val="18"/>
-        </w:rPr>
-        <w:t>ni static\css\app.css</w:t>
-      </w:r>
-      <w:r>
-        <w:rPr>
-          <w:rStyle w:val="VerbatimChar"/>
-          <w:rFonts w:ascii="menlo" w:eastAsiaTheme="minorEastAsia" w:hAnsi="menlo" w:cs="menlo"/>
-          <w:color w:val="000000"/>
-          <w:sz w:val="18"/>
-          <w:lang w:eastAsia="zh-TW"/>
-        </w:rPr>
-        <w:br/>
-      </w:r>
-      <w:r>
-        <w:rPr>
-          <w:rStyle w:val="VerbatimChar"/>
-          <w:rFonts w:ascii="menlo" w:eastAsia="menlo" w:hAnsi="menlo" w:cs="menlo"/>
-          <w:color w:val="000000"/>
-          <w:sz w:val="18"/>
-        </w:rPr>
-        <w:t>ni static\js\app.js</w:t>
-      </w:r>
-      <w:r>
-        <w:rPr>
-          <w:rStyle w:val="VerbatimChar"/>
-          <w:rFonts w:ascii="menlo" w:eastAsiaTheme="minorEastAsia" w:hAnsi="menlo" w:cs="menlo"/>
-          <w:color w:val="000000"/>
-          <w:sz w:val="18"/>
-          <w:lang w:eastAsia="zh-TW"/>
-        </w:rPr>
-        <w:br/>
-      </w:r>
-    </w:p>
-    <w:p>
-      <w:pPr>
-        <w:spacing w:after="210" w:line="360" w:lineRule="auto"/>
-      </w:pPr>
-      <w:r>
-        <w:rPr>
-          <w:rStyle w:val="VerbatimChar"/>
-          <w:rFonts w:ascii="menlo" w:eastAsia="menlo" w:hAnsi="menlo" w:cs="menlo"/>
-          <w:color w:val="000000"/>
-          <w:sz w:val="18"/>
-          <w:shd w:val="clear" w:color="auto" w:fill="F8F8FA"/>
-        </w:rPr>
-        <w:t>requirements.txt</w:t>
-      </w:r>
-    </w:p>
-    <w:p>
-      <w:pPr>
-        <w:shd w:val="clear" w:color="auto" w:fill="F8F8FA"/>
-        <w:spacing w:line="336" w:lineRule="auto"/>
-        <w:rPr>
-          <w:rFonts w:eastAsiaTheme="minorEastAsia"/>
-          <w:lang w:eastAsia="zh-TW"/>
-        </w:rPr>
-      </w:pPr>
-      <w:r>
-        <w:rPr>
-          <w:rStyle w:val="VerbatimChar"/>
-          <w:rFonts w:ascii="menlo" w:eastAsia="menlo" w:hAnsi="menlo" w:cs="menlo"/>
-          <w:color w:val="000000"/>
-          <w:sz w:val="18"/>
-        </w:rPr>
-        <w:t>Django&gt;=5.1,&lt;6.0</w:t>
+          <w:rFonts w:ascii="menlo" w:eastAsia="menlo" w:hAnsi="menlo" w:cs="menlo"/>
+          <w:color w:val="000000"/>
+          <w:sz w:val="18"/>
+        </w:rPr>
+        <w:t>Django&gt;=5.</w:t>
+      </w:r>
+      <w:proofErr w:type="gramStart"/>
+      <w:r>
+        <w:rPr>
+          <w:rStyle w:val="VerbatimChar"/>
+          <w:rFonts w:ascii="menlo" w:eastAsia="menlo" w:hAnsi="menlo" w:cs="menlo"/>
+          <w:color w:val="000000"/>
+          <w:sz w:val="18"/>
+        </w:rPr>
+        <w:t>1,&lt;</w:t>
+      </w:r>
+      <w:proofErr w:type="gramEnd"/>
+      <w:r>
+        <w:rPr>
+          <w:rStyle w:val="VerbatimChar"/>
+          <w:rFonts w:ascii="menlo" w:eastAsia="menlo" w:hAnsi="menlo" w:cs="menlo"/>
+          <w:color w:val="000000"/>
+          <w:sz w:val="18"/>
+        </w:rPr>
+        <w:t>6.0</w:t>
       </w:r>
       <w:r>
         <w:rPr>
@@ -1226,7 +2262,27 @@
           <w:sz w:val="18"/>
         </w:rPr>
         <w:br/>
-        <w:t>python-dotenv&gt;=1.0</w:t>
+        <w:t>python-</w:t>
+      </w:r>
+      <w:proofErr w:type="spellStart"/>
+      <w:r>
+        <w:rPr>
+          <w:rStyle w:val="VerbatimChar"/>
+          <w:rFonts w:ascii="menlo" w:eastAsia="menlo" w:hAnsi="menlo" w:cs="menlo"/>
+          <w:color w:val="000000"/>
+          <w:sz w:val="18"/>
+        </w:rPr>
+        <w:t>dotenv</w:t>
+      </w:r>
+      <w:proofErr w:type="spellEnd"/>
+      <w:r>
+        <w:rPr>
+          <w:rStyle w:val="VerbatimChar"/>
+          <w:rFonts w:ascii="menlo" w:eastAsia="menlo" w:hAnsi="menlo" w:cs="menlo"/>
+          <w:color w:val="000000"/>
+          <w:sz w:val="18"/>
+        </w:rPr>
+        <w:t>&gt;=1.0</w:t>
       </w:r>
       <w:r>
         <w:rPr>
@@ -1302,7 +2358,27 @@
           <w:color w:val="000000"/>
           <w:sz w:val="18"/>
         </w:rPr>
-        <w:t>python manage.py makemigrations accounts core</w:t>
+        <w:t xml:space="preserve">python manage.py </w:t>
+      </w:r>
+      <w:proofErr w:type="spellStart"/>
+      <w:r>
+        <w:rPr>
+          <w:rStyle w:val="VerbatimChar"/>
+          <w:rFonts w:ascii="menlo" w:eastAsia="menlo" w:hAnsi="menlo" w:cs="menlo"/>
+          <w:color w:val="000000"/>
+          <w:sz w:val="18"/>
+        </w:rPr>
+        <w:t>makemigrations</w:t>
+      </w:r>
+      <w:proofErr w:type="spellEnd"/>
+      <w:r>
+        <w:rPr>
+          <w:rStyle w:val="VerbatimChar"/>
+          <w:rFonts w:ascii="menlo" w:eastAsia="menlo" w:hAnsi="menlo" w:cs="menlo"/>
+          <w:color w:val="000000"/>
+          <w:sz w:val="18"/>
+        </w:rPr>
+        <w:t xml:space="preserve"> accounts core</w:t>
       </w:r>
       <w:r>
         <w:rPr>
@@ -1322,18 +2398,49 @@
           <w:sz w:val="18"/>
         </w:rPr>
         <w:br/>
-        <w:t>python manage.py createsuperuser</w:t>
-      </w:r>
-      <w:r>
-        <w:rPr>
-          <w:rStyle w:val="VerbatimChar"/>
-          <w:rFonts w:ascii="menlo" w:eastAsia="menlo" w:hAnsi="menlo" w:cs="menlo"/>
-          <w:color w:val="000000"/>
-          <w:sz w:val="18"/>
-        </w:rPr>
-        <w:br/>
-        <w:t>python manage.py runserver</w:t>
-      </w:r>
+        <w:t xml:space="preserve">python manage.py </w:t>
+      </w:r>
+      <w:proofErr w:type="spellStart"/>
+      <w:r>
+        <w:rPr>
+          <w:rStyle w:val="VerbatimChar"/>
+          <w:rFonts w:ascii="menlo" w:eastAsia="menlo" w:hAnsi="menlo" w:cs="menlo"/>
+          <w:color w:val="000000"/>
+          <w:sz w:val="18"/>
+        </w:rPr>
+        <w:t>createsuperuser</w:t>
+      </w:r>
+      <w:proofErr w:type="spellEnd"/>
+      <w:r>
+        <w:rPr>
+          <w:rStyle w:val="VerbatimChar"/>
+          <w:rFonts w:ascii="menlo" w:eastAsia="menlo" w:hAnsi="menlo" w:cs="menlo"/>
+          <w:color w:val="000000"/>
+          <w:sz w:val="18"/>
+        </w:rPr>
+        <w:br/>
+      </w:r>
+      <w:r>
+        <w:rPr>
+          <w:rStyle w:val="VerbatimChar"/>
+          <w:rFonts w:ascii="menlo" w:eastAsia="menlo" w:hAnsi="menlo" w:cs="menlo"/>
+          <w:color w:val="000000"/>
+          <w:sz w:val="18"/>
+        </w:rPr>
+        <w:lastRenderedPageBreak/>
+        <w:t xml:space="preserve">python manage.py </w:t>
+      </w:r>
+      <w:proofErr w:type="spellStart"/>
+      <w:r>
+        <w:rPr>
+          <w:rStyle w:val="VerbatimChar"/>
+          <w:rFonts w:ascii="menlo" w:eastAsia="menlo" w:hAnsi="menlo" w:cs="menlo"/>
+          <w:color w:val="000000"/>
+          <w:sz w:val="18"/>
+        </w:rPr>
+        <w:t>runserver</w:t>
+      </w:r>
+      <w:proofErr w:type="spellEnd"/>
       <w:r>
         <w:rPr>
           <w:rStyle w:val="VerbatimChar"/>

</xml_diff>